<commit_message>
Generando salidas exams2* en doble columna y hoja tamaño oficio
</commit_message>
<xml_diff>
--- a/Auxiliares/Ejemplos-Funcionales-Rmd/Plantillas/tex/Graficos_Estadisticos_Adopcion_Mascotas/salida/I_1796473-Opc-A2_optimizado_oficio_1.docx
+++ b/Auxiliares/Ejemplos-Funcionales-Rmd/Plantillas/tex/Graficos_Estadisticos_Adopcion_Mascotas/salida/I_1796473-Opc-A2_optimizado_oficio_1.docx
@@ -151,7 +151,7 @@
         <w:br/>
       </w:r>
       <w:r>
-        <w:t xml:space="preserve">El líder de un programa de adopción de mascotas encuestó a 330 personas para conocer qué animal les interesaría adoptar. Del total de encuestados, el 5% adoptaría un ternero, el 75% adoptaría un(a) serpiente y el 20% adoptaría un(a) burro.</w:t>
+        <w:t xml:space="preserve">El líder de un programa de adopción de mascotas encuestó a 210 personas para conocer qué animal les interesaría adoptar. Del total de encuestados, el 30% adoptaría un gato, el 65% adoptaría un(a) erizo y el 5% adoptaría un(a) lagarto.</w:t>
       </w:r>
     </w:p>
     <w:p>
@@ -178,14 +178,14 @@
       <w:r>
         <w:drawing>
           <wp:inline>
-            <wp:extent cx="3657600" cy="2924175"/>
+            <wp:extent cx="3467100" cy="3200400"/>
             <wp:effectExtent b="0" l="0" r="0" t="0"/>
             <wp:docPr descr="image" title="" id="21" name="Picture"/>
             <a:graphic>
               <a:graphicData uri="http://schemas.openxmlformats.org/drawingml/2006/picture">
                 <pic:pic>
                   <pic:nvPicPr>
-                    <pic:cNvPr descr="media/supplements1/exercise1/Torta-5.svg" id="22" name="Picture"/>
+                    <pic:cNvPr descr="media/supplements1/exercise1/BarraHorizontal-3.svg" id="22" name="Picture"/>
                     <pic:cNvPicPr>
                       <a:picLocks noChangeArrowheads="1" noChangeAspect="1"/>
                     </pic:cNvPicPr>
@@ -198,6 +198,65 @@
                         </a:ext>
                         <a:ext uri="{96DAC541-7B7A-43D3-8B79-37D633B846F1}">
                           <asvg:svgBlip xmlns:asvg="http://schemas.microsoft.com/office/drawing/2016/SVG/main" r:embed="rId20"/>
+                        </a:ext>
+                      </a:extLst>
+                    </a:blip>
+                    <a:stretch>
+                      <a:fillRect/>
+                    </a:stretch>
+                  </pic:blipFill>
+                  <pic:spPr bwMode="auto">
+                    <a:xfrm>
+                      <a:off x="0" y="0"/>
+                      <a:ext cx="3467100" cy="3200400"/>
+                    </a:xfrm>
+                    <a:prstGeom prst="rect">
+                      <a:avLst/>
+                    </a:prstGeom>
+                    <a:noFill/>
+                    <a:ln w="9525">
+                      <a:noFill/>
+                      <a:headEnd/>
+                      <a:tailEnd/>
+                    </a:ln>
+                  </pic:spPr>
+                </pic:pic>
+              </a:graphicData>
+            </a:graphic>
+          </wp:inline>
+        </w:drawing>
+      </w:r>
+    </w:p>
+    <w:p>
+      <w:pPr>
+        <w:numPr>
+          <w:ilvl w:val="1"/>
+          <w:numId w:val="1002"/>
+        </w:numPr>
+      </w:pPr>
+      <w:r>
+        <w:drawing>
+          <wp:inline>
+            <wp:extent cx="3657600" cy="2924175"/>
+            <wp:effectExtent b="0" l="0" r="0" t="0"/>
+            <wp:docPr descr="image" title="" id="25" name="Picture"/>
+            <a:graphic>
+              <a:graphicData uri="http://schemas.openxmlformats.org/drawingml/2006/picture">
+                <pic:pic>
+                  <pic:nvPicPr>
+                    <pic:cNvPr descr="media/supplements1/exercise1/BarraVertical-1.svg" id="26" name="Picture"/>
+                    <pic:cNvPicPr>
+                      <a:picLocks noChangeArrowheads="1" noChangeAspect="1"/>
+                    </pic:cNvPicPr>
+                  </pic:nvPicPr>
+                  <pic:blipFill>
+                    <a:blip r:embed="rId27">
+                      <a:extLst>
+                        <a:ext uri="{28A0092B-C50C-407E-A947-70E740481C1C}">
+                          <a14:useLocalDpi xmlns:a14="http://schemas.microsoft.com/office/drawing/2010/main" val="0"/>
+                        </a:ext>
+                        <a:ext uri="{96DAC541-7B7A-43D3-8B79-37D633B846F1}">
+                          <asvg:svgBlip xmlns:asvg="http://schemas.microsoft.com/office/drawing/2016/SVG/main" r:embed="rId24"/>
                         </a:ext>
                       </a:extLst>
                     </a:blip>
@@ -239,24 +298,24 @@
           <wp:inline>
             <wp:extent cx="3657600" cy="2924175"/>
             <wp:effectExtent b="0" l="0" r="0" t="0"/>
-            <wp:docPr descr="image" title="" id="25" name="Picture"/>
+            <wp:docPr descr="image" title="" id="29" name="Picture"/>
             <a:graphic>
               <a:graphicData uri="http://schemas.openxmlformats.org/drawingml/2006/picture">
                 <pic:pic>
                   <pic:nvPicPr>
-                    <pic:cNvPr descr="media/supplements1/exercise1/BarraVertical-1.svg" id="26" name="Picture"/>
+                    <pic:cNvPr descr="media/supplements1/exercise1/Torta-5.svg" id="30" name="Picture"/>
                     <pic:cNvPicPr>
                       <a:picLocks noChangeArrowheads="1" noChangeAspect="1"/>
                     </pic:cNvPicPr>
                   </pic:nvPicPr>
                   <pic:blipFill>
-                    <a:blip r:embed="rId27">
+                    <a:blip r:embed="rId31">
                       <a:extLst>
                         <a:ext uri="{28A0092B-C50C-407E-A947-70E740481C1C}">
                           <a14:useLocalDpi xmlns:a14="http://schemas.microsoft.com/office/drawing/2010/main" val="0"/>
                         </a:ext>
                         <a:ext uri="{96DAC541-7B7A-43D3-8B79-37D633B846F1}">
-                          <asvg:svgBlip xmlns:asvg="http://schemas.microsoft.com/office/drawing/2016/SVG/main" r:embed="rId24"/>
+                          <asvg:svgBlip xmlns:asvg="http://schemas.microsoft.com/office/drawing/2016/SVG/main" r:embed="rId28"/>
                         </a:ext>
                       </a:extLst>
                     </a:blip>
@@ -296,26 +355,26 @@
       <w:r>
         <w:drawing>
           <wp:inline>
-            <wp:extent cx="3838575" cy="3200400"/>
+            <wp:extent cx="1439999" cy="890181"/>
             <wp:effectExtent b="0" l="0" r="0" t="0"/>
-            <wp:docPr descr="image" title="" id="29" name="Picture"/>
+            <wp:docPr descr="image" title="" id="33" name="Picture"/>
             <a:graphic>
               <a:graphicData uri="http://schemas.openxmlformats.org/drawingml/2006/picture">
                 <pic:pic>
                   <pic:nvPicPr>
-                    <pic:cNvPr descr="media/supplements1/exercise1/BarraHorizontal-3.svg" id="30" name="Picture"/>
+                    <pic:cNvPr descr="media/supplements1/exercise1/image01.svg" id="34" name="Picture"/>
                     <pic:cNvPicPr>
                       <a:picLocks noChangeArrowheads="1" noChangeAspect="1"/>
                     </pic:cNvPicPr>
                   </pic:nvPicPr>
                   <pic:blipFill>
-                    <a:blip r:embed="rId31">
+                    <a:blip r:embed="rId35">
                       <a:extLst>
                         <a:ext uri="{28A0092B-C50C-407E-A947-70E740481C1C}">
                           <a14:useLocalDpi xmlns:a14="http://schemas.microsoft.com/office/drawing/2010/main" val="0"/>
                         </a:ext>
                         <a:ext uri="{96DAC541-7B7A-43D3-8B79-37D633B846F1}">
-                          <asvg:svgBlip xmlns:asvg="http://schemas.microsoft.com/office/drawing/2016/SVG/main" r:embed="rId28"/>
+                          <asvg:svgBlip xmlns:asvg="http://schemas.microsoft.com/office/drawing/2016/SVG/main" r:embed="rId32"/>
                         </a:ext>
                       </a:extLst>
                     </a:blip>
@@ -326,7 +385,7 @@
                   <pic:spPr bwMode="auto">
                     <a:xfrm>
                       <a:off x="0" y="0"/>
-                      <a:ext cx="3838575" cy="3200400"/>
+                      <a:ext cx="1439999" cy="890181"/>
                     </a:xfrm>
                     <a:prstGeom prst="rect">
                       <a:avLst/>
@@ -348,33 +407,49 @@
     <w:p>
       <w:pPr>
         <w:numPr>
-          <w:ilvl w:val="1"/>
-          <w:numId w:val="1002"/>
+          <w:ilvl w:val="0"/>
+          <w:numId w:val="1000"/>
         </w:numPr>
       </w:pPr>
+      <w:r>
+        <w:rPr>
+          <w:b/>
+          <w:bCs/>
+        </w:rPr>
+        <w:t xml:space="preserve">Solución</w:t>
+      </w:r>
+      <w:r>
+        <w:br/>
+      </w:r>
+      <w:r>
+        <w:t xml:space="preserve">Esta tabla representa la información recolectada en la encuesta, mostrando el porcentaje de personas interesadas en adoptar cada tipo de mascota:</w:t>
+      </w:r>
+      <w:r>
+        <w:br/>
+      </w:r>
       <w:r>
         <w:drawing>
           <wp:inline>
-            <wp:extent cx="1439999" cy="829830"/>
+            <wp:extent cx="1439999" cy="890181"/>
             <wp:effectExtent b="0" l="0" r="0" t="0"/>
-            <wp:docPr descr="image" title="" id="33" name="Picture"/>
+            <wp:docPr descr="image" title="" id="37" name="Picture"/>
             <a:graphic>
               <a:graphicData uri="http://schemas.openxmlformats.org/drawingml/2006/picture">
                 <pic:pic>
                   <pic:nvPicPr>
-                    <pic:cNvPr descr="media/supplements1/exercise1/image01.svg" id="34" name="Picture"/>
+                    <pic:cNvPr descr="media/supplements1/exercise1/image01_solution.svg" id="38" name="Picture"/>
                     <pic:cNvPicPr>
                       <a:picLocks noChangeArrowheads="1" noChangeAspect="1"/>
                     </pic:cNvPicPr>
                   </pic:nvPicPr>
                   <pic:blipFill>
-                    <a:blip r:embed="rId35">
+                    <a:blip r:embed="rId39">
                       <a:extLst>
                         <a:ext uri="{28A0092B-C50C-407E-A947-70E740481C1C}">
                           <a14:useLocalDpi xmlns:a14="http://schemas.microsoft.com/office/drawing/2010/main" val="0"/>
                         </a:ext>
                         <a:ext uri="{96DAC541-7B7A-43D3-8B79-37D633B846F1}">
-                          <asvg:svgBlip xmlns:asvg="http://schemas.microsoft.com/office/drawing/2016/SVG/main" r:embed="rId32"/>
+                          <asvg:svgBlip xmlns:asvg="http://schemas.microsoft.com/office/drawing/2016/SVG/main" r:embed="rId36"/>
                         </a:ext>
                       </a:extLst>
                     </a:blip>
@@ -385,7 +460,7 @@
                   <pic:spPr bwMode="auto">
                     <a:xfrm>
                       <a:off x="0" y="0"/>
-                      <a:ext cx="1439999" cy="829830"/>
+                      <a:ext cx="1439999" cy="890181"/>
                     </a:xfrm>
                     <a:prstGeom prst="rect">
                       <a:avLst/>
@@ -408,81 +483,6 @@
       <w:pPr>
         <w:numPr>
           <w:ilvl w:val="0"/>
-          <w:numId w:val="1000"/>
-        </w:numPr>
-      </w:pPr>
-      <w:r>
-        <w:rPr>
-          <w:b/>
-          <w:bCs/>
-        </w:rPr>
-        <w:t xml:space="preserve">Solución</w:t>
-      </w:r>
-      <w:r>
-        <w:br/>
-      </w:r>
-      <w:r>
-        <w:t xml:space="preserve">Esta tabla representa la información recolectada en la encuesta, mostrando el porcentaje de personas interesadas en adoptar cada tipo de mascota:</w:t>
-      </w:r>
-      <w:r>
-        <w:br/>
-      </w:r>
-      <w:r>
-        <w:drawing>
-          <wp:inline>
-            <wp:extent cx="1439999" cy="829830"/>
-            <wp:effectExtent b="0" l="0" r="0" t="0"/>
-            <wp:docPr descr="image" title="" id="37" name="Picture"/>
-            <a:graphic>
-              <a:graphicData uri="http://schemas.openxmlformats.org/drawingml/2006/picture">
-                <pic:pic>
-                  <pic:nvPicPr>
-                    <pic:cNvPr descr="media/supplements1/exercise1/image01_solution.svg" id="38" name="Picture"/>
-                    <pic:cNvPicPr>
-                      <a:picLocks noChangeArrowheads="1" noChangeAspect="1"/>
-                    </pic:cNvPicPr>
-                  </pic:nvPicPr>
-                  <pic:blipFill>
-                    <a:blip r:embed="rId39">
-                      <a:extLst>
-                        <a:ext uri="{28A0092B-C50C-407E-A947-70E740481C1C}">
-                          <a14:useLocalDpi xmlns:a14="http://schemas.microsoft.com/office/drawing/2010/main" val="0"/>
-                        </a:ext>
-                        <a:ext uri="{96DAC541-7B7A-43D3-8B79-37D633B846F1}">
-                          <asvg:svgBlip xmlns:asvg="http://schemas.microsoft.com/office/drawing/2016/SVG/main" r:embed="rId36"/>
-                        </a:ext>
-                      </a:extLst>
-                    </a:blip>
-                    <a:stretch>
-                      <a:fillRect/>
-                    </a:stretch>
-                  </pic:blipFill>
-                  <pic:spPr bwMode="auto">
-                    <a:xfrm>
-                      <a:off x="0" y="0"/>
-                      <a:ext cx="1439999" cy="829830"/>
-                    </a:xfrm>
-                    <a:prstGeom prst="rect">
-                      <a:avLst/>
-                    </a:prstGeom>
-                    <a:noFill/>
-                    <a:ln w="9525">
-                      <a:noFill/>
-                      <a:headEnd/>
-                      <a:tailEnd/>
-                    </a:ln>
-                  </pic:spPr>
-                </pic:pic>
-              </a:graphicData>
-            </a:graphic>
-          </wp:inline>
-        </w:drawing>
-      </w:r>
-    </w:p>
-    <w:p>
-      <w:pPr>
-        <w:numPr>
-          <w:ilvl w:val="0"/>
           <w:numId w:val="1001"/>
         </w:numPr>
       </w:pPr>
@@ -497,7 +497,7 @@
         <w:br/>
       </w:r>
       <w:r>
-        <w:t xml:space="preserve">El líder de un programa de adopción de mascotas encuestó a 120 personas para conocer qué animal les interesaría adoptar. Del total de encuestados, el 60% adoptaría un hurón, el 15% adoptaría un(a) gato y el 25% adoptaría un(a) vaca.</w:t>
+        <w:t xml:space="preserve">El líder de un programa de adopción de mascotas encuestó a 560 personas para conocer qué animal les interesaría adoptar. Del total de encuestados, el 20% adoptaría un gallina, el 15% adoptaría un(a) oveja y el 65% adoptaría un(a) vaca.</w:t>
       </w:r>
     </w:p>
     <w:p>
@@ -583,14 +583,14 @@
       <w:r>
         <w:drawing>
           <wp:inline>
-            <wp:extent cx="1439999" cy="890181"/>
+            <wp:extent cx="3467100" cy="3200400"/>
             <wp:effectExtent b="0" l="0" r="0" t="0"/>
             <wp:docPr descr="image" title="" id="45" name="Picture"/>
             <a:graphic>
               <a:graphicData uri="http://schemas.openxmlformats.org/drawingml/2006/picture">
                 <pic:pic>
                   <pic:nvPicPr>
-                    <pic:cNvPr descr="media/supplements1/exercise2/image01.svg" id="46" name="Picture"/>
+                    <pic:cNvPr descr="media/supplements1/exercise2/BarraHorizontal-3.svg" id="46" name="Picture"/>
                     <pic:cNvPicPr>
                       <a:picLocks noChangeArrowheads="1" noChangeAspect="1"/>
                     </pic:cNvPicPr>
@@ -603,6 +603,124 @@
                         </a:ext>
                         <a:ext uri="{96DAC541-7B7A-43D3-8B79-37D633B846F1}">
                           <asvg:svgBlip xmlns:asvg="http://schemas.microsoft.com/office/drawing/2016/SVG/main" r:embed="rId44"/>
+                        </a:ext>
+                      </a:extLst>
+                    </a:blip>
+                    <a:stretch>
+                      <a:fillRect/>
+                    </a:stretch>
+                  </pic:blipFill>
+                  <pic:spPr bwMode="auto">
+                    <a:xfrm>
+                      <a:off x="0" y="0"/>
+                      <a:ext cx="3467100" cy="3200400"/>
+                    </a:xfrm>
+                    <a:prstGeom prst="rect">
+                      <a:avLst/>
+                    </a:prstGeom>
+                    <a:noFill/>
+                    <a:ln w="9525">
+                      <a:noFill/>
+                      <a:headEnd/>
+                      <a:tailEnd/>
+                    </a:ln>
+                  </pic:spPr>
+                </pic:pic>
+              </a:graphicData>
+            </a:graphic>
+          </wp:inline>
+        </w:drawing>
+      </w:r>
+    </w:p>
+    <w:p>
+      <w:pPr>
+        <w:numPr>
+          <w:ilvl w:val="1"/>
+          <w:numId w:val="1003"/>
+        </w:numPr>
+      </w:pPr>
+      <w:r>
+        <w:drawing>
+          <wp:inline>
+            <wp:extent cx="3657600" cy="2924175"/>
+            <wp:effectExtent b="0" l="0" r="0" t="0"/>
+            <wp:docPr descr="image" title="" id="49" name="Picture"/>
+            <a:graphic>
+              <a:graphicData uri="http://schemas.openxmlformats.org/drawingml/2006/picture">
+                <pic:pic>
+                  <pic:nvPicPr>
+                    <pic:cNvPr descr="media/supplements1/exercise2/Torta-5.svg" id="50" name="Picture"/>
+                    <pic:cNvPicPr>
+                      <a:picLocks noChangeArrowheads="1" noChangeAspect="1"/>
+                    </pic:cNvPicPr>
+                  </pic:nvPicPr>
+                  <pic:blipFill>
+                    <a:blip r:embed="rId51">
+                      <a:extLst>
+                        <a:ext uri="{28A0092B-C50C-407E-A947-70E740481C1C}">
+                          <a14:useLocalDpi xmlns:a14="http://schemas.microsoft.com/office/drawing/2010/main" val="0"/>
+                        </a:ext>
+                        <a:ext uri="{96DAC541-7B7A-43D3-8B79-37D633B846F1}">
+                          <asvg:svgBlip xmlns:asvg="http://schemas.microsoft.com/office/drawing/2016/SVG/main" r:embed="rId48"/>
+                        </a:ext>
+                      </a:extLst>
+                    </a:blip>
+                    <a:stretch>
+                      <a:fillRect/>
+                    </a:stretch>
+                  </pic:blipFill>
+                  <pic:spPr bwMode="auto">
+                    <a:xfrm>
+                      <a:off x="0" y="0"/>
+                      <a:ext cx="3657600" cy="2924175"/>
+                    </a:xfrm>
+                    <a:prstGeom prst="rect">
+                      <a:avLst/>
+                    </a:prstGeom>
+                    <a:noFill/>
+                    <a:ln w="9525">
+                      <a:noFill/>
+                      <a:headEnd/>
+                      <a:tailEnd/>
+                    </a:ln>
+                  </pic:spPr>
+                </pic:pic>
+              </a:graphicData>
+            </a:graphic>
+          </wp:inline>
+        </w:drawing>
+      </w:r>
+    </w:p>
+    <w:p>
+      <w:pPr>
+        <w:numPr>
+          <w:ilvl w:val="1"/>
+          <w:numId w:val="1003"/>
+        </w:numPr>
+      </w:pPr>
+      <w:r>
+        <w:drawing>
+          <wp:inline>
+            <wp:extent cx="1439999" cy="890181"/>
+            <wp:effectExtent b="0" l="0" r="0" t="0"/>
+            <wp:docPr descr="image" title="" id="53" name="Picture"/>
+            <a:graphic>
+              <a:graphicData uri="http://schemas.openxmlformats.org/drawingml/2006/picture">
+                <pic:pic>
+                  <pic:nvPicPr>
+                    <pic:cNvPr descr="media/supplements1/exercise2/image01.svg" id="54" name="Picture"/>
+                    <pic:cNvPicPr>
+                      <a:picLocks noChangeArrowheads="1" noChangeAspect="1"/>
+                    </pic:cNvPicPr>
+                  </pic:nvPicPr>
+                  <pic:blipFill>
+                    <a:blip r:embed="rId55">
+                      <a:extLst>
+                        <a:ext uri="{28A0092B-C50C-407E-A947-70E740481C1C}">
+                          <a14:useLocalDpi xmlns:a14="http://schemas.microsoft.com/office/drawing/2010/main" val="0"/>
+                        </a:ext>
+                        <a:ext uri="{96DAC541-7B7A-43D3-8B79-37D633B846F1}">
+                          <asvg:svgBlip xmlns:asvg="http://schemas.microsoft.com/office/drawing/2016/SVG/main" r:embed="rId52"/>
                         </a:ext>
                       </a:extLst>
                     </a:blip>
@@ -635,33 +753,143 @@
     <w:p>
       <w:pPr>
         <w:numPr>
-          <w:ilvl w:val="1"/>
-          <w:numId w:val="1003"/>
+          <w:ilvl w:val="0"/>
+          <w:numId w:val="1000"/>
         </w:numPr>
       </w:pPr>
+      <w:r>
+        <w:rPr>
+          <w:b/>
+          <w:bCs/>
+        </w:rPr>
+        <w:t xml:space="preserve">Solución</w:t>
+      </w:r>
+      <w:r>
+        <w:br/>
+      </w:r>
+      <w:r>
+        <w:t xml:space="preserve">Esta tabla representa la información recolectada en la encuesta, mostrando el porcentaje de personas interesadas en adoptar cada tipo de mascota:</w:t>
+      </w:r>
+      <w:r>
+        <w:br/>
+      </w:r>
       <w:r>
         <w:drawing>
           <wp:inline>
-            <wp:extent cx="3657600" cy="2924175"/>
+            <wp:extent cx="1439999" cy="890181"/>
             <wp:effectExtent b="0" l="0" r="0" t="0"/>
-            <wp:docPr descr="image" title="" id="49" name="Picture"/>
+            <wp:docPr descr="image" title="" id="57" name="Picture"/>
             <a:graphic>
               <a:graphicData uri="http://schemas.openxmlformats.org/drawingml/2006/picture">
                 <pic:pic>
                   <pic:nvPicPr>
-                    <pic:cNvPr descr="media/supplements1/exercise2/Torta-5.svg" id="50" name="Picture"/>
+                    <pic:cNvPr descr="media/supplements1/exercise2/image01_solution.svg" id="58" name="Picture"/>
                     <pic:cNvPicPr>
                       <a:picLocks noChangeArrowheads="1" noChangeAspect="1"/>
                     </pic:cNvPicPr>
                   </pic:nvPicPr>
                   <pic:blipFill>
-                    <a:blip r:embed="rId51">
+                    <a:blip r:embed="rId59">
                       <a:extLst>
                         <a:ext uri="{28A0092B-C50C-407E-A947-70E740481C1C}">
                           <a14:useLocalDpi xmlns:a14="http://schemas.microsoft.com/office/drawing/2010/main" val="0"/>
                         </a:ext>
                         <a:ext uri="{96DAC541-7B7A-43D3-8B79-37D633B846F1}">
-                          <asvg:svgBlip xmlns:asvg="http://schemas.microsoft.com/office/drawing/2016/SVG/main" r:embed="rId48"/>
+                          <asvg:svgBlip xmlns:asvg="http://schemas.microsoft.com/office/drawing/2016/SVG/main" r:embed="rId56"/>
+                        </a:ext>
+                      </a:extLst>
+                    </a:blip>
+                    <a:stretch>
+                      <a:fillRect/>
+                    </a:stretch>
+                  </pic:blipFill>
+                  <pic:spPr bwMode="auto">
+                    <a:xfrm>
+                      <a:off x="0" y="0"/>
+                      <a:ext cx="1439999" cy="890181"/>
+                    </a:xfrm>
+                    <a:prstGeom prst="rect">
+                      <a:avLst/>
+                    </a:prstGeom>
+                    <a:noFill/>
+                    <a:ln w="9525">
+                      <a:noFill/>
+                      <a:headEnd/>
+                      <a:tailEnd/>
+                    </a:ln>
+                  </pic:spPr>
+                </pic:pic>
+              </a:graphicData>
+            </a:graphic>
+          </wp:inline>
+        </w:drawing>
+      </w:r>
+    </w:p>
+    <w:p>
+      <w:pPr>
+        <w:numPr>
+          <w:ilvl w:val="0"/>
+          <w:numId w:val="1001"/>
+        </w:numPr>
+      </w:pPr>
+      <w:r>
+        <w:rPr>
+          <w:b/>
+          <w:bCs/>
+        </w:rPr>
+        <w:t xml:space="preserve">Escenario</w:t>
+      </w:r>
+      <w:r>
+        <w:br/>
+      </w:r>
+      <w:r>
+        <w:t xml:space="preserve">El líder de un programa de adopción de mascotas encuestó a 410 personas para conocer qué animal les interesaría adoptar. Del total de encuestados, el 25% adoptaría un ganso, el 15% adoptaría un(a) ternero y el 60% adoptaría un(a) burro.</w:t>
+      </w:r>
+    </w:p>
+    <w:p>
+      <w:pPr>
+        <w:numPr>
+          <w:ilvl w:val="0"/>
+          <w:numId w:val="1000"/>
+        </w:numPr>
+      </w:pPr>
+      <w:r>
+        <w:t xml:space="preserve">¿Cuál de las siguientes representaciones muestra correctamente la información recolectada en la encuesta?</w:t>
+      </w:r>
+      <w:r>
+        <w:br/>
+      </w:r>
+    </w:p>
+    <w:p>
+      <w:pPr>
+        <w:numPr>
+          <w:ilvl w:val="1"/>
+          <w:numId w:val="1004"/>
+        </w:numPr>
+      </w:pPr>
+      <w:r>
+        <w:drawing>
+          <wp:inline>
+            <wp:extent cx="3657600" cy="2924175"/>
+            <wp:effectExtent b="0" l="0" r="0" t="0"/>
+            <wp:docPr descr="image" title="" id="61" name="Picture"/>
+            <a:graphic>
+              <a:graphicData uri="http://schemas.openxmlformats.org/drawingml/2006/picture">
+                <pic:pic>
+                  <pic:nvPicPr>
+                    <pic:cNvPr descr="media/supplements1/exercise3/BarraVertical-1.svg" id="62" name="Picture"/>
+                    <pic:cNvPicPr>
+                      <a:picLocks noChangeArrowheads="1" noChangeAspect="1"/>
+                    </pic:cNvPicPr>
+                  </pic:nvPicPr>
+                  <pic:blipFill>
+                    <a:blip r:embed="rId63">
+                      <a:extLst>
+                        <a:ext uri="{28A0092B-C50C-407E-A947-70E740481C1C}">
+                          <a14:useLocalDpi xmlns:a14="http://schemas.microsoft.com/office/drawing/2010/main" val="0"/>
+                        </a:ext>
+                        <a:ext uri="{96DAC541-7B7A-43D3-8B79-37D633B846F1}">
+                          <asvg:svgBlip xmlns:asvg="http://schemas.microsoft.com/office/drawing/2016/SVG/main" r:embed="rId60"/>
                         </a:ext>
                       </a:extLst>
                     </a:blip>
@@ -695,32 +923,32 @@
       <w:pPr>
         <w:numPr>
           <w:ilvl w:val="1"/>
-          <w:numId w:val="1003"/>
+          <w:numId w:val="1004"/>
         </w:numPr>
       </w:pPr>
       <w:r>
         <w:drawing>
           <wp:inline>
-            <wp:extent cx="3838575" cy="3200400"/>
+            <wp:extent cx="3467100" cy="3200400"/>
             <wp:effectExtent b="0" l="0" r="0" t="0"/>
-            <wp:docPr descr="image" title="" id="53" name="Picture"/>
+            <wp:docPr descr="image" title="" id="65" name="Picture"/>
             <a:graphic>
               <a:graphicData uri="http://schemas.openxmlformats.org/drawingml/2006/picture">
                 <pic:pic>
                   <pic:nvPicPr>
-                    <pic:cNvPr descr="media/supplements1/exercise2/BarraHorizontal-3.svg" id="54" name="Picture"/>
+                    <pic:cNvPr descr="media/supplements1/exercise3/BarraHorizontal-3.svg" id="66" name="Picture"/>
                     <pic:cNvPicPr>
                       <a:picLocks noChangeArrowheads="1" noChangeAspect="1"/>
                     </pic:cNvPicPr>
                   </pic:nvPicPr>
                   <pic:blipFill>
-                    <a:blip r:embed="rId55">
+                    <a:blip r:embed="rId67">
                       <a:extLst>
                         <a:ext uri="{28A0092B-C50C-407E-A947-70E740481C1C}">
                           <a14:useLocalDpi xmlns:a14="http://schemas.microsoft.com/office/drawing/2010/main" val="0"/>
                         </a:ext>
                         <a:ext uri="{96DAC541-7B7A-43D3-8B79-37D633B846F1}">
-                          <asvg:svgBlip xmlns:asvg="http://schemas.microsoft.com/office/drawing/2016/SVG/main" r:embed="rId52"/>
+                          <asvg:svgBlip xmlns:asvg="http://schemas.microsoft.com/office/drawing/2016/SVG/main" r:embed="rId64"/>
                         </a:ext>
                       </a:extLst>
                     </a:blip>
@@ -731,235 +959,7 @@
                   <pic:spPr bwMode="auto">
                     <a:xfrm>
                       <a:off x="0" y="0"/>
-                      <a:ext cx="3838575" cy="3200400"/>
-                    </a:xfrm>
-                    <a:prstGeom prst="rect">
-                      <a:avLst/>
-                    </a:prstGeom>
-                    <a:noFill/>
-                    <a:ln w="9525">
-                      <a:noFill/>
-                      <a:headEnd/>
-                      <a:tailEnd/>
-                    </a:ln>
-                  </pic:spPr>
-                </pic:pic>
-              </a:graphicData>
-            </a:graphic>
-          </wp:inline>
-        </w:drawing>
-      </w:r>
-    </w:p>
-    <w:p>
-      <w:pPr>
-        <w:numPr>
-          <w:ilvl w:val="0"/>
-          <w:numId w:val="1000"/>
-        </w:numPr>
-      </w:pPr>
-      <w:r>
-        <w:rPr>
-          <w:b/>
-          <w:bCs/>
-        </w:rPr>
-        <w:t xml:space="preserve">Solución</w:t>
-      </w:r>
-      <w:r>
-        <w:br/>
-      </w:r>
-      <w:r>
-        <w:t xml:space="preserve">Esta tabla representa la información recolectada en la encuesta, mostrando el porcentaje de personas interesadas en adoptar cada tipo de mascota:</w:t>
-      </w:r>
-      <w:r>
-        <w:br/>
-      </w:r>
-      <w:r>
-        <w:drawing>
-          <wp:inline>
-            <wp:extent cx="1439999" cy="890181"/>
-            <wp:effectExtent b="0" l="0" r="0" t="0"/>
-            <wp:docPr descr="image" title="" id="57" name="Picture"/>
-            <a:graphic>
-              <a:graphicData uri="http://schemas.openxmlformats.org/drawingml/2006/picture">
-                <pic:pic>
-                  <pic:nvPicPr>
-                    <pic:cNvPr descr="media/supplements1/exercise2/image01_solution.svg" id="58" name="Picture"/>
-                    <pic:cNvPicPr>
-                      <a:picLocks noChangeArrowheads="1" noChangeAspect="1"/>
-                    </pic:cNvPicPr>
-                  </pic:nvPicPr>
-                  <pic:blipFill>
-                    <a:blip r:embed="rId59">
-                      <a:extLst>
-                        <a:ext uri="{28A0092B-C50C-407E-A947-70E740481C1C}">
-                          <a14:useLocalDpi xmlns:a14="http://schemas.microsoft.com/office/drawing/2010/main" val="0"/>
-                        </a:ext>
-                        <a:ext uri="{96DAC541-7B7A-43D3-8B79-37D633B846F1}">
-                          <asvg:svgBlip xmlns:asvg="http://schemas.microsoft.com/office/drawing/2016/SVG/main" r:embed="rId56"/>
-                        </a:ext>
-                      </a:extLst>
-                    </a:blip>
-                    <a:stretch>
-                      <a:fillRect/>
-                    </a:stretch>
-                  </pic:blipFill>
-                  <pic:spPr bwMode="auto">
-                    <a:xfrm>
-                      <a:off x="0" y="0"/>
-                      <a:ext cx="1439999" cy="890181"/>
-                    </a:xfrm>
-                    <a:prstGeom prst="rect">
-                      <a:avLst/>
-                    </a:prstGeom>
-                    <a:noFill/>
-                    <a:ln w="9525">
-                      <a:noFill/>
-                      <a:headEnd/>
-                      <a:tailEnd/>
-                    </a:ln>
-                  </pic:spPr>
-                </pic:pic>
-              </a:graphicData>
-            </a:graphic>
-          </wp:inline>
-        </w:drawing>
-      </w:r>
-    </w:p>
-    <w:p>
-      <w:pPr>
-        <w:numPr>
-          <w:ilvl w:val="0"/>
-          <w:numId w:val="1001"/>
-        </w:numPr>
-      </w:pPr>
-      <w:r>
-        <w:rPr>
-          <w:b/>
-          <w:bCs/>
-        </w:rPr>
-        <w:t xml:space="preserve">Escenario</w:t>
-      </w:r>
-      <w:r>
-        <w:br/>
-      </w:r>
-      <w:r>
-        <w:t xml:space="preserve">El líder de un programa de adopción de mascotas encuestó a 260 personas para conocer qué animal les interesaría adoptar. Del total de encuestados, el 10% adoptaría un tortuga, el 60% adoptaría un(a) erizo y el 30% adoptaría un(a) oveja.</w:t>
-      </w:r>
-    </w:p>
-    <w:p>
-      <w:pPr>
-        <w:numPr>
-          <w:ilvl w:val="0"/>
-          <w:numId w:val="1000"/>
-        </w:numPr>
-      </w:pPr>
-      <w:r>
-        <w:t xml:space="preserve">¿Cuál de las siguientes representaciones muestra correctamente la información recolectada en la encuesta?</w:t>
-      </w:r>
-      <w:r>
-        <w:br/>
-      </w:r>
-    </w:p>
-    <w:p>
-      <w:pPr>
-        <w:numPr>
-          <w:ilvl w:val="1"/>
-          <w:numId w:val="1004"/>
-        </w:numPr>
-      </w:pPr>
-      <w:r>
-        <w:drawing>
-          <wp:inline>
-            <wp:extent cx="3838575" cy="3200400"/>
-            <wp:effectExtent b="0" l="0" r="0" t="0"/>
-            <wp:docPr descr="image" title="" id="61" name="Picture"/>
-            <a:graphic>
-              <a:graphicData uri="http://schemas.openxmlformats.org/drawingml/2006/picture">
-                <pic:pic>
-                  <pic:nvPicPr>
-                    <pic:cNvPr descr="media/supplements1/exercise3/BarraHorizontal-3.svg" id="62" name="Picture"/>
-                    <pic:cNvPicPr>
-                      <a:picLocks noChangeArrowheads="1" noChangeAspect="1"/>
-                    </pic:cNvPicPr>
-                  </pic:nvPicPr>
-                  <pic:blipFill>
-                    <a:blip r:embed="rId63">
-                      <a:extLst>
-                        <a:ext uri="{28A0092B-C50C-407E-A947-70E740481C1C}">
-                          <a14:useLocalDpi xmlns:a14="http://schemas.microsoft.com/office/drawing/2010/main" val="0"/>
-                        </a:ext>
-                        <a:ext uri="{96DAC541-7B7A-43D3-8B79-37D633B846F1}">
-                          <asvg:svgBlip xmlns:asvg="http://schemas.microsoft.com/office/drawing/2016/SVG/main" r:embed="rId60"/>
-                        </a:ext>
-                      </a:extLst>
-                    </a:blip>
-                    <a:stretch>
-                      <a:fillRect/>
-                    </a:stretch>
-                  </pic:blipFill>
-                  <pic:spPr bwMode="auto">
-                    <a:xfrm>
-                      <a:off x="0" y="0"/>
-                      <a:ext cx="3838575" cy="3200400"/>
-                    </a:xfrm>
-                    <a:prstGeom prst="rect">
-                      <a:avLst/>
-                    </a:prstGeom>
-                    <a:noFill/>
-                    <a:ln w="9525">
-                      <a:noFill/>
-                      <a:headEnd/>
-                      <a:tailEnd/>
-                    </a:ln>
-                  </pic:spPr>
-                </pic:pic>
-              </a:graphicData>
-            </a:graphic>
-          </wp:inline>
-        </w:drawing>
-      </w:r>
-    </w:p>
-    <w:p>
-      <w:pPr>
-        <w:numPr>
-          <w:ilvl w:val="1"/>
-          <w:numId w:val="1004"/>
-        </w:numPr>
-      </w:pPr>
-      <w:r>
-        <w:drawing>
-          <wp:inline>
-            <wp:extent cx="1439999" cy="890181"/>
-            <wp:effectExtent b="0" l="0" r="0" t="0"/>
-            <wp:docPr descr="image" title="" id="65" name="Picture"/>
-            <a:graphic>
-              <a:graphicData uri="http://schemas.openxmlformats.org/drawingml/2006/picture">
-                <pic:pic>
-                  <pic:nvPicPr>
-                    <pic:cNvPr descr="media/supplements1/exercise3/image01.svg" id="66" name="Picture"/>
-                    <pic:cNvPicPr>
-                      <a:picLocks noChangeArrowheads="1" noChangeAspect="1"/>
-                    </pic:cNvPicPr>
-                  </pic:nvPicPr>
-                  <pic:blipFill>
-                    <a:blip r:embed="rId67">
-                      <a:extLst>
-                        <a:ext uri="{28A0092B-C50C-407E-A947-70E740481C1C}">
-                          <a14:useLocalDpi xmlns:a14="http://schemas.microsoft.com/office/drawing/2010/main" val="0"/>
-                        </a:ext>
-                        <a:ext uri="{96DAC541-7B7A-43D3-8B79-37D633B846F1}">
-                          <asvg:svgBlip xmlns:asvg="http://schemas.microsoft.com/office/drawing/2016/SVG/main" r:embed="rId64"/>
-                        </a:ext>
-                      </a:extLst>
-                    </a:blip>
-                    <a:stretch>
-                      <a:fillRect/>
-                    </a:stretch>
-                  </pic:blipFill>
-                  <pic:spPr bwMode="auto">
-                    <a:xfrm>
-                      <a:off x="0" y="0"/>
-                      <a:ext cx="1439999" cy="890181"/>
+                      <a:ext cx="3467100" cy="3200400"/>
                     </a:xfrm>
                     <a:prstGeom prst="rect">
                       <a:avLst/>
@@ -1047,14 +1047,14 @@
       <w:r>
         <w:drawing>
           <wp:inline>
-            <wp:extent cx="3657600" cy="2924175"/>
+            <wp:extent cx="1439999" cy="890181"/>
             <wp:effectExtent b="0" l="0" r="0" t="0"/>
             <wp:docPr descr="image" title="" id="73" name="Picture"/>
             <a:graphic>
               <a:graphicData uri="http://schemas.openxmlformats.org/drawingml/2006/picture">
                 <pic:pic>
                   <pic:nvPicPr>
-                    <pic:cNvPr descr="media/supplements1/exercise3/BarraVertical-1.svg" id="74" name="Picture"/>
+                    <pic:cNvPr descr="media/supplements1/exercise3/image01.svg" id="74" name="Picture"/>
                     <pic:cNvPicPr>
                       <a:picLocks noChangeArrowheads="1" noChangeAspect="1"/>
                     </pic:cNvPicPr>
@@ -1077,7 +1077,7 @@
                   <pic:spPr bwMode="auto">
                     <a:xfrm>
                       <a:off x="0" y="0"/>
-                      <a:ext cx="3657600" cy="2924175"/>
+                      <a:ext cx="1439999" cy="890181"/>
                     </a:xfrm>
                     <a:prstGeom prst="rect">
                       <a:avLst/>

</xml_diff>

<commit_message>
Generando salidas exams2* en doble columna y hoja tamaño oficio, garantizando versión docente y versión estudiante
</commit_message>
<xml_diff>
--- a/Auxiliares/Ejemplos-Funcionales-Rmd/Plantillas/tex/Graficos_Estadisticos_Adopcion_Mascotas/salida/I_1796473-Opc-A2_optimizado_oficio_1.docx
+++ b/Auxiliares/Ejemplos-Funcionales-Rmd/Plantillas/tex/Graficos_Estadisticos_Adopcion_Mascotas/salida/I_1796473-Opc-A2_optimizado_oficio_1.docx
@@ -2,14 +2,6 @@
 <file path=word/document.xml><?xml version="1.0" encoding="utf-8"?>
 <w:document xmlns:w="http://schemas.openxmlformats.org/wordprocessingml/2006/main" xmlns:m="http://schemas.openxmlformats.org/officeDocument/2006/math" xmlns:r="http://schemas.openxmlformats.org/officeDocument/2006/relationships" xmlns:o="urn:schemas-microsoft-com:office:office" xmlns:v="urn:schemas-microsoft-com:vml" xmlns:w10="urn:schemas-microsoft-com:office:word" xmlns:a="http://schemas.openxmlformats.org/drawingml/2006/main" xmlns:pic="http://schemas.openxmlformats.org/drawingml/2006/picture" xmlns:wp="http://schemas.openxmlformats.org/drawingml/2006/wordprocessingDrawing">
   <w:body>
-    <w:p>
-      <w:pPr>
-        <w:pStyle w:val="FirstParagraph"/>
-      </w:pPr>
-      <w:r>
-        <w:t xml:space="preserve">2</w:t>
-      </w:r>
-    </w:p>
     <w:p>
       <w:pPr>
         <w:numPr>
@@ -28,7 +20,7 @@
         <w:br/>
       </w:r>
       <w:r>
-        <w:t xml:space="preserve">El líder de un programa de adopción de mascotas encuestó a 480 personas para conocer qué animal les interesaría adoptar. Del total de encuestados, el 10% adoptaría un gato, el 25% adoptaría un(a) loro y el 65% adoptaría un(a) cabra.</w:t>
+        <w:t xml:space="preserve">El líder de un programa de adopción de mascotas encuestó a 180 personas para conocer qué animal les interesaría adoptar. Del total de encuestados, el 25% adoptaría un iguana, el 55% adoptaría un(a) ganso y el 20% adoptaría un(a) hurón.</w:t>
       </w:r>
     </w:p>
     <w:p>
@@ -62,7 +54,7 @@
               <a:graphicData uri="http://schemas.openxmlformats.org/drawingml/2006/picture">
                 <pic:pic>
                   <pic:nvPicPr>
-                    <pic:cNvPr descr="media/supplements1/exercise1/BarraVertical-1.svg" id="22" name="Picture"/>
+                    <pic:cNvPr descr="media/supplements1/exercise1/Torta-5.svg" id="22" name="Picture"/>
                     <pic:cNvPicPr>
                       <a:picLocks noChangeArrowheads="1" noChangeAspect="1"/>
                     </pic:cNvPicPr>
@@ -114,14 +106,14 @@
       <w:r>
         <w:drawing>
           <wp:inline>
-            <wp:extent cx="3467100" cy="3200400"/>
+            <wp:extent cx="3657600" cy="2924175"/>
             <wp:effectExtent b="0" l="0" r="0" t="0"/>
             <wp:docPr descr="image" title="" id="25" name="Picture"/>
             <a:graphic>
               <a:graphicData uri="http://schemas.openxmlformats.org/drawingml/2006/picture">
                 <pic:pic>
                   <pic:nvPicPr>
-                    <pic:cNvPr descr="media/supplements1/exercise1/BarraHorizontal-3.svg" id="26" name="Picture"/>
+                    <pic:cNvPr descr="media/supplements1/exercise1/BarraVertical-1.svg" id="26" name="Picture"/>
                     <pic:cNvPicPr>
                       <a:picLocks noChangeArrowheads="1" noChangeAspect="1"/>
                     </pic:cNvPicPr>
@@ -144,7 +136,7 @@
                   <pic:spPr bwMode="auto">
                     <a:xfrm>
                       <a:off x="0" y="0"/>
-                      <a:ext cx="3467100" cy="3200400"/>
+                      <a:ext cx="3657600" cy="2924175"/>
                     </a:xfrm>
                     <a:prstGeom prst="rect">
                       <a:avLst/>
@@ -173,14 +165,14 @@
       <w:r>
         <w:drawing>
           <wp:inline>
-            <wp:extent cx="3657600" cy="2924175"/>
+            <wp:extent cx="1439999" cy="890181"/>
             <wp:effectExtent b="0" l="0" r="0" t="0"/>
             <wp:docPr descr="image" title="" id="29" name="Picture"/>
             <a:graphic>
               <a:graphicData uri="http://schemas.openxmlformats.org/drawingml/2006/picture">
                 <pic:pic>
                   <pic:nvPicPr>
-                    <pic:cNvPr descr="media/supplements1/exercise1/Torta-5.svg" id="30" name="Picture"/>
+                    <pic:cNvPr descr="media/supplements1/exercise1/image01.svg" id="30" name="Picture"/>
                     <pic:cNvPicPr>
                       <a:picLocks noChangeArrowheads="1" noChangeAspect="1"/>
                     </pic:cNvPicPr>
@@ -203,7 +195,7 @@
                   <pic:spPr bwMode="auto">
                     <a:xfrm>
                       <a:off x="0" y="0"/>
-                      <a:ext cx="3657600" cy="2924175"/>
+                      <a:ext cx="1439999" cy="890181"/>
                     </a:xfrm>
                     <a:prstGeom prst="rect">
                       <a:avLst/>
@@ -232,14 +224,14 @@
       <w:r>
         <w:drawing>
           <wp:inline>
-            <wp:extent cx="1439999" cy="890181"/>
+            <wp:extent cx="3467100" cy="3200400"/>
             <wp:effectExtent b="0" l="0" r="0" t="0"/>
             <wp:docPr descr="image" title="" id="33" name="Picture"/>
             <a:graphic>
               <a:graphicData uri="http://schemas.openxmlformats.org/drawingml/2006/picture">
                 <pic:pic>
                   <pic:nvPicPr>
-                    <pic:cNvPr descr="media/supplements1/exercise1/image01.svg" id="34" name="Picture"/>
+                    <pic:cNvPr descr="media/supplements1/exercise1/BarraHorizontal-3.svg" id="34" name="Picture"/>
                     <pic:cNvPicPr>
                       <a:picLocks noChangeArrowheads="1" noChangeAspect="1"/>
                     </pic:cNvPicPr>
@@ -262,7 +254,7 @@
                   <pic:spPr bwMode="auto">
                     <a:xfrm>
                       <a:off x="0" y="0"/>
-                      <a:ext cx="1439999" cy="890181"/>
+                      <a:ext cx="3467100" cy="3200400"/>
                     </a:xfrm>
                     <a:prstGeom prst="rect">
                       <a:avLst/>
@@ -374,7 +366,7 @@
         <w:br/>
       </w:r>
       <w:r>
-        <w:t xml:space="preserve">El líder de un programa de adopción de mascotas encuestó a 80 personas para conocer qué animal les interesaría adoptar. Del total de encuestados, el 40% adoptaría un vaca, el 55% adoptaría un(a) canario y el 5% adoptaría un(a) pato.</w:t>
+        <w:t xml:space="preserve">El líder de un programa de adopción de mascotas encuestó a 480 personas para conocer qué animal les interesaría adoptar. Del total de encuestados, el 15% adoptaría un loro, el 25% adoptaría un(a) caballo y el 60% adoptaría un(a) cabra.</w:t>
       </w:r>
     </w:p>
     <w:p>
@@ -467,7 +459,7 @@
               <a:graphicData uri="http://schemas.openxmlformats.org/drawingml/2006/picture">
                 <pic:pic>
                   <pic:nvPicPr>
-                    <pic:cNvPr descr="media/supplements1/exercise2/BarraVertical-1.svg" id="46" name="Picture"/>
+                    <pic:cNvPr descr="media/supplements1/exercise2/Torta-5.svg" id="46" name="Picture"/>
                     <pic:cNvPicPr>
                       <a:picLocks noChangeArrowheads="1" noChangeAspect="1"/>
                     </pic:cNvPicPr>
@@ -526,7 +518,7 @@
               <a:graphicData uri="http://schemas.openxmlformats.org/drawingml/2006/picture">
                 <pic:pic>
                   <pic:nvPicPr>
-                    <pic:cNvPr descr="media/supplements1/exercise2/Torta-5.svg" id="50" name="Picture"/>
+                    <pic:cNvPr descr="media/supplements1/exercise2/BarraVertical-1.svg" id="50" name="Picture"/>
                     <pic:cNvPicPr>
                       <a:picLocks noChangeArrowheads="1" noChangeAspect="1"/>
                     </pic:cNvPicPr>
@@ -720,7 +712,7 @@
         <w:br/>
       </w:r>
       <w:r>
-        <w:t xml:space="preserve">El líder de un programa de adopción de mascotas encuestó a 120 personas para conocer qué animal les interesaría adoptar. Del total de encuestados, el 35% adoptaría un erizo, el 55% adoptaría un(a) cisne y el 10% adoptaría un(a) ganso.</w:t>
+        <w:t xml:space="preserve">El líder de un programa de adopción de mascotas encuestó a 160 personas para conocer qué animal les interesaría adoptar. Del total de encuestados, el 40% adoptaría un hurón, el 25% adoptaría un(a) tortuga y el 35% adoptaría un(a) conejo.</w:t>
       </w:r>
     </w:p>
     <w:p>
@@ -747,14 +739,14 @@
       <w:r>
         <w:drawing>
           <wp:inline>
-            <wp:extent cx="1439999" cy="890181"/>
+            <wp:extent cx="3467100" cy="3200400"/>
             <wp:effectExtent b="0" l="0" r="0" t="0"/>
             <wp:docPr descr="image" title="" id="61" name="Picture"/>
             <a:graphic>
               <a:graphicData uri="http://schemas.openxmlformats.org/drawingml/2006/picture">
                 <pic:pic>
                   <pic:nvPicPr>
-                    <pic:cNvPr descr="media/supplements1/exercise3/image01.svg" id="62" name="Picture"/>
+                    <pic:cNvPr descr="media/supplements1/exercise3/BarraHorizontal-3.svg" id="62" name="Picture"/>
                     <pic:cNvPicPr>
                       <a:picLocks noChangeArrowheads="1" noChangeAspect="1"/>
                     </pic:cNvPicPr>
@@ -777,7 +769,7 @@
                   <pic:spPr bwMode="auto">
                     <a:xfrm>
                       <a:off x="0" y="0"/>
-                      <a:ext cx="1439999" cy="890181"/>
+                      <a:ext cx="3467100" cy="3200400"/>
                     </a:xfrm>
                     <a:prstGeom prst="rect">
                       <a:avLst/>
@@ -806,14 +798,14 @@
       <w:r>
         <w:drawing>
           <wp:inline>
-            <wp:extent cx="3467100" cy="3200400"/>
+            <wp:extent cx="1439999" cy="890181"/>
             <wp:effectExtent b="0" l="0" r="0" t="0"/>
             <wp:docPr descr="image" title="" id="65" name="Picture"/>
             <a:graphic>
               <a:graphicData uri="http://schemas.openxmlformats.org/drawingml/2006/picture">
                 <pic:pic>
                   <pic:nvPicPr>
-                    <pic:cNvPr descr="media/supplements1/exercise3/BarraHorizontal-3.svg" id="66" name="Picture"/>
+                    <pic:cNvPr descr="media/supplements1/exercise3/image01.svg" id="66" name="Picture"/>
                     <pic:cNvPicPr>
                       <a:picLocks noChangeArrowheads="1" noChangeAspect="1"/>
                     </pic:cNvPicPr>
@@ -836,7 +828,7 @@
                   <pic:spPr bwMode="auto">
                     <a:xfrm>
                       <a:off x="0" y="0"/>
-                      <a:ext cx="3467100" cy="3200400"/>
+                      <a:ext cx="1439999" cy="890181"/>
                     </a:xfrm>
                     <a:prstGeom prst="rect">
                       <a:avLst/>
@@ -872,7 +864,7 @@
               <a:graphicData uri="http://schemas.openxmlformats.org/drawingml/2006/picture">
                 <pic:pic>
                   <pic:nvPicPr>
-                    <pic:cNvPr descr="media/supplements1/exercise3/BarraVertical-1.svg" id="70" name="Picture"/>
+                    <pic:cNvPr descr="media/supplements1/exercise3/Torta-5.svg" id="70" name="Picture"/>
                     <pic:cNvPicPr>
                       <a:picLocks noChangeArrowheads="1" noChangeAspect="1"/>
                     </pic:cNvPicPr>
@@ -931,7 +923,7 @@
               <a:graphicData uri="http://schemas.openxmlformats.org/drawingml/2006/picture">
                 <pic:pic>
                   <pic:nvPicPr>
-                    <pic:cNvPr descr="media/supplements1/exercise3/Torta-5.svg" id="74" name="Picture"/>
+                    <pic:cNvPr descr="media/supplements1/exercise3/BarraVertical-1.svg" id="74" name="Picture"/>
                     <pic:cNvPicPr>
                       <a:picLocks noChangeArrowheads="1" noChangeAspect="1"/>
                     </pic:cNvPicPr>
@@ -1030,6 +1022,4158 @@
                     <a:xfrm>
                       <a:off x="0" y="0"/>
                       <a:ext cx="1439999" cy="890181"/>
+                    </a:xfrm>
+                    <a:prstGeom prst="rect">
+                      <a:avLst/>
+                    </a:prstGeom>
+                    <a:noFill/>
+                    <a:ln w="9525">
+                      <a:noFill/>
+                      <a:headEnd/>
+                      <a:tailEnd/>
+                    </a:ln>
+                  </pic:spPr>
+                </pic:pic>
+              </a:graphicData>
+            </a:graphic>
+          </wp:inline>
+        </w:drawing>
+      </w:r>
+    </w:p>
+    <w:p>
+      <w:pPr>
+        <w:numPr>
+          <w:ilvl w:val="0"/>
+          <w:numId w:val="1001"/>
+        </w:numPr>
+      </w:pPr>
+      <w:r>
+        <w:rPr>
+          <w:b/>
+          <w:bCs/>
+        </w:rPr>
+        <w:t xml:space="preserve">Escenario</w:t>
+      </w:r>
+      <w:r>
+        <w:br/>
+      </w:r>
+      <w:r>
+        <w:t xml:space="preserve">El líder de un programa de adopción de mascotas encuestó a 550 personas para conocer qué animal les interesaría adoptar. Del total de encuestados, el 30% adoptaría un vaca, el 15% adoptaría un(a) loro y el 55% adoptaría un(a) hamster.</w:t>
+      </w:r>
+    </w:p>
+    <w:p>
+      <w:pPr>
+        <w:numPr>
+          <w:ilvl w:val="0"/>
+          <w:numId w:val="1000"/>
+        </w:numPr>
+      </w:pPr>
+      <w:r>
+        <w:t xml:space="preserve">¿Cuál de las siguientes representaciones muestra correctamente la información recolectada en la encuesta?</w:t>
+      </w:r>
+      <w:r>
+        <w:br/>
+      </w:r>
+    </w:p>
+    <w:p>
+      <w:pPr>
+        <w:numPr>
+          <w:ilvl w:val="1"/>
+          <w:numId w:val="1005"/>
+        </w:numPr>
+      </w:pPr>
+      <w:r>
+        <w:drawing>
+          <wp:inline>
+            <wp:extent cx="3657600" cy="2924175"/>
+            <wp:effectExtent b="0" l="0" r="0" t="0"/>
+            <wp:docPr descr="image" title="" id="81" name="Picture"/>
+            <a:graphic>
+              <a:graphicData uri="http://schemas.openxmlformats.org/drawingml/2006/picture">
+                <pic:pic>
+                  <pic:nvPicPr>
+                    <pic:cNvPr descr="media/supplements1/exercise4/Torta-5.svg" id="82" name="Picture"/>
+                    <pic:cNvPicPr>
+                      <a:picLocks noChangeArrowheads="1" noChangeAspect="1"/>
+                    </pic:cNvPicPr>
+                  </pic:nvPicPr>
+                  <pic:blipFill>
+                    <a:blip r:embed="rId83">
+                      <a:extLst>
+                        <a:ext uri="{28A0092B-C50C-407E-A947-70E740481C1C}">
+                          <a14:useLocalDpi xmlns:a14="http://schemas.microsoft.com/office/drawing/2010/main" val="0"/>
+                        </a:ext>
+                        <a:ext uri="{96DAC541-7B7A-43D3-8B79-37D633B846F1}">
+                          <asvg:svgBlip xmlns:asvg="http://schemas.microsoft.com/office/drawing/2016/SVG/main" r:embed="rId80"/>
+                        </a:ext>
+                      </a:extLst>
+                    </a:blip>
+                    <a:stretch>
+                      <a:fillRect/>
+                    </a:stretch>
+                  </pic:blipFill>
+                  <pic:spPr bwMode="auto">
+                    <a:xfrm>
+                      <a:off x="0" y="0"/>
+                      <a:ext cx="3657600" cy="2924175"/>
+                    </a:xfrm>
+                    <a:prstGeom prst="rect">
+                      <a:avLst/>
+                    </a:prstGeom>
+                    <a:noFill/>
+                    <a:ln w="9525">
+                      <a:noFill/>
+                      <a:headEnd/>
+                      <a:tailEnd/>
+                    </a:ln>
+                  </pic:spPr>
+                </pic:pic>
+              </a:graphicData>
+            </a:graphic>
+          </wp:inline>
+        </w:drawing>
+      </w:r>
+    </w:p>
+    <w:p>
+      <w:pPr>
+        <w:numPr>
+          <w:ilvl w:val="1"/>
+          <w:numId w:val="1005"/>
+        </w:numPr>
+      </w:pPr>
+      <w:r>
+        <w:drawing>
+          <wp:inline>
+            <wp:extent cx="3657600" cy="2924175"/>
+            <wp:effectExtent b="0" l="0" r="0" t="0"/>
+            <wp:docPr descr="image" title="" id="85" name="Picture"/>
+            <a:graphic>
+              <a:graphicData uri="http://schemas.openxmlformats.org/drawingml/2006/picture">
+                <pic:pic>
+                  <pic:nvPicPr>
+                    <pic:cNvPr descr="media/supplements1/exercise4/BarraVertical-1.svg" id="86" name="Picture"/>
+                    <pic:cNvPicPr>
+                      <a:picLocks noChangeArrowheads="1" noChangeAspect="1"/>
+                    </pic:cNvPicPr>
+                  </pic:nvPicPr>
+                  <pic:blipFill>
+                    <a:blip r:embed="rId87">
+                      <a:extLst>
+                        <a:ext uri="{28A0092B-C50C-407E-A947-70E740481C1C}">
+                          <a14:useLocalDpi xmlns:a14="http://schemas.microsoft.com/office/drawing/2010/main" val="0"/>
+                        </a:ext>
+                        <a:ext uri="{96DAC541-7B7A-43D3-8B79-37D633B846F1}">
+                          <asvg:svgBlip xmlns:asvg="http://schemas.microsoft.com/office/drawing/2016/SVG/main" r:embed="rId84"/>
+                        </a:ext>
+                      </a:extLst>
+                    </a:blip>
+                    <a:stretch>
+                      <a:fillRect/>
+                    </a:stretch>
+                  </pic:blipFill>
+                  <pic:spPr bwMode="auto">
+                    <a:xfrm>
+                      <a:off x="0" y="0"/>
+                      <a:ext cx="3657600" cy="2924175"/>
+                    </a:xfrm>
+                    <a:prstGeom prst="rect">
+                      <a:avLst/>
+                    </a:prstGeom>
+                    <a:noFill/>
+                    <a:ln w="9525">
+                      <a:noFill/>
+                      <a:headEnd/>
+                      <a:tailEnd/>
+                    </a:ln>
+                  </pic:spPr>
+                </pic:pic>
+              </a:graphicData>
+            </a:graphic>
+          </wp:inline>
+        </w:drawing>
+      </w:r>
+    </w:p>
+    <w:p>
+      <w:pPr>
+        <w:numPr>
+          <w:ilvl w:val="1"/>
+          <w:numId w:val="1005"/>
+        </w:numPr>
+      </w:pPr>
+      <w:r>
+        <w:drawing>
+          <wp:inline>
+            <wp:extent cx="3467100" cy="3200400"/>
+            <wp:effectExtent b="0" l="0" r="0" t="0"/>
+            <wp:docPr descr="image" title="" id="89" name="Picture"/>
+            <a:graphic>
+              <a:graphicData uri="http://schemas.openxmlformats.org/drawingml/2006/picture">
+                <pic:pic>
+                  <pic:nvPicPr>
+                    <pic:cNvPr descr="media/supplements1/exercise4/BarraHorizontal-3.svg" id="90" name="Picture"/>
+                    <pic:cNvPicPr>
+                      <a:picLocks noChangeArrowheads="1" noChangeAspect="1"/>
+                    </pic:cNvPicPr>
+                  </pic:nvPicPr>
+                  <pic:blipFill>
+                    <a:blip r:embed="rId91">
+                      <a:extLst>
+                        <a:ext uri="{28A0092B-C50C-407E-A947-70E740481C1C}">
+                          <a14:useLocalDpi xmlns:a14="http://schemas.microsoft.com/office/drawing/2010/main" val="0"/>
+                        </a:ext>
+                        <a:ext uri="{96DAC541-7B7A-43D3-8B79-37D633B846F1}">
+                          <asvg:svgBlip xmlns:asvg="http://schemas.microsoft.com/office/drawing/2016/SVG/main" r:embed="rId88"/>
+                        </a:ext>
+                      </a:extLst>
+                    </a:blip>
+                    <a:stretch>
+                      <a:fillRect/>
+                    </a:stretch>
+                  </pic:blipFill>
+                  <pic:spPr bwMode="auto">
+                    <a:xfrm>
+                      <a:off x="0" y="0"/>
+                      <a:ext cx="3467100" cy="3200400"/>
+                    </a:xfrm>
+                    <a:prstGeom prst="rect">
+                      <a:avLst/>
+                    </a:prstGeom>
+                    <a:noFill/>
+                    <a:ln w="9525">
+                      <a:noFill/>
+                      <a:headEnd/>
+                      <a:tailEnd/>
+                    </a:ln>
+                  </pic:spPr>
+                </pic:pic>
+              </a:graphicData>
+            </a:graphic>
+          </wp:inline>
+        </w:drawing>
+      </w:r>
+    </w:p>
+    <w:p>
+      <w:pPr>
+        <w:numPr>
+          <w:ilvl w:val="1"/>
+          <w:numId w:val="1005"/>
+        </w:numPr>
+      </w:pPr>
+      <w:r>
+        <w:drawing>
+          <wp:inline>
+            <wp:extent cx="1439999" cy="866548"/>
+            <wp:effectExtent b="0" l="0" r="0" t="0"/>
+            <wp:docPr descr="image" title="" id="93" name="Picture"/>
+            <a:graphic>
+              <a:graphicData uri="http://schemas.openxmlformats.org/drawingml/2006/picture">
+                <pic:pic>
+                  <pic:nvPicPr>
+                    <pic:cNvPr descr="media/supplements1/exercise4/image01.svg" id="94" name="Picture"/>
+                    <pic:cNvPicPr>
+                      <a:picLocks noChangeArrowheads="1" noChangeAspect="1"/>
+                    </pic:cNvPicPr>
+                  </pic:nvPicPr>
+                  <pic:blipFill>
+                    <a:blip r:embed="rId95">
+                      <a:extLst>
+                        <a:ext uri="{28A0092B-C50C-407E-A947-70E740481C1C}">
+                          <a14:useLocalDpi xmlns:a14="http://schemas.microsoft.com/office/drawing/2010/main" val="0"/>
+                        </a:ext>
+                        <a:ext uri="{96DAC541-7B7A-43D3-8B79-37D633B846F1}">
+                          <asvg:svgBlip xmlns:asvg="http://schemas.microsoft.com/office/drawing/2016/SVG/main" r:embed="rId92"/>
+                        </a:ext>
+                      </a:extLst>
+                    </a:blip>
+                    <a:stretch>
+                      <a:fillRect/>
+                    </a:stretch>
+                  </pic:blipFill>
+                  <pic:spPr bwMode="auto">
+                    <a:xfrm>
+                      <a:off x="0" y="0"/>
+                      <a:ext cx="1439999" cy="866548"/>
+                    </a:xfrm>
+                    <a:prstGeom prst="rect">
+                      <a:avLst/>
+                    </a:prstGeom>
+                    <a:noFill/>
+                    <a:ln w="9525">
+                      <a:noFill/>
+                      <a:headEnd/>
+                      <a:tailEnd/>
+                    </a:ln>
+                  </pic:spPr>
+                </pic:pic>
+              </a:graphicData>
+            </a:graphic>
+          </wp:inline>
+        </w:drawing>
+      </w:r>
+    </w:p>
+    <w:p>
+      <w:pPr>
+        <w:numPr>
+          <w:ilvl w:val="0"/>
+          <w:numId w:val="1000"/>
+        </w:numPr>
+      </w:pPr>
+      <w:r>
+        <w:rPr>
+          <w:b/>
+          <w:bCs/>
+        </w:rPr>
+        <w:t xml:space="preserve">Retroalimentación</w:t>
+      </w:r>
+      <w:r>
+        <w:br/>
+      </w:r>
+      <w:r>
+        <w:t xml:space="preserve">Esta tabla representa la información recolectada en la encuesta, mostrando el porcentaje de personas interesadas en adoptar cada tipo de mascota:</w:t>
+      </w:r>
+      <w:r>
+        <w:br/>
+      </w:r>
+      <w:r>
+        <w:drawing>
+          <wp:inline>
+            <wp:extent cx="1439999" cy="866548"/>
+            <wp:effectExtent b="0" l="0" r="0" t="0"/>
+            <wp:docPr descr="image" title="" id="97" name="Picture"/>
+            <a:graphic>
+              <a:graphicData uri="http://schemas.openxmlformats.org/drawingml/2006/picture">
+                <pic:pic>
+                  <pic:nvPicPr>
+                    <pic:cNvPr descr="media/supplements1/exercise4/image01_solution.svg" id="98" name="Picture"/>
+                    <pic:cNvPicPr>
+                      <a:picLocks noChangeArrowheads="1" noChangeAspect="1"/>
+                    </pic:cNvPicPr>
+                  </pic:nvPicPr>
+                  <pic:blipFill>
+                    <a:blip r:embed="rId99">
+                      <a:extLst>
+                        <a:ext uri="{28A0092B-C50C-407E-A947-70E740481C1C}">
+                          <a14:useLocalDpi xmlns:a14="http://schemas.microsoft.com/office/drawing/2010/main" val="0"/>
+                        </a:ext>
+                        <a:ext uri="{96DAC541-7B7A-43D3-8B79-37D633B846F1}">
+                          <asvg:svgBlip xmlns:asvg="http://schemas.microsoft.com/office/drawing/2016/SVG/main" r:embed="rId96"/>
+                        </a:ext>
+                      </a:extLst>
+                    </a:blip>
+                    <a:stretch>
+                      <a:fillRect/>
+                    </a:stretch>
+                  </pic:blipFill>
+                  <pic:spPr bwMode="auto">
+                    <a:xfrm>
+                      <a:off x="0" y="0"/>
+                      <a:ext cx="1439999" cy="866548"/>
+                    </a:xfrm>
+                    <a:prstGeom prst="rect">
+                      <a:avLst/>
+                    </a:prstGeom>
+                    <a:noFill/>
+                    <a:ln w="9525">
+                      <a:noFill/>
+                      <a:headEnd/>
+                      <a:tailEnd/>
+                    </a:ln>
+                  </pic:spPr>
+                </pic:pic>
+              </a:graphicData>
+            </a:graphic>
+          </wp:inline>
+        </w:drawing>
+      </w:r>
+    </w:p>
+    <w:p>
+      <w:pPr>
+        <w:numPr>
+          <w:ilvl w:val="0"/>
+          <w:numId w:val="1001"/>
+        </w:numPr>
+      </w:pPr>
+      <w:r>
+        <w:rPr>
+          <w:b/>
+          <w:bCs/>
+        </w:rPr>
+        <w:t xml:space="preserve">Escenario</w:t>
+      </w:r>
+      <w:r>
+        <w:br/>
+      </w:r>
+      <w:r>
+        <w:t xml:space="preserve">El líder de un programa de adopción de mascotas encuestó a 130 personas para conocer qué animal les interesaría adoptar. Del total de encuestados, el 60% adoptaría un ganso, el 25% adoptaría un(a) ratón y el 15% adoptaría un(a) pez.</w:t>
+      </w:r>
+    </w:p>
+    <w:p>
+      <w:pPr>
+        <w:numPr>
+          <w:ilvl w:val="0"/>
+          <w:numId w:val="1000"/>
+        </w:numPr>
+      </w:pPr>
+      <w:r>
+        <w:t xml:space="preserve">¿Cuál de las siguientes representaciones muestra correctamente la información recolectada en la encuesta?</w:t>
+      </w:r>
+      <w:r>
+        <w:br/>
+      </w:r>
+    </w:p>
+    <w:p>
+      <w:pPr>
+        <w:numPr>
+          <w:ilvl w:val="1"/>
+          <w:numId w:val="1006"/>
+        </w:numPr>
+      </w:pPr>
+      <w:r>
+        <w:drawing>
+          <wp:inline>
+            <wp:extent cx="1439999" cy="890181"/>
+            <wp:effectExtent b="0" l="0" r="0" t="0"/>
+            <wp:docPr descr="image" title="" id="101" name="Picture"/>
+            <a:graphic>
+              <a:graphicData uri="http://schemas.openxmlformats.org/drawingml/2006/picture">
+                <pic:pic>
+                  <pic:nvPicPr>
+                    <pic:cNvPr descr="media/supplements1/exercise5/image01.svg" id="102" name="Picture"/>
+                    <pic:cNvPicPr>
+                      <a:picLocks noChangeArrowheads="1" noChangeAspect="1"/>
+                    </pic:cNvPicPr>
+                  </pic:nvPicPr>
+                  <pic:blipFill>
+                    <a:blip r:embed="rId103">
+                      <a:extLst>
+                        <a:ext uri="{28A0092B-C50C-407E-A947-70E740481C1C}">
+                          <a14:useLocalDpi xmlns:a14="http://schemas.microsoft.com/office/drawing/2010/main" val="0"/>
+                        </a:ext>
+                        <a:ext uri="{96DAC541-7B7A-43D3-8B79-37D633B846F1}">
+                          <asvg:svgBlip xmlns:asvg="http://schemas.microsoft.com/office/drawing/2016/SVG/main" r:embed="rId100"/>
+                        </a:ext>
+                      </a:extLst>
+                    </a:blip>
+                    <a:stretch>
+                      <a:fillRect/>
+                    </a:stretch>
+                  </pic:blipFill>
+                  <pic:spPr bwMode="auto">
+                    <a:xfrm>
+                      <a:off x="0" y="0"/>
+                      <a:ext cx="1439999" cy="890181"/>
+                    </a:xfrm>
+                    <a:prstGeom prst="rect">
+                      <a:avLst/>
+                    </a:prstGeom>
+                    <a:noFill/>
+                    <a:ln w="9525">
+                      <a:noFill/>
+                      <a:headEnd/>
+                      <a:tailEnd/>
+                    </a:ln>
+                  </pic:spPr>
+                </pic:pic>
+              </a:graphicData>
+            </a:graphic>
+          </wp:inline>
+        </w:drawing>
+      </w:r>
+    </w:p>
+    <w:p>
+      <w:pPr>
+        <w:numPr>
+          <w:ilvl w:val="1"/>
+          <w:numId w:val="1006"/>
+        </w:numPr>
+      </w:pPr>
+      <w:r>
+        <w:drawing>
+          <wp:inline>
+            <wp:extent cx="3467100" cy="3200400"/>
+            <wp:effectExtent b="0" l="0" r="0" t="0"/>
+            <wp:docPr descr="image" title="" id="105" name="Picture"/>
+            <a:graphic>
+              <a:graphicData uri="http://schemas.openxmlformats.org/drawingml/2006/picture">
+                <pic:pic>
+                  <pic:nvPicPr>
+                    <pic:cNvPr descr="media/supplements1/exercise5/BarraHorizontal-3.svg" id="106" name="Picture"/>
+                    <pic:cNvPicPr>
+                      <a:picLocks noChangeArrowheads="1" noChangeAspect="1"/>
+                    </pic:cNvPicPr>
+                  </pic:nvPicPr>
+                  <pic:blipFill>
+                    <a:blip r:embed="rId107">
+                      <a:extLst>
+                        <a:ext uri="{28A0092B-C50C-407E-A947-70E740481C1C}">
+                          <a14:useLocalDpi xmlns:a14="http://schemas.microsoft.com/office/drawing/2010/main" val="0"/>
+                        </a:ext>
+                        <a:ext uri="{96DAC541-7B7A-43D3-8B79-37D633B846F1}">
+                          <asvg:svgBlip xmlns:asvg="http://schemas.microsoft.com/office/drawing/2016/SVG/main" r:embed="rId104"/>
+                        </a:ext>
+                      </a:extLst>
+                    </a:blip>
+                    <a:stretch>
+                      <a:fillRect/>
+                    </a:stretch>
+                  </pic:blipFill>
+                  <pic:spPr bwMode="auto">
+                    <a:xfrm>
+                      <a:off x="0" y="0"/>
+                      <a:ext cx="3467100" cy="3200400"/>
+                    </a:xfrm>
+                    <a:prstGeom prst="rect">
+                      <a:avLst/>
+                    </a:prstGeom>
+                    <a:noFill/>
+                    <a:ln w="9525">
+                      <a:noFill/>
+                      <a:headEnd/>
+                      <a:tailEnd/>
+                    </a:ln>
+                  </pic:spPr>
+                </pic:pic>
+              </a:graphicData>
+            </a:graphic>
+          </wp:inline>
+        </w:drawing>
+      </w:r>
+    </w:p>
+    <w:p>
+      <w:pPr>
+        <w:numPr>
+          <w:ilvl w:val="1"/>
+          <w:numId w:val="1006"/>
+        </w:numPr>
+      </w:pPr>
+      <w:r>
+        <w:drawing>
+          <wp:inline>
+            <wp:extent cx="3657600" cy="2924175"/>
+            <wp:effectExtent b="0" l="0" r="0" t="0"/>
+            <wp:docPr descr="image" title="" id="109" name="Picture"/>
+            <a:graphic>
+              <a:graphicData uri="http://schemas.openxmlformats.org/drawingml/2006/picture">
+                <pic:pic>
+                  <pic:nvPicPr>
+                    <pic:cNvPr descr="media/supplements1/exercise5/BarraVertical-1.svg" id="110" name="Picture"/>
+                    <pic:cNvPicPr>
+                      <a:picLocks noChangeArrowheads="1" noChangeAspect="1"/>
+                    </pic:cNvPicPr>
+                  </pic:nvPicPr>
+                  <pic:blipFill>
+                    <a:blip r:embed="rId111">
+                      <a:extLst>
+                        <a:ext uri="{28A0092B-C50C-407E-A947-70E740481C1C}">
+                          <a14:useLocalDpi xmlns:a14="http://schemas.microsoft.com/office/drawing/2010/main" val="0"/>
+                        </a:ext>
+                        <a:ext uri="{96DAC541-7B7A-43D3-8B79-37D633B846F1}">
+                          <asvg:svgBlip xmlns:asvg="http://schemas.microsoft.com/office/drawing/2016/SVG/main" r:embed="rId108"/>
+                        </a:ext>
+                      </a:extLst>
+                    </a:blip>
+                    <a:stretch>
+                      <a:fillRect/>
+                    </a:stretch>
+                  </pic:blipFill>
+                  <pic:spPr bwMode="auto">
+                    <a:xfrm>
+                      <a:off x="0" y="0"/>
+                      <a:ext cx="3657600" cy="2924175"/>
+                    </a:xfrm>
+                    <a:prstGeom prst="rect">
+                      <a:avLst/>
+                    </a:prstGeom>
+                    <a:noFill/>
+                    <a:ln w="9525">
+                      <a:noFill/>
+                      <a:headEnd/>
+                      <a:tailEnd/>
+                    </a:ln>
+                  </pic:spPr>
+                </pic:pic>
+              </a:graphicData>
+            </a:graphic>
+          </wp:inline>
+        </w:drawing>
+      </w:r>
+    </w:p>
+    <w:p>
+      <w:pPr>
+        <w:numPr>
+          <w:ilvl w:val="1"/>
+          <w:numId w:val="1006"/>
+        </w:numPr>
+      </w:pPr>
+      <w:r>
+        <w:drawing>
+          <wp:inline>
+            <wp:extent cx="3657600" cy="2924175"/>
+            <wp:effectExtent b="0" l="0" r="0" t="0"/>
+            <wp:docPr descr="image" title="" id="113" name="Picture"/>
+            <a:graphic>
+              <a:graphicData uri="http://schemas.openxmlformats.org/drawingml/2006/picture">
+                <pic:pic>
+                  <pic:nvPicPr>
+                    <pic:cNvPr descr="media/supplements1/exercise5/Torta-5.svg" id="114" name="Picture"/>
+                    <pic:cNvPicPr>
+                      <a:picLocks noChangeArrowheads="1" noChangeAspect="1"/>
+                    </pic:cNvPicPr>
+                  </pic:nvPicPr>
+                  <pic:blipFill>
+                    <a:blip r:embed="rId115">
+                      <a:extLst>
+                        <a:ext uri="{28A0092B-C50C-407E-A947-70E740481C1C}">
+                          <a14:useLocalDpi xmlns:a14="http://schemas.microsoft.com/office/drawing/2010/main" val="0"/>
+                        </a:ext>
+                        <a:ext uri="{96DAC541-7B7A-43D3-8B79-37D633B846F1}">
+                          <asvg:svgBlip xmlns:asvg="http://schemas.microsoft.com/office/drawing/2016/SVG/main" r:embed="rId112"/>
+                        </a:ext>
+                      </a:extLst>
+                    </a:blip>
+                    <a:stretch>
+                      <a:fillRect/>
+                    </a:stretch>
+                  </pic:blipFill>
+                  <pic:spPr bwMode="auto">
+                    <a:xfrm>
+                      <a:off x="0" y="0"/>
+                      <a:ext cx="3657600" cy="2924175"/>
+                    </a:xfrm>
+                    <a:prstGeom prst="rect">
+                      <a:avLst/>
+                    </a:prstGeom>
+                    <a:noFill/>
+                    <a:ln w="9525">
+                      <a:noFill/>
+                      <a:headEnd/>
+                      <a:tailEnd/>
+                    </a:ln>
+                  </pic:spPr>
+                </pic:pic>
+              </a:graphicData>
+            </a:graphic>
+          </wp:inline>
+        </w:drawing>
+      </w:r>
+    </w:p>
+    <w:p>
+      <w:pPr>
+        <w:numPr>
+          <w:ilvl w:val="0"/>
+          <w:numId w:val="1000"/>
+        </w:numPr>
+      </w:pPr>
+      <w:r>
+        <w:rPr>
+          <w:b/>
+          <w:bCs/>
+        </w:rPr>
+        <w:t xml:space="preserve">Retroalimentación</w:t>
+      </w:r>
+      <w:r>
+        <w:br/>
+      </w:r>
+      <w:r>
+        <w:t xml:space="preserve">Esta tabla representa la información recolectada en la encuesta, mostrando el porcentaje de personas interesadas en adoptar cada tipo de mascota:</w:t>
+      </w:r>
+      <w:r>
+        <w:br/>
+      </w:r>
+      <w:r>
+        <w:drawing>
+          <wp:inline>
+            <wp:extent cx="1439999" cy="890181"/>
+            <wp:effectExtent b="0" l="0" r="0" t="0"/>
+            <wp:docPr descr="image" title="" id="117" name="Picture"/>
+            <a:graphic>
+              <a:graphicData uri="http://schemas.openxmlformats.org/drawingml/2006/picture">
+                <pic:pic>
+                  <pic:nvPicPr>
+                    <pic:cNvPr descr="media/supplements1/exercise5/image01_solution.svg" id="118" name="Picture"/>
+                    <pic:cNvPicPr>
+                      <a:picLocks noChangeArrowheads="1" noChangeAspect="1"/>
+                    </pic:cNvPicPr>
+                  </pic:nvPicPr>
+                  <pic:blipFill>
+                    <a:blip r:embed="rId119">
+                      <a:extLst>
+                        <a:ext uri="{28A0092B-C50C-407E-A947-70E740481C1C}">
+                          <a14:useLocalDpi xmlns:a14="http://schemas.microsoft.com/office/drawing/2010/main" val="0"/>
+                        </a:ext>
+                        <a:ext uri="{96DAC541-7B7A-43D3-8B79-37D633B846F1}">
+                          <asvg:svgBlip xmlns:asvg="http://schemas.microsoft.com/office/drawing/2016/SVG/main" r:embed="rId116"/>
+                        </a:ext>
+                      </a:extLst>
+                    </a:blip>
+                    <a:stretch>
+                      <a:fillRect/>
+                    </a:stretch>
+                  </pic:blipFill>
+                  <pic:spPr bwMode="auto">
+                    <a:xfrm>
+                      <a:off x="0" y="0"/>
+                      <a:ext cx="1439999" cy="890181"/>
+                    </a:xfrm>
+                    <a:prstGeom prst="rect">
+                      <a:avLst/>
+                    </a:prstGeom>
+                    <a:noFill/>
+                    <a:ln w="9525">
+                      <a:noFill/>
+                      <a:headEnd/>
+                      <a:tailEnd/>
+                    </a:ln>
+                  </pic:spPr>
+                </pic:pic>
+              </a:graphicData>
+            </a:graphic>
+          </wp:inline>
+        </w:drawing>
+      </w:r>
+    </w:p>
+    <w:p>
+      <w:pPr>
+        <w:numPr>
+          <w:ilvl w:val="0"/>
+          <w:numId w:val="1001"/>
+        </w:numPr>
+      </w:pPr>
+      <w:r>
+        <w:rPr>
+          <w:b/>
+          <w:bCs/>
+        </w:rPr>
+        <w:t xml:space="preserve">Escenario</w:t>
+      </w:r>
+      <w:r>
+        <w:br/>
+      </w:r>
+      <w:r>
+        <w:t xml:space="preserve">El líder de un programa de adopción de mascotas encuestó a 320 personas para conocer qué animal les interesaría adoptar. Del total de encuestados, el 60% adoptaría un perro, el 35% adoptaría un(a) cerdo y el 5% adoptaría un(a) ternero.</w:t>
+      </w:r>
+    </w:p>
+    <w:p>
+      <w:pPr>
+        <w:numPr>
+          <w:ilvl w:val="0"/>
+          <w:numId w:val="1000"/>
+        </w:numPr>
+      </w:pPr>
+      <w:r>
+        <w:t xml:space="preserve">¿Cuál de las siguientes representaciones muestra correctamente la información recolectada en la encuesta?</w:t>
+      </w:r>
+      <w:r>
+        <w:br/>
+      </w:r>
+    </w:p>
+    <w:p>
+      <w:pPr>
+        <w:numPr>
+          <w:ilvl w:val="1"/>
+          <w:numId w:val="1007"/>
+        </w:numPr>
+      </w:pPr>
+      <w:r>
+        <w:drawing>
+          <wp:inline>
+            <wp:extent cx="1439999" cy="890181"/>
+            <wp:effectExtent b="0" l="0" r="0" t="0"/>
+            <wp:docPr descr="image" title="" id="121" name="Picture"/>
+            <a:graphic>
+              <a:graphicData uri="http://schemas.openxmlformats.org/drawingml/2006/picture">
+                <pic:pic>
+                  <pic:nvPicPr>
+                    <pic:cNvPr descr="media/supplements1/exercise6/image01.svg" id="122" name="Picture"/>
+                    <pic:cNvPicPr>
+                      <a:picLocks noChangeArrowheads="1" noChangeAspect="1"/>
+                    </pic:cNvPicPr>
+                  </pic:nvPicPr>
+                  <pic:blipFill>
+                    <a:blip r:embed="rId123">
+                      <a:extLst>
+                        <a:ext uri="{28A0092B-C50C-407E-A947-70E740481C1C}">
+                          <a14:useLocalDpi xmlns:a14="http://schemas.microsoft.com/office/drawing/2010/main" val="0"/>
+                        </a:ext>
+                        <a:ext uri="{96DAC541-7B7A-43D3-8B79-37D633B846F1}">
+                          <asvg:svgBlip xmlns:asvg="http://schemas.microsoft.com/office/drawing/2016/SVG/main" r:embed="rId120"/>
+                        </a:ext>
+                      </a:extLst>
+                    </a:blip>
+                    <a:stretch>
+                      <a:fillRect/>
+                    </a:stretch>
+                  </pic:blipFill>
+                  <pic:spPr bwMode="auto">
+                    <a:xfrm>
+                      <a:off x="0" y="0"/>
+                      <a:ext cx="1439999" cy="890181"/>
+                    </a:xfrm>
+                    <a:prstGeom prst="rect">
+                      <a:avLst/>
+                    </a:prstGeom>
+                    <a:noFill/>
+                    <a:ln w="9525">
+                      <a:noFill/>
+                      <a:headEnd/>
+                      <a:tailEnd/>
+                    </a:ln>
+                  </pic:spPr>
+                </pic:pic>
+              </a:graphicData>
+            </a:graphic>
+          </wp:inline>
+        </w:drawing>
+      </w:r>
+    </w:p>
+    <w:p>
+      <w:pPr>
+        <w:numPr>
+          <w:ilvl w:val="1"/>
+          <w:numId w:val="1007"/>
+        </w:numPr>
+      </w:pPr>
+      <w:r>
+        <w:drawing>
+          <wp:inline>
+            <wp:extent cx="3657600" cy="2924175"/>
+            <wp:effectExtent b="0" l="0" r="0" t="0"/>
+            <wp:docPr descr="image" title="" id="125" name="Picture"/>
+            <a:graphic>
+              <a:graphicData uri="http://schemas.openxmlformats.org/drawingml/2006/picture">
+                <pic:pic>
+                  <pic:nvPicPr>
+                    <pic:cNvPr descr="media/supplements1/exercise6/BarraVertical-1.svg" id="126" name="Picture"/>
+                    <pic:cNvPicPr>
+                      <a:picLocks noChangeArrowheads="1" noChangeAspect="1"/>
+                    </pic:cNvPicPr>
+                  </pic:nvPicPr>
+                  <pic:blipFill>
+                    <a:blip r:embed="rId127">
+                      <a:extLst>
+                        <a:ext uri="{28A0092B-C50C-407E-A947-70E740481C1C}">
+                          <a14:useLocalDpi xmlns:a14="http://schemas.microsoft.com/office/drawing/2010/main" val="0"/>
+                        </a:ext>
+                        <a:ext uri="{96DAC541-7B7A-43D3-8B79-37D633B846F1}">
+                          <asvg:svgBlip xmlns:asvg="http://schemas.microsoft.com/office/drawing/2016/SVG/main" r:embed="rId124"/>
+                        </a:ext>
+                      </a:extLst>
+                    </a:blip>
+                    <a:stretch>
+                      <a:fillRect/>
+                    </a:stretch>
+                  </pic:blipFill>
+                  <pic:spPr bwMode="auto">
+                    <a:xfrm>
+                      <a:off x="0" y="0"/>
+                      <a:ext cx="3657600" cy="2924175"/>
+                    </a:xfrm>
+                    <a:prstGeom prst="rect">
+                      <a:avLst/>
+                    </a:prstGeom>
+                    <a:noFill/>
+                    <a:ln w="9525">
+                      <a:noFill/>
+                      <a:headEnd/>
+                      <a:tailEnd/>
+                    </a:ln>
+                  </pic:spPr>
+                </pic:pic>
+              </a:graphicData>
+            </a:graphic>
+          </wp:inline>
+        </w:drawing>
+      </w:r>
+    </w:p>
+    <w:p>
+      <w:pPr>
+        <w:numPr>
+          <w:ilvl w:val="1"/>
+          <w:numId w:val="1007"/>
+        </w:numPr>
+      </w:pPr>
+      <w:r>
+        <w:drawing>
+          <wp:inline>
+            <wp:extent cx="3467100" cy="3200400"/>
+            <wp:effectExtent b="0" l="0" r="0" t="0"/>
+            <wp:docPr descr="image" title="" id="129" name="Picture"/>
+            <a:graphic>
+              <a:graphicData uri="http://schemas.openxmlformats.org/drawingml/2006/picture">
+                <pic:pic>
+                  <pic:nvPicPr>
+                    <pic:cNvPr descr="media/supplements1/exercise6/BarraHorizontal-3.svg" id="130" name="Picture"/>
+                    <pic:cNvPicPr>
+                      <a:picLocks noChangeArrowheads="1" noChangeAspect="1"/>
+                    </pic:cNvPicPr>
+                  </pic:nvPicPr>
+                  <pic:blipFill>
+                    <a:blip r:embed="rId131">
+                      <a:extLst>
+                        <a:ext uri="{28A0092B-C50C-407E-A947-70E740481C1C}">
+                          <a14:useLocalDpi xmlns:a14="http://schemas.microsoft.com/office/drawing/2010/main" val="0"/>
+                        </a:ext>
+                        <a:ext uri="{96DAC541-7B7A-43D3-8B79-37D633B846F1}">
+                          <asvg:svgBlip xmlns:asvg="http://schemas.microsoft.com/office/drawing/2016/SVG/main" r:embed="rId128"/>
+                        </a:ext>
+                      </a:extLst>
+                    </a:blip>
+                    <a:stretch>
+                      <a:fillRect/>
+                    </a:stretch>
+                  </pic:blipFill>
+                  <pic:spPr bwMode="auto">
+                    <a:xfrm>
+                      <a:off x="0" y="0"/>
+                      <a:ext cx="3467100" cy="3200400"/>
+                    </a:xfrm>
+                    <a:prstGeom prst="rect">
+                      <a:avLst/>
+                    </a:prstGeom>
+                    <a:noFill/>
+                    <a:ln w="9525">
+                      <a:noFill/>
+                      <a:headEnd/>
+                      <a:tailEnd/>
+                    </a:ln>
+                  </pic:spPr>
+                </pic:pic>
+              </a:graphicData>
+            </a:graphic>
+          </wp:inline>
+        </w:drawing>
+      </w:r>
+    </w:p>
+    <w:p>
+      <w:pPr>
+        <w:numPr>
+          <w:ilvl w:val="1"/>
+          <w:numId w:val="1007"/>
+        </w:numPr>
+      </w:pPr>
+      <w:r>
+        <w:drawing>
+          <wp:inline>
+            <wp:extent cx="3657600" cy="2924175"/>
+            <wp:effectExtent b="0" l="0" r="0" t="0"/>
+            <wp:docPr descr="image" title="" id="133" name="Picture"/>
+            <a:graphic>
+              <a:graphicData uri="http://schemas.openxmlformats.org/drawingml/2006/picture">
+                <pic:pic>
+                  <pic:nvPicPr>
+                    <pic:cNvPr descr="media/supplements1/exercise6/Torta-5.svg" id="134" name="Picture"/>
+                    <pic:cNvPicPr>
+                      <a:picLocks noChangeArrowheads="1" noChangeAspect="1"/>
+                    </pic:cNvPicPr>
+                  </pic:nvPicPr>
+                  <pic:blipFill>
+                    <a:blip r:embed="rId135">
+                      <a:extLst>
+                        <a:ext uri="{28A0092B-C50C-407E-A947-70E740481C1C}">
+                          <a14:useLocalDpi xmlns:a14="http://schemas.microsoft.com/office/drawing/2010/main" val="0"/>
+                        </a:ext>
+                        <a:ext uri="{96DAC541-7B7A-43D3-8B79-37D633B846F1}">
+                          <asvg:svgBlip xmlns:asvg="http://schemas.microsoft.com/office/drawing/2016/SVG/main" r:embed="rId132"/>
+                        </a:ext>
+                      </a:extLst>
+                    </a:blip>
+                    <a:stretch>
+                      <a:fillRect/>
+                    </a:stretch>
+                  </pic:blipFill>
+                  <pic:spPr bwMode="auto">
+                    <a:xfrm>
+                      <a:off x="0" y="0"/>
+                      <a:ext cx="3657600" cy="2924175"/>
+                    </a:xfrm>
+                    <a:prstGeom prst="rect">
+                      <a:avLst/>
+                    </a:prstGeom>
+                    <a:noFill/>
+                    <a:ln w="9525">
+                      <a:noFill/>
+                      <a:headEnd/>
+                      <a:tailEnd/>
+                    </a:ln>
+                  </pic:spPr>
+                </pic:pic>
+              </a:graphicData>
+            </a:graphic>
+          </wp:inline>
+        </w:drawing>
+      </w:r>
+    </w:p>
+    <w:p>
+      <w:pPr>
+        <w:numPr>
+          <w:ilvl w:val="0"/>
+          <w:numId w:val="1000"/>
+        </w:numPr>
+      </w:pPr>
+      <w:r>
+        <w:rPr>
+          <w:b/>
+          <w:bCs/>
+        </w:rPr>
+        <w:t xml:space="preserve">Retroalimentación</w:t>
+      </w:r>
+      <w:r>
+        <w:br/>
+      </w:r>
+      <w:r>
+        <w:t xml:space="preserve">Esta tabla representa la información recolectada en la encuesta, mostrando el porcentaje de personas interesadas en adoptar cada tipo de mascota:</w:t>
+      </w:r>
+      <w:r>
+        <w:br/>
+      </w:r>
+      <w:r>
+        <w:drawing>
+          <wp:inline>
+            <wp:extent cx="1439999" cy="890181"/>
+            <wp:effectExtent b="0" l="0" r="0" t="0"/>
+            <wp:docPr descr="image" title="" id="137" name="Picture"/>
+            <a:graphic>
+              <a:graphicData uri="http://schemas.openxmlformats.org/drawingml/2006/picture">
+                <pic:pic>
+                  <pic:nvPicPr>
+                    <pic:cNvPr descr="media/supplements1/exercise6/image01_solution.svg" id="138" name="Picture"/>
+                    <pic:cNvPicPr>
+                      <a:picLocks noChangeArrowheads="1" noChangeAspect="1"/>
+                    </pic:cNvPicPr>
+                  </pic:nvPicPr>
+                  <pic:blipFill>
+                    <a:blip r:embed="rId139">
+                      <a:extLst>
+                        <a:ext uri="{28A0092B-C50C-407E-A947-70E740481C1C}">
+                          <a14:useLocalDpi xmlns:a14="http://schemas.microsoft.com/office/drawing/2010/main" val="0"/>
+                        </a:ext>
+                        <a:ext uri="{96DAC541-7B7A-43D3-8B79-37D633B846F1}">
+                          <asvg:svgBlip xmlns:asvg="http://schemas.microsoft.com/office/drawing/2016/SVG/main" r:embed="rId136"/>
+                        </a:ext>
+                      </a:extLst>
+                    </a:blip>
+                    <a:stretch>
+                      <a:fillRect/>
+                    </a:stretch>
+                  </pic:blipFill>
+                  <pic:spPr bwMode="auto">
+                    <a:xfrm>
+                      <a:off x="0" y="0"/>
+                      <a:ext cx="1439999" cy="890181"/>
+                    </a:xfrm>
+                    <a:prstGeom prst="rect">
+                      <a:avLst/>
+                    </a:prstGeom>
+                    <a:noFill/>
+                    <a:ln w="9525">
+                      <a:noFill/>
+                      <a:headEnd/>
+                      <a:tailEnd/>
+                    </a:ln>
+                  </pic:spPr>
+                </pic:pic>
+              </a:graphicData>
+            </a:graphic>
+          </wp:inline>
+        </w:drawing>
+      </w:r>
+    </w:p>
+    <w:p>
+      <w:pPr>
+        <w:numPr>
+          <w:ilvl w:val="0"/>
+          <w:numId w:val="1001"/>
+        </w:numPr>
+      </w:pPr>
+      <w:r>
+        <w:rPr>
+          <w:b/>
+          <w:bCs/>
+        </w:rPr>
+        <w:t xml:space="preserve">Escenario</w:t>
+      </w:r>
+      <w:r>
+        <w:br/>
+      </w:r>
+      <w:r>
+        <w:t xml:space="preserve">El líder de un programa de adopción de mascotas encuestó a 350 personas para conocer qué animal les interesaría adoptar. Del total de encuestados, el 25% adoptaría un hurón, el 20% adoptaría un(a) pavo y el 55% adoptaría un(a) serpiente.</w:t>
+      </w:r>
+    </w:p>
+    <w:p>
+      <w:pPr>
+        <w:numPr>
+          <w:ilvl w:val="0"/>
+          <w:numId w:val="1000"/>
+        </w:numPr>
+      </w:pPr>
+      <w:r>
+        <w:t xml:space="preserve">¿Cuál de las siguientes representaciones muestra correctamente la información recolectada en la encuesta?</w:t>
+      </w:r>
+      <w:r>
+        <w:br/>
+      </w:r>
+    </w:p>
+    <w:p>
+      <w:pPr>
+        <w:numPr>
+          <w:ilvl w:val="1"/>
+          <w:numId w:val="1008"/>
+        </w:numPr>
+      </w:pPr>
+      <w:r>
+        <w:drawing>
+          <wp:inline>
+            <wp:extent cx="3657600" cy="2924175"/>
+            <wp:effectExtent b="0" l="0" r="0" t="0"/>
+            <wp:docPr descr="image" title="" id="141" name="Picture"/>
+            <a:graphic>
+              <a:graphicData uri="http://schemas.openxmlformats.org/drawingml/2006/picture">
+                <pic:pic>
+                  <pic:nvPicPr>
+                    <pic:cNvPr descr="media/supplements1/exercise7/BarraVertical-1.svg" id="142" name="Picture"/>
+                    <pic:cNvPicPr>
+                      <a:picLocks noChangeArrowheads="1" noChangeAspect="1"/>
+                    </pic:cNvPicPr>
+                  </pic:nvPicPr>
+                  <pic:blipFill>
+                    <a:blip r:embed="rId143">
+                      <a:extLst>
+                        <a:ext uri="{28A0092B-C50C-407E-A947-70E740481C1C}">
+                          <a14:useLocalDpi xmlns:a14="http://schemas.microsoft.com/office/drawing/2010/main" val="0"/>
+                        </a:ext>
+                        <a:ext uri="{96DAC541-7B7A-43D3-8B79-37D633B846F1}">
+                          <asvg:svgBlip xmlns:asvg="http://schemas.microsoft.com/office/drawing/2016/SVG/main" r:embed="rId140"/>
+                        </a:ext>
+                      </a:extLst>
+                    </a:blip>
+                    <a:stretch>
+                      <a:fillRect/>
+                    </a:stretch>
+                  </pic:blipFill>
+                  <pic:spPr bwMode="auto">
+                    <a:xfrm>
+                      <a:off x="0" y="0"/>
+                      <a:ext cx="3657600" cy="2924175"/>
+                    </a:xfrm>
+                    <a:prstGeom prst="rect">
+                      <a:avLst/>
+                    </a:prstGeom>
+                    <a:noFill/>
+                    <a:ln w="9525">
+                      <a:noFill/>
+                      <a:headEnd/>
+                      <a:tailEnd/>
+                    </a:ln>
+                  </pic:spPr>
+                </pic:pic>
+              </a:graphicData>
+            </a:graphic>
+          </wp:inline>
+        </w:drawing>
+      </w:r>
+    </w:p>
+    <w:p>
+      <w:pPr>
+        <w:numPr>
+          <w:ilvl w:val="1"/>
+          <w:numId w:val="1008"/>
+        </w:numPr>
+      </w:pPr>
+      <w:r>
+        <w:drawing>
+          <wp:inline>
+            <wp:extent cx="1439999" cy="829830"/>
+            <wp:effectExtent b="0" l="0" r="0" t="0"/>
+            <wp:docPr descr="image" title="" id="145" name="Picture"/>
+            <a:graphic>
+              <a:graphicData uri="http://schemas.openxmlformats.org/drawingml/2006/picture">
+                <pic:pic>
+                  <pic:nvPicPr>
+                    <pic:cNvPr descr="media/supplements1/exercise7/image01.svg" id="146" name="Picture"/>
+                    <pic:cNvPicPr>
+                      <a:picLocks noChangeArrowheads="1" noChangeAspect="1"/>
+                    </pic:cNvPicPr>
+                  </pic:nvPicPr>
+                  <pic:blipFill>
+                    <a:blip r:embed="rId147">
+                      <a:extLst>
+                        <a:ext uri="{28A0092B-C50C-407E-A947-70E740481C1C}">
+                          <a14:useLocalDpi xmlns:a14="http://schemas.microsoft.com/office/drawing/2010/main" val="0"/>
+                        </a:ext>
+                        <a:ext uri="{96DAC541-7B7A-43D3-8B79-37D633B846F1}">
+                          <asvg:svgBlip xmlns:asvg="http://schemas.microsoft.com/office/drawing/2016/SVG/main" r:embed="rId144"/>
+                        </a:ext>
+                      </a:extLst>
+                    </a:blip>
+                    <a:stretch>
+                      <a:fillRect/>
+                    </a:stretch>
+                  </pic:blipFill>
+                  <pic:spPr bwMode="auto">
+                    <a:xfrm>
+                      <a:off x="0" y="0"/>
+                      <a:ext cx="1439999" cy="829830"/>
+                    </a:xfrm>
+                    <a:prstGeom prst="rect">
+                      <a:avLst/>
+                    </a:prstGeom>
+                    <a:noFill/>
+                    <a:ln w="9525">
+                      <a:noFill/>
+                      <a:headEnd/>
+                      <a:tailEnd/>
+                    </a:ln>
+                  </pic:spPr>
+                </pic:pic>
+              </a:graphicData>
+            </a:graphic>
+          </wp:inline>
+        </w:drawing>
+      </w:r>
+    </w:p>
+    <w:p>
+      <w:pPr>
+        <w:numPr>
+          <w:ilvl w:val="1"/>
+          <w:numId w:val="1008"/>
+        </w:numPr>
+      </w:pPr>
+      <w:r>
+        <w:drawing>
+          <wp:inline>
+            <wp:extent cx="3657600" cy="2924175"/>
+            <wp:effectExtent b="0" l="0" r="0" t="0"/>
+            <wp:docPr descr="image" title="" id="149" name="Picture"/>
+            <a:graphic>
+              <a:graphicData uri="http://schemas.openxmlformats.org/drawingml/2006/picture">
+                <pic:pic>
+                  <pic:nvPicPr>
+                    <pic:cNvPr descr="media/supplements1/exercise7/Torta-5.svg" id="150" name="Picture"/>
+                    <pic:cNvPicPr>
+                      <a:picLocks noChangeArrowheads="1" noChangeAspect="1"/>
+                    </pic:cNvPicPr>
+                  </pic:nvPicPr>
+                  <pic:blipFill>
+                    <a:blip r:embed="rId151">
+                      <a:extLst>
+                        <a:ext uri="{28A0092B-C50C-407E-A947-70E740481C1C}">
+                          <a14:useLocalDpi xmlns:a14="http://schemas.microsoft.com/office/drawing/2010/main" val="0"/>
+                        </a:ext>
+                        <a:ext uri="{96DAC541-7B7A-43D3-8B79-37D633B846F1}">
+                          <asvg:svgBlip xmlns:asvg="http://schemas.microsoft.com/office/drawing/2016/SVG/main" r:embed="rId148"/>
+                        </a:ext>
+                      </a:extLst>
+                    </a:blip>
+                    <a:stretch>
+                      <a:fillRect/>
+                    </a:stretch>
+                  </pic:blipFill>
+                  <pic:spPr bwMode="auto">
+                    <a:xfrm>
+                      <a:off x="0" y="0"/>
+                      <a:ext cx="3657600" cy="2924175"/>
+                    </a:xfrm>
+                    <a:prstGeom prst="rect">
+                      <a:avLst/>
+                    </a:prstGeom>
+                    <a:noFill/>
+                    <a:ln w="9525">
+                      <a:noFill/>
+                      <a:headEnd/>
+                      <a:tailEnd/>
+                    </a:ln>
+                  </pic:spPr>
+                </pic:pic>
+              </a:graphicData>
+            </a:graphic>
+          </wp:inline>
+        </w:drawing>
+      </w:r>
+    </w:p>
+    <w:p>
+      <w:pPr>
+        <w:numPr>
+          <w:ilvl w:val="1"/>
+          <w:numId w:val="1008"/>
+        </w:numPr>
+      </w:pPr>
+      <w:r>
+        <w:drawing>
+          <wp:inline>
+            <wp:extent cx="3467100" cy="3200400"/>
+            <wp:effectExtent b="0" l="0" r="0" t="0"/>
+            <wp:docPr descr="image" title="" id="153" name="Picture"/>
+            <a:graphic>
+              <a:graphicData uri="http://schemas.openxmlformats.org/drawingml/2006/picture">
+                <pic:pic>
+                  <pic:nvPicPr>
+                    <pic:cNvPr descr="media/supplements1/exercise7/BarraHorizontal-3.svg" id="154" name="Picture"/>
+                    <pic:cNvPicPr>
+                      <a:picLocks noChangeArrowheads="1" noChangeAspect="1"/>
+                    </pic:cNvPicPr>
+                  </pic:nvPicPr>
+                  <pic:blipFill>
+                    <a:blip r:embed="rId155">
+                      <a:extLst>
+                        <a:ext uri="{28A0092B-C50C-407E-A947-70E740481C1C}">
+                          <a14:useLocalDpi xmlns:a14="http://schemas.microsoft.com/office/drawing/2010/main" val="0"/>
+                        </a:ext>
+                        <a:ext uri="{96DAC541-7B7A-43D3-8B79-37D633B846F1}">
+                          <asvg:svgBlip xmlns:asvg="http://schemas.microsoft.com/office/drawing/2016/SVG/main" r:embed="rId152"/>
+                        </a:ext>
+                      </a:extLst>
+                    </a:blip>
+                    <a:stretch>
+                      <a:fillRect/>
+                    </a:stretch>
+                  </pic:blipFill>
+                  <pic:spPr bwMode="auto">
+                    <a:xfrm>
+                      <a:off x="0" y="0"/>
+                      <a:ext cx="3467100" cy="3200400"/>
+                    </a:xfrm>
+                    <a:prstGeom prst="rect">
+                      <a:avLst/>
+                    </a:prstGeom>
+                    <a:noFill/>
+                    <a:ln w="9525">
+                      <a:noFill/>
+                      <a:headEnd/>
+                      <a:tailEnd/>
+                    </a:ln>
+                  </pic:spPr>
+                </pic:pic>
+              </a:graphicData>
+            </a:graphic>
+          </wp:inline>
+        </w:drawing>
+      </w:r>
+    </w:p>
+    <w:p>
+      <w:pPr>
+        <w:numPr>
+          <w:ilvl w:val="0"/>
+          <w:numId w:val="1000"/>
+        </w:numPr>
+      </w:pPr>
+      <w:r>
+        <w:rPr>
+          <w:b/>
+          <w:bCs/>
+        </w:rPr>
+        <w:t xml:space="preserve">Retroalimentación</w:t>
+      </w:r>
+      <w:r>
+        <w:br/>
+      </w:r>
+      <w:r>
+        <w:t xml:space="preserve">Esta tabla representa la información recolectada en la encuesta, mostrando el porcentaje de personas interesadas en adoptar cada tipo de mascota:</w:t>
+      </w:r>
+      <w:r>
+        <w:br/>
+      </w:r>
+      <w:r>
+        <w:drawing>
+          <wp:inline>
+            <wp:extent cx="1439999" cy="829830"/>
+            <wp:effectExtent b="0" l="0" r="0" t="0"/>
+            <wp:docPr descr="image" title="" id="157" name="Picture"/>
+            <a:graphic>
+              <a:graphicData uri="http://schemas.openxmlformats.org/drawingml/2006/picture">
+                <pic:pic>
+                  <pic:nvPicPr>
+                    <pic:cNvPr descr="media/supplements1/exercise7/image01_solution.svg" id="158" name="Picture"/>
+                    <pic:cNvPicPr>
+                      <a:picLocks noChangeArrowheads="1" noChangeAspect="1"/>
+                    </pic:cNvPicPr>
+                  </pic:nvPicPr>
+                  <pic:blipFill>
+                    <a:blip r:embed="rId159">
+                      <a:extLst>
+                        <a:ext uri="{28A0092B-C50C-407E-A947-70E740481C1C}">
+                          <a14:useLocalDpi xmlns:a14="http://schemas.microsoft.com/office/drawing/2010/main" val="0"/>
+                        </a:ext>
+                        <a:ext uri="{96DAC541-7B7A-43D3-8B79-37D633B846F1}">
+                          <asvg:svgBlip xmlns:asvg="http://schemas.microsoft.com/office/drawing/2016/SVG/main" r:embed="rId156"/>
+                        </a:ext>
+                      </a:extLst>
+                    </a:blip>
+                    <a:stretch>
+                      <a:fillRect/>
+                    </a:stretch>
+                  </pic:blipFill>
+                  <pic:spPr bwMode="auto">
+                    <a:xfrm>
+                      <a:off x="0" y="0"/>
+                      <a:ext cx="1439999" cy="829830"/>
+                    </a:xfrm>
+                    <a:prstGeom prst="rect">
+                      <a:avLst/>
+                    </a:prstGeom>
+                    <a:noFill/>
+                    <a:ln w="9525">
+                      <a:noFill/>
+                      <a:headEnd/>
+                      <a:tailEnd/>
+                    </a:ln>
+                  </pic:spPr>
+                </pic:pic>
+              </a:graphicData>
+            </a:graphic>
+          </wp:inline>
+        </w:drawing>
+      </w:r>
+    </w:p>
+    <w:p>
+      <w:pPr>
+        <w:numPr>
+          <w:ilvl w:val="0"/>
+          <w:numId w:val="1001"/>
+        </w:numPr>
+      </w:pPr>
+      <w:r>
+        <w:rPr>
+          <w:b/>
+          <w:bCs/>
+        </w:rPr>
+        <w:t xml:space="preserve">Escenario</w:t>
+      </w:r>
+      <w:r>
+        <w:br/>
+      </w:r>
+      <w:r>
+        <w:t xml:space="preserve">El líder de un programa de adopción de mascotas encuestó a 470 personas para conocer qué animal les interesaría adoptar. Del total de encuestados, el 15% adoptaría un erizo, el 10% adoptaría un(a) hamster y el 75% adoptaría un(a) iguana.</w:t>
+      </w:r>
+    </w:p>
+    <w:p>
+      <w:pPr>
+        <w:numPr>
+          <w:ilvl w:val="0"/>
+          <w:numId w:val="1000"/>
+        </w:numPr>
+      </w:pPr>
+      <w:r>
+        <w:t xml:space="preserve">¿Cuál de las siguientes representaciones muestra correctamente la información recolectada en la encuesta?</w:t>
+      </w:r>
+      <w:r>
+        <w:br/>
+      </w:r>
+    </w:p>
+    <w:p>
+      <w:pPr>
+        <w:numPr>
+          <w:ilvl w:val="1"/>
+          <w:numId w:val="1009"/>
+        </w:numPr>
+      </w:pPr>
+      <w:r>
+        <w:drawing>
+          <wp:inline>
+            <wp:extent cx="3467100" cy="3200400"/>
+            <wp:effectExtent b="0" l="0" r="0" t="0"/>
+            <wp:docPr descr="image" title="" id="161" name="Picture"/>
+            <a:graphic>
+              <a:graphicData uri="http://schemas.openxmlformats.org/drawingml/2006/picture">
+                <pic:pic>
+                  <pic:nvPicPr>
+                    <pic:cNvPr descr="media/supplements1/exercise8/BarraHorizontal-3.svg" id="162" name="Picture"/>
+                    <pic:cNvPicPr>
+                      <a:picLocks noChangeArrowheads="1" noChangeAspect="1"/>
+                    </pic:cNvPicPr>
+                  </pic:nvPicPr>
+                  <pic:blipFill>
+                    <a:blip r:embed="rId163">
+                      <a:extLst>
+                        <a:ext uri="{28A0092B-C50C-407E-A947-70E740481C1C}">
+                          <a14:useLocalDpi xmlns:a14="http://schemas.microsoft.com/office/drawing/2010/main" val="0"/>
+                        </a:ext>
+                        <a:ext uri="{96DAC541-7B7A-43D3-8B79-37D633B846F1}">
+                          <asvg:svgBlip xmlns:asvg="http://schemas.microsoft.com/office/drawing/2016/SVG/main" r:embed="rId160"/>
+                        </a:ext>
+                      </a:extLst>
+                    </a:blip>
+                    <a:stretch>
+                      <a:fillRect/>
+                    </a:stretch>
+                  </pic:blipFill>
+                  <pic:spPr bwMode="auto">
+                    <a:xfrm>
+                      <a:off x="0" y="0"/>
+                      <a:ext cx="3467100" cy="3200400"/>
+                    </a:xfrm>
+                    <a:prstGeom prst="rect">
+                      <a:avLst/>
+                    </a:prstGeom>
+                    <a:noFill/>
+                    <a:ln w="9525">
+                      <a:noFill/>
+                      <a:headEnd/>
+                      <a:tailEnd/>
+                    </a:ln>
+                  </pic:spPr>
+                </pic:pic>
+              </a:graphicData>
+            </a:graphic>
+          </wp:inline>
+        </w:drawing>
+      </w:r>
+    </w:p>
+    <w:p>
+      <w:pPr>
+        <w:numPr>
+          <w:ilvl w:val="1"/>
+          <w:numId w:val="1009"/>
+        </w:numPr>
+      </w:pPr>
+      <w:r>
+        <w:drawing>
+          <wp:inline>
+            <wp:extent cx="1439999" cy="866548"/>
+            <wp:effectExtent b="0" l="0" r="0" t="0"/>
+            <wp:docPr descr="image" title="" id="165" name="Picture"/>
+            <a:graphic>
+              <a:graphicData uri="http://schemas.openxmlformats.org/drawingml/2006/picture">
+                <pic:pic>
+                  <pic:nvPicPr>
+                    <pic:cNvPr descr="media/supplements1/exercise8/image01.svg" id="166" name="Picture"/>
+                    <pic:cNvPicPr>
+                      <a:picLocks noChangeArrowheads="1" noChangeAspect="1"/>
+                    </pic:cNvPicPr>
+                  </pic:nvPicPr>
+                  <pic:blipFill>
+                    <a:blip r:embed="rId167">
+                      <a:extLst>
+                        <a:ext uri="{28A0092B-C50C-407E-A947-70E740481C1C}">
+                          <a14:useLocalDpi xmlns:a14="http://schemas.microsoft.com/office/drawing/2010/main" val="0"/>
+                        </a:ext>
+                        <a:ext uri="{96DAC541-7B7A-43D3-8B79-37D633B846F1}">
+                          <asvg:svgBlip xmlns:asvg="http://schemas.microsoft.com/office/drawing/2016/SVG/main" r:embed="rId164"/>
+                        </a:ext>
+                      </a:extLst>
+                    </a:blip>
+                    <a:stretch>
+                      <a:fillRect/>
+                    </a:stretch>
+                  </pic:blipFill>
+                  <pic:spPr bwMode="auto">
+                    <a:xfrm>
+                      <a:off x="0" y="0"/>
+                      <a:ext cx="1439999" cy="866548"/>
+                    </a:xfrm>
+                    <a:prstGeom prst="rect">
+                      <a:avLst/>
+                    </a:prstGeom>
+                    <a:noFill/>
+                    <a:ln w="9525">
+                      <a:noFill/>
+                      <a:headEnd/>
+                      <a:tailEnd/>
+                    </a:ln>
+                  </pic:spPr>
+                </pic:pic>
+              </a:graphicData>
+            </a:graphic>
+          </wp:inline>
+        </w:drawing>
+      </w:r>
+    </w:p>
+    <w:p>
+      <w:pPr>
+        <w:numPr>
+          <w:ilvl w:val="1"/>
+          <w:numId w:val="1009"/>
+        </w:numPr>
+      </w:pPr>
+      <w:r>
+        <w:drawing>
+          <wp:inline>
+            <wp:extent cx="3657600" cy="2924175"/>
+            <wp:effectExtent b="0" l="0" r="0" t="0"/>
+            <wp:docPr descr="image" title="" id="169" name="Picture"/>
+            <a:graphic>
+              <a:graphicData uri="http://schemas.openxmlformats.org/drawingml/2006/picture">
+                <pic:pic>
+                  <pic:nvPicPr>
+                    <pic:cNvPr descr="media/supplements1/exercise8/BarraVertical-1.svg" id="170" name="Picture"/>
+                    <pic:cNvPicPr>
+                      <a:picLocks noChangeArrowheads="1" noChangeAspect="1"/>
+                    </pic:cNvPicPr>
+                  </pic:nvPicPr>
+                  <pic:blipFill>
+                    <a:blip r:embed="rId171">
+                      <a:extLst>
+                        <a:ext uri="{28A0092B-C50C-407E-A947-70E740481C1C}">
+                          <a14:useLocalDpi xmlns:a14="http://schemas.microsoft.com/office/drawing/2010/main" val="0"/>
+                        </a:ext>
+                        <a:ext uri="{96DAC541-7B7A-43D3-8B79-37D633B846F1}">
+                          <asvg:svgBlip xmlns:asvg="http://schemas.microsoft.com/office/drawing/2016/SVG/main" r:embed="rId168"/>
+                        </a:ext>
+                      </a:extLst>
+                    </a:blip>
+                    <a:stretch>
+                      <a:fillRect/>
+                    </a:stretch>
+                  </pic:blipFill>
+                  <pic:spPr bwMode="auto">
+                    <a:xfrm>
+                      <a:off x="0" y="0"/>
+                      <a:ext cx="3657600" cy="2924175"/>
+                    </a:xfrm>
+                    <a:prstGeom prst="rect">
+                      <a:avLst/>
+                    </a:prstGeom>
+                    <a:noFill/>
+                    <a:ln w="9525">
+                      <a:noFill/>
+                      <a:headEnd/>
+                      <a:tailEnd/>
+                    </a:ln>
+                  </pic:spPr>
+                </pic:pic>
+              </a:graphicData>
+            </a:graphic>
+          </wp:inline>
+        </w:drawing>
+      </w:r>
+    </w:p>
+    <w:p>
+      <w:pPr>
+        <w:numPr>
+          <w:ilvl w:val="1"/>
+          <w:numId w:val="1009"/>
+        </w:numPr>
+      </w:pPr>
+      <w:r>
+        <w:drawing>
+          <wp:inline>
+            <wp:extent cx="3657600" cy="2924175"/>
+            <wp:effectExtent b="0" l="0" r="0" t="0"/>
+            <wp:docPr descr="image" title="" id="173" name="Picture"/>
+            <a:graphic>
+              <a:graphicData uri="http://schemas.openxmlformats.org/drawingml/2006/picture">
+                <pic:pic>
+                  <pic:nvPicPr>
+                    <pic:cNvPr descr="media/supplements1/exercise8/Torta-5.svg" id="174" name="Picture"/>
+                    <pic:cNvPicPr>
+                      <a:picLocks noChangeArrowheads="1" noChangeAspect="1"/>
+                    </pic:cNvPicPr>
+                  </pic:nvPicPr>
+                  <pic:blipFill>
+                    <a:blip r:embed="rId175">
+                      <a:extLst>
+                        <a:ext uri="{28A0092B-C50C-407E-A947-70E740481C1C}">
+                          <a14:useLocalDpi xmlns:a14="http://schemas.microsoft.com/office/drawing/2010/main" val="0"/>
+                        </a:ext>
+                        <a:ext uri="{96DAC541-7B7A-43D3-8B79-37D633B846F1}">
+                          <asvg:svgBlip xmlns:asvg="http://schemas.microsoft.com/office/drawing/2016/SVG/main" r:embed="rId172"/>
+                        </a:ext>
+                      </a:extLst>
+                    </a:blip>
+                    <a:stretch>
+                      <a:fillRect/>
+                    </a:stretch>
+                  </pic:blipFill>
+                  <pic:spPr bwMode="auto">
+                    <a:xfrm>
+                      <a:off x="0" y="0"/>
+                      <a:ext cx="3657600" cy="2924175"/>
+                    </a:xfrm>
+                    <a:prstGeom prst="rect">
+                      <a:avLst/>
+                    </a:prstGeom>
+                    <a:noFill/>
+                    <a:ln w="9525">
+                      <a:noFill/>
+                      <a:headEnd/>
+                      <a:tailEnd/>
+                    </a:ln>
+                  </pic:spPr>
+                </pic:pic>
+              </a:graphicData>
+            </a:graphic>
+          </wp:inline>
+        </w:drawing>
+      </w:r>
+    </w:p>
+    <w:p>
+      <w:pPr>
+        <w:numPr>
+          <w:ilvl w:val="0"/>
+          <w:numId w:val="1000"/>
+        </w:numPr>
+      </w:pPr>
+      <w:r>
+        <w:rPr>
+          <w:b/>
+          <w:bCs/>
+        </w:rPr>
+        <w:t xml:space="preserve">Retroalimentación</w:t>
+      </w:r>
+      <w:r>
+        <w:br/>
+      </w:r>
+      <w:r>
+        <w:t xml:space="preserve">Esta tabla representa la información recolectada en la encuesta, mostrando el porcentaje de personas interesadas en adoptar cada tipo de mascota:</w:t>
+      </w:r>
+      <w:r>
+        <w:br/>
+      </w:r>
+      <w:r>
+        <w:drawing>
+          <wp:inline>
+            <wp:extent cx="1439999" cy="866548"/>
+            <wp:effectExtent b="0" l="0" r="0" t="0"/>
+            <wp:docPr descr="image" title="" id="177" name="Picture"/>
+            <a:graphic>
+              <a:graphicData uri="http://schemas.openxmlformats.org/drawingml/2006/picture">
+                <pic:pic>
+                  <pic:nvPicPr>
+                    <pic:cNvPr descr="media/supplements1/exercise8/image01_solution.svg" id="178" name="Picture"/>
+                    <pic:cNvPicPr>
+                      <a:picLocks noChangeArrowheads="1" noChangeAspect="1"/>
+                    </pic:cNvPicPr>
+                  </pic:nvPicPr>
+                  <pic:blipFill>
+                    <a:blip r:embed="rId179">
+                      <a:extLst>
+                        <a:ext uri="{28A0092B-C50C-407E-A947-70E740481C1C}">
+                          <a14:useLocalDpi xmlns:a14="http://schemas.microsoft.com/office/drawing/2010/main" val="0"/>
+                        </a:ext>
+                        <a:ext uri="{96DAC541-7B7A-43D3-8B79-37D633B846F1}">
+                          <asvg:svgBlip xmlns:asvg="http://schemas.microsoft.com/office/drawing/2016/SVG/main" r:embed="rId176"/>
+                        </a:ext>
+                      </a:extLst>
+                    </a:blip>
+                    <a:stretch>
+                      <a:fillRect/>
+                    </a:stretch>
+                  </pic:blipFill>
+                  <pic:spPr bwMode="auto">
+                    <a:xfrm>
+                      <a:off x="0" y="0"/>
+                      <a:ext cx="1439999" cy="866548"/>
+                    </a:xfrm>
+                    <a:prstGeom prst="rect">
+                      <a:avLst/>
+                    </a:prstGeom>
+                    <a:noFill/>
+                    <a:ln w="9525">
+                      <a:noFill/>
+                      <a:headEnd/>
+                      <a:tailEnd/>
+                    </a:ln>
+                  </pic:spPr>
+                </pic:pic>
+              </a:graphicData>
+            </a:graphic>
+          </wp:inline>
+        </w:drawing>
+      </w:r>
+    </w:p>
+    <w:p>
+      <w:pPr>
+        <w:numPr>
+          <w:ilvl w:val="0"/>
+          <w:numId w:val="1001"/>
+        </w:numPr>
+      </w:pPr>
+      <w:r>
+        <w:rPr>
+          <w:b/>
+          <w:bCs/>
+        </w:rPr>
+        <w:t xml:space="preserve">Escenario</w:t>
+      </w:r>
+      <w:r>
+        <w:br/>
+      </w:r>
+      <w:r>
+        <w:t xml:space="preserve">El líder de un programa de adopción de mascotas encuestó a 540 personas para conocer qué animal les interesaría adoptar. Del total de encuestados, el 5% adoptaría un lagarto, el 40% adoptaría un(a) burro y el 55% adoptaría un(a) pato.</w:t>
+      </w:r>
+    </w:p>
+    <w:p>
+      <w:pPr>
+        <w:numPr>
+          <w:ilvl w:val="0"/>
+          <w:numId w:val="1000"/>
+        </w:numPr>
+      </w:pPr>
+      <w:r>
+        <w:t xml:space="preserve">¿Cuál de las siguientes representaciones muestra correctamente la información recolectada en la encuesta?</w:t>
+      </w:r>
+      <w:r>
+        <w:br/>
+      </w:r>
+    </w:p>
+    <w:p>
+      <w:pPr>
+        <w:numPr>
+          <w:ilvl w:val="1"/>
+          <w:numId w:val="1010"/>
+        </w:numPr>
+      </w:pPr>
+      <w:r>
+        <w:drawing>
+          <wp:inline>
+            <wp:extent cx="3657600" cy="2924175"/>
+            <wp:effectExtent b="0" l="0" r="0" t="0"/>
+            <wp:docPr descr="image" title="" id="181" name="Picture"/>
+            <a:graphic>
+              <a:graphicData uri="http://schemas.openxmlformats.org/drawingml/2006/picture">
+                <pic:pic>
+                  <pic:nvPicPr>
+                    <pic:cNvPr descr="media/supplements1/exercise9/Torta-5.svg" id="182" name="Picture"/>
+                    <pic:cNvPicPr>
+                      <a:picLocks noChangeArrowheads="1" noChangeAspect="1"/>
+                    </pic:cNvPicPr>
+                  </pic:nvPicPr>
+                  <pic:blipFill>
+                    <a:blip r:embed="rId183">
+                      <a:extLst>
+                        <a:ext uri="{28A0092B-C50C-407E-A947-70E740481C1C}">
+                          <a14:useLocalDpi xmlns:a14="http://schemas.microsoft.com/office/drawing/2010/main" val="0"/>
+                        </a:ext>
+                        <a:ext uri="{96DAC541-7B7A-43D3-8B79-37D633B846F1}">
+                          <asvg:svgBlip xmlns:asvg="http://schemas.microsoft.com/office/drawing/2016/SVG/main" r:embed="rId180"/>
+                        </a:ext>
+                      </a:extLst>
+                    </a:blip>
+                    <a:stretch>
+                      <a:fillRect/>
+                    </a:stretch>
+                  </pic:blipFill>
+                  <pic:spPr bwMode="auto">
+                    <a:xfrm>
+                      <a:off x="0" y="0"/>
+                      <a:ext cx="3657600" cy="2924175"/>
+                    </a:xfrm>
+                    <a:prstGeom prst="rect">
+                      <a:avLst/>
+                    </a:prstGeom>
+                    <a:noFill/>
+                    <a:ln w="9525">
+                      <a:noFill/>
+                      <a:headEnd/>
+                      <a:tailEnd/>
+                    </a:ln>
+                  </pic:spPr>
+                </pic:pic>
+              </a:graphicData>
+            </a:graphic>
+          </wp:inline>
+        </w:drawing>
+      </w:r>
+    </w:p>
+    <w:p>
+      <w:pPr>
+        <w:numPr>
+          <w:ilvl w:val="1"/>
+          <w:numId w:val="1010"/>
+        </w:numPr>
+      </w:pPr>
+      <w:r>
+        <w:drawing>
+          <wp:inline>
+            <wp:extent cx="3467100" cy="3200400"/>
+            <wp:effectExtent b="0" l="0" r="0" t="0"/>
+            <wp:docPr descr="image" title="" id="185" name="Picture"/>
+            <a:graphic>
+              <a:graphicData uri="http://schemas.openxmlformats.org/drawingml/2006/picture">
+                <pic:pic>
+                  <pic:nvPicPr>
+                    <pic:cNvPr descr="media/supplements1/exercise9/BarraHorizontal-3.svg" id="186" name="Picture"/>
+                    <pic:cNvPicPr>
+                      <a:picLocks noChangeArrowheads="1" noChangeAspect="1"/>
+                    </pic:cNvPicPr>
+                  </pic:nvPicPr>
+                  <pic:blipFill>
+                    <a:blip r:embed="rId187">
+                      <a:extLst>
+                        <a:ext uri="{28A0092B-C50C-407E-A947-70E740481C1C}">
+                          <a14:useLocalDpi xmlns:a14="http://schemas.microsoft.com/office/drawing/2010/main" val="0"/>
+                        </a:ext>
+                        <a:ext uri="{96DAC541-7B7A-43D3-8B79-37D633B846F1}">
+                          <asvg:svgBlip xmlns:asvg="http://schemas.microsoft.com/office/drawing/2016/SVG/main" r:embed="rId184"/>
+                        </a:ext>
+                      </a:extLst>
+                    </a:blip>
+                    <a:stretch>
+                      <a:fillRect/>
+                    </a:stretch>
+                  </pic:blipFill>
+                  <pic:spPr bwMode="auto">
+                    <a:xfrm>
+                      <a:off x="0" y="0"/>
+                      <a:ext cx="3467100" cy="3200400"/>
+                    </a:xfrm>
+                    <a:prstGeom prst="rect">
+                      <a:avLst/>
+                    </a:prstGeom>
+                    <a:noFill/>
+                    <a:ln w="9525">
+                      <a:noFill/>
+                      <a:headEnd/>
+                      <a:tailEnd/>
+                    </a:ln>
+                  </pic:spPr>
+                </pic:pic>
+              </a:graphicData>
+            </a:graphic>
+          </wp:inline>
+        </w:drawing>
+      </w:r>
+    </w:p>
+    <w:p>
+      <w:pPr>
+        <w:numPr>
+          <w:ilvl w:val="1"/>
+          <w:numId w:val="1010"/>
+        </w:numPr>
+      </w:pPr>
+      <w:r>
+        <w:drawing>
+          <wp:inline>
+            <wp:extent cx="3657600" cy="2924175"/>
+            <wp:effectExtent b="0" l="0" r="0" t="0"/>
+            <wp:docPr descr="image" title="" id="189" name="Picture"/>
+            <a:graphic>
+              <a:graphicData uri="http://schemas.openxmlformats.org/drawingml/2006/picture">
+                <pic:pic>
+                  <pic:nvPicPr>
+                    <pic:cNvPr descr="media/supplements1/exercise9/BarraVertical-1.svg" id="190" name="Picture"/>
+                    <pic:cNvPicPr>
+                      <a:picLocks noChangeArrowheads="1" noChangeAspect="1"/>
+                    </pic:cNvPicPr>
+                  </pic:nvPicPr>
+                  <pic:blipFill>
+                    <a:blip r:embed="rId191">
+                      <a:extLst>
+                        <a:ext uri="{28A0092B-C50C-407E-A947-70E740481C1C}">
+                          <a14:useLocalDpi xmlns:a14="http://schemas.microsoft.com/office/drawing/2010/main" val="0"/>
+                        </a:ext>
+                        <a:ext uri="{96DAC541-7B7A-43D3-8B79-37D633B846F1}">
+                          <asvg:svgBlip xmlns:asvg="http://schemas.microsoft.com/office/drawing/2016/SVG/main" r:embed="rId188"/>
+                        </a:ext>
+                      </a:extLst>
+                    </a:blip>
+                    <a:stretch>
+                      <a:fillRect/>
+                    </a:stretch>
+                  </pic:blipFill>
+                  <pic:spPr bwMode="auto">
+                    <a:xfrm>
+                      <a:off x="0" y="0"/>
+                      <a:ext cx="3657600" cy="2924175"/>
+                    </a:xfrm>
+                    <a:prstGeom prst="rect">
+                      <a:avLst/>
+                    </a:prstGeom>
+                    <a:noFill/>
+                    <a:ln w="9525">
+                      <a:noFill/>
+                      <a:headEnd/>
+                      <a:tailEnd/>
+                    </a:ln>
+                  </pic:spPr>
+                </pic:pic>
+              </a:graphicData>
+            </a:graphic>
+          </wp:inline>
+        </w:drawing>
+      </w:r>
+    </w:p>
+    <w:p>
+      <w:pPr>
+        <w:numPr>
+          <w:ilvl w:val="1"/>
+          <w:numId w:val="1010"/>
+        </w:numPr>
+      </w:pPr>
+      <w:r>
+        <w:drawing>
+          <wp:inline>
+            <wp:extent cx="1439999" cy="890181"/>
+            <wp:effectExtent b="0" l="0" r="0" t="0"/>
+            <wp:docPr descr="image" title="" id="193" name="Picture"/>
+            <a:graphic>
+              <a:graphicData uri="http://schemas.openxmlformats.org/drawingml/2006/picture">
+                <pic:pic>
+                  <pic:nvPicPr>
+                    <pic:cNvPr descr="media/supplements1/exercise9/image01.svg" id="194" name="Picture"/>
+                    <pic:cNvPicPr>
+                      <a:picLocks noChangeArrowheads="1" noChangeAspect="1"/>
+                    </pic:cNvPicPr>
+                  </pic:nvPicPr>
+                  <pic:blipFill>
+                    <a:blip r:embed="rId195">
+                      <a:extLst>
+                        <a:ext uri="{28A0092B-C50C-407E-A947-70E740481C1C}">
+                          <a14:useLocalDpi xmlns:a14="http://schemas.microsoft.com/office/drawing/2010/main" val="0"/>
+                        </a:ext>
+                        <a:ext uri="{96DAC541-7B7A-43D3-8B79-37D633B846F1}">
+                          <asvg:svgBlip xmlns:asvg="http://schemas.microsoft.com/office/drawing/2016/SVG/main" r:embed="rId192"/>
+                        </a:ext>
+                      </a:extLst>
+                    </a:blip>
+                    <a:stretch>
+                      <a:fillRect/>
+                    </a:stretch>
+                  </pic:blipFill>
+                  <pic:spPr bwMode="auto">
+                    <a:xfrm>
+                      <a:off x="0" y="0"/>
+                      <a:ext cx="1439999" cy="890181"/>
+                    </a:xfrm>
+                    <a:prstGeom prst="rect">
+                      <a:avLst/>
+                    </a:prstGeom>
+                    <a:noFill/>
+                    <a:ln w="9525">
+                      <a:noFill/>
+                      <a:headEnd/>
+                      <a:tailEnd/>
+                    </a:ln>
+                  </pic:spPr>
+                </pic:pic>
+              </a:graphicData>
+            </a:graphic>
+          </wp:inline>
+        </w:drawing>
+      </w:r>
+    </w:p>
+    <w:p>
+      <w:pPr>
+        <w:numPr>
+          <w:ilvl w:val="0"/>
+          <w:numId w:val="1000"/>
+        </w:numPr>
+      </w:pPr>
+      <w:r>
+        <w:rPr>
+          <w:b/>
+          <w:bCs/>
+        </w:rPr>
+        <w:t xml:space="preserve">Retroalimentación</w:t>
+      </w:r>
+      <w:r>
+        <w:br/>
+      </w:r>
+      <w:r>
+        <w:t xml:space="preserve">Esta tabla representa la información recolectada en la encuesta, mostrando el porcentaje de personas interesadas en adoptar cada tipo de mascota:</w:t>
+      </w:r>
+      <w:r>
+        <w:br/>
+      </w:r>
+      <w:r>
+        <w:drawing>
+          <wp:inline>
+            <wp:extent cx="1439999" cy="890181"/>
+            <wp:effectExtent b="0" l="0" r="0" t="0"/>
+            <wp:docPr descr="image" title="" id="197" name="Picture"/>
+            <a:graphic>
+              <a:graphicData uri="http://schemas.openxmlformats.org/drawingml/2006/picture">
+                <pic:pic>
+                  <pic:nvPicPr>
+                    <pic:cNvPr descr="media/supplements1/exercise9/image01_solution.svg" id="198" name="Picture"/>
+                    <pic:cNvPicPr>
+                      <a:picLocks noChangeArrowheads="1" noChangeAspect="1"/>
+                    </pic:cNvPicPr>
+                  </pic:nvPicPr>
+                  <pic:blipFill>
+                    <a:blip r:embed="rId199">
+                      <a:extLst>
+                        <a:ext uri="{28A0092B-C50C-407E-A947-70E740481C1C}">
+                          <a14:useLocalDpi xmlns:a14="http://schemas.microsoft.com/office/drawing/2010/main" val="0"/>
+                        </a:ext>
+                        <a:ext uri="{96DAC541-7B7A-43D3-8B79-37D633B846F1}">
+                          <asvg:svgBlip xmlns:asvg="http://schemas.microsoft.com/office/drawing/2016/SVG/main" r:embed="rId196"/>
+                        </a:ext>
+                      </a:extLst>
+                    </a:blip>
+                    <a:stretch>
+                      <a:fillRect/>
+                    </a:stretch>
+                  </pic:blipFill>
+                  <pic:spPr bwMode="auto">
+                    <a:xfrm>
+                      <a:off x="0" y="0"/>
+                      <a:ext cx="1439999" cy="890181"/>
+                    </a:xfrm>
+                    <a:prstGeom prst="rect">
+                      <a:avLst/>
+                    </a:prstGeom>
+                    <a:noFill/>
+                    <a:ln w="9525">
+                      <a:noFill/>
+                      <a:headEnd/>
+                      <a:tailEnd/>
+                    </a:ln>
+                  </pic:spPr>
+                </pic:pic>
+              </a:graphicData>
+            </a:graphic>
+          </wp:inline>
+        </w:drawing>
+      </w:r>
+    </w:p>
+    <w:p>
+      <w:pPr>
+        <w:numPr>
+          <w:ilvl w:val="0"/>
+          <w:numId w:val="1001"/>
+        </w:numPr>
+      </w:pPr>
+      <w:r>
+        <w:rPr>
+          <w:b/>
+          <w:bCs/>
+        </w:rPr>
+        <w:t xml:space="preserve">Escenario</w:t>
+      </w:r>
+      <w:r>
+        <w:br/>
+      </w:r>
+      <w:r>
+        <w:t xml:space="preserve">El líder de un programa de adopción de mascotas encuestó a 480 personas para conocer qué animal les interesaría adoptar. Del total de encuestados, el 5% adoptaría un perro, el 30% adoptaría un(a) ganso y el 65% adoptaría un(a) caballo.</w:t>
+      </w:r>
+    </w:p>
+    <w:p>
+      <w:pPr>
+        <w:numPr>
+          <w:ilvl w:val="0"/>
+          <w:numId w:val="1000"/>
+        </w:numPr>
+      </w:pPr>
+      <w:r>
+        <w:t xml:space="preserve">¿Cuál de las siguientes representaciones muestra correctamente la información recolectada en la encuesta?</w:t>
+      </w:r>
+      <w:r>
+        <w:br/>
+      </w:r>
+    </w:p>
+    <w:p>
+      <w:pPr>
+        <w:numPr>
+          <w:ilvl w:val="1"/>
+          <w:numId w:val="1011"/>
+        </w:numPr>
+      </w:pPr>
+      <w:r>
+        <w:drawing>
+          <wp:inline>
+            <wp:extent cx="1439999" cy="890181"/>
+            <wp:effectExtent b="0" l="0" r="0" t="0"/>
+            <wp:docPr descr="image" title="" id="201" name="Picture"/>
+            <a:graphic>
+              <a:graphicData uri="http://schemas.openxmlformats.org/drawingml/2006/picture">
+                <pic:pic>
+                  <pic:nvPicPr>
+                    <pic:cNvPr descr="media/supplements1/exercise10/image01.svg" id="202" name="Picture"/>
+                    <pic:cNvPicPr>
+                      <a:picLocks noChangeArrowheads="1" noChangeAspect="1"/>
+                    </pic:cNvPicPr>
+                  </pic:nvPicPr>
+                  <pic:blipFill>
+                    <a:blip r:embed="rId203">
+                      <a:extLst>
+                        <a:ext uri="{28A0092B-C50C-407E-A947-70E740481C1C}">
+                          <a14:useLocalDpi xmlns:a14="http://schemas.microsoft.com/office/drawing/2010/main" val="0"/>
+                        </a:ext>
+                        <a:ext uri="{96DAC541-7B7A-43D3-8B79-37D633B846F1}">
+                          <asvg:svgBlip xmlns:asvg="http://schemas.microsoft.com/office/drawing/2016/SVG/main" r:embed="rId200"/>
+                        </a:ext>
+                      </a:extLst>
+                    </a:blip>
+                    <a:stretch>
+                      <a:fillRect/>
+                    </a:stretch>
+                  </pic:blipFill>
+                  <pic:spPr bwMode="auto">
+                    <a:xfrm>
+                      <a:off x="0" y="0"/>
+                      <a:ext cx="1439999" cy="890181"/>
+                    </a:xfrm>
+                    <a:prstGeom prst="rect">
+                      <a:avLst/>
+                    </a:prstGeom>
+                    <a:noFill/>
+                    <a:ln w="9525">
+                      <a:noFill/>
+                      <a:headEnd/>
+                      <a:tailEnd/>
+                    </a:ln>
+                  </pic:spPr>
+                </pic:pic>
+              </a:graphicData>
+            </a:graphic>
+          </wp:inline>
+        </w:drawing>
+      </w:r>
+    </w:p>
+    <w:p>
+      <w:pPr>
+        <w:numPr>
+          <w:ilvl w:val="1"/>
+          <w:numId w:val="1011"/>
+        </w:numPr>
+      </w:pPr>
+      <w:r>
+        <w:drawing>
+          <wp:inline>
+            <wp:extent cx="3657600" cy="2924175"/>
+            <wp:effectExtent b="0" l="0" r="0" t="0"/>
+            <wp:docPr descr="image" title="" id="205" name="Picture"/>
+            <a:graphic>
+              <a:graphicData uri="http://schemas.openxmlformats.org/drawingml/2006/picture">
+                <pic:pic>
+                  <pic:nvPicPr>
+                    <pic:cNvPr descr="media/supplements1/exercise10/Torta-5.svg" id="206" name="Picture"/>
+                    <pic:cNvPicPr>
+                      <a:picLocks noChangeArrowheads="1" noChangeAspect="1"/>
+                    </pic:cNvPicPr>
+                  </pic:nvPicPr>
+                  <pic:blipFill>
+                    <a:blip r:embed="rId207">
+                      <a:extLst>
+                        <a:ext uri="{28A0092B-C50C-407E-A947-70E740481C1C}">
+                          <a14:useLocalDpi xmlns:a14="http://schemas.microsoft.com/office/drawing/2010/main" val="0"/>
+                        </a:ext>
+                        <a:ext uri="{96DAC541-7B7A-43D3-8B79-37D633B846F1}">
+                          <asvg:svgBlip xmlns:asvg="http://schemas.microsoft.com/office/drawing/2016/SVG/main" r:embed="rId204"/>
+                        </a:ext>
+                      </a:extLst>
+                    </a:blip>
+                    <a:stretch>
+                      <a:fillRect/>
+                    </a:stretch>
+                  </pic:blipFill>
+                  <pic:spPr bwMode="auto">
+                    <a:xfrm>
+                      <a:off x="0" y="0"/>
+                      <a:ext cx="3657600" cy="2924175"/>
+                    </a:xfrm>
+                    <a:prstGeom prst="rect">
+                      <a:avLst/>
+                    </a:prstGeom>
+                    <a:noFill/>
+                    <a:ln w="9525">
+                      <a:noFill/>
+                      <a:headEnd/>
+                      <a:tailEnd/>
+                    </a:ln>
+                  </pic:spPr>
+                </pic:pic>
+              </a:graphicData>
+            </a:graphic>
+          </wp:inline>
+        </w:drawing>
+      </w:r>
+    </w:p>
+    <w:p>
+      <w:pPr>
+        <w:numPr>
+          <w:ilvl w:val="1"/>
+          <w:numId w:val="1011"/>
+        </w:numPr>
+      </w:pPr>
+      <w:r>
+        <w:drawing>
+          <wp:inline>
+            <wp:extent cx="3657600" cy="2924175"/>
+            <wp:effectExtent b="0" l="0" r="0" t="0"/>
+            <wp:docPr descr="image" title="" id="209" name="Picture"/>
+            <a:graphic>
+              <a:graphicData uri="http://schemas.openxmlformats.org/drawingml/2006/picture">
+                <pic:pic>
+                  <pic:nvPicPr>
+                    <pic:cNvPr descr="media/supplements1/exercise10/BarraVertical-1.svg" id="210" name="Picture"/>
+                    <pic:cNvPicPr>
+                      <a:picLocks noChangeArrowheads="1" noChangeAspect="1"/>
+                    </pic:cNvPicPr>
+                  </pic:nvPicPr>
+                  <pic:blipFill>
+                    <a:blip r:embed="rId211">
+                      <a:extLst>
+                        <a:ext uri="{28A0092B-C50C-407E-A947-70E740481C1C}">
+                          <a14:useLocalDpi xmlns:a14="http://schemas.microsoft.com/office/drawing/2010/main" val="0"/>
+                        </a:ext>
+                        <a:ext uri="{96DAC541-7B7A-43D3-8B79-37D633B846F1}">
+                          <asvg:svgBlip xmlns:asvg="http://schemas.microsoft.com/office/drawing/2016/SVG/main" r:embed="rId208"/>
+                        </a:ext>
+                      </a:extLst>
+                    </a:blip>
+                    <a:stretch>
+                      <a:fillRect/>
+                    </a:stretch>
+                  </pic:blipFill>
+                  <pic:spPr bwMode="auto">
+                    <a:xfrm>
+                      <a:off x="0" y="0"/>
+                      <a:ext cx="3657600" cy="2924175"/>
+                    </a:xfrm>
+                    <a:prstGeom prst="rect">
+                      <a:avLst/>
+                    </a:prstGeom>
+                    <a:noFill/>
+                    <a:ln w="9525">
+                      <a:noFill/>
+                      <a:headEnd/>
+                      <a:tailEnd/>
+                    </a:ln>
+                  </pic:spPr>
+                </pic:pic>
+              </a:graphicData>
+            </a:graphic>
+          </wp:inline>
+        </w:drawing>
+      </w:r>
+    </w:p>
+    <w:p>
+      <w:pPr>
+        <w:numPr>
+          <w:ilvl w:val="1"/>
+          <w:numId w:val="1011"/>
+        </w:numPr>
+      </w:pPr>
+      <w:r>
+        <w:drawing>
+          <wp:inline>
+            <wp:extent cx="3467100" cy="3200400"/>
+            <wp:effectExtent b="0" l="0" r="0" t="0"/>
+            <wp:docPr descr="image" title="" id="213" name="Picture"/>
+            <a:graphic>
+              <a:graphicData uri="http://schemas.openxmlformats.org/drawingml/2006/picture">
+                <pic:pic>
+                  <pic:nvPicPr>
+                    <pic:cNvPr descr="media/supplements1/exercise10/BarraHorizontal-3.svg" id="214" name="Picture"/>
+                    <pic:cNvPicPr>
+                      <a:picLocks noChangeArrowheads="1" noChangeAspect="1"/>
+                    </pic:cNvPicPr>
+                  </pic:nvPicPr>
+                  <pic:blipFill>
+                    <a:blip r:embed="rId215">
+                      <a:extLst>
+                        <a:ext uri="{28A0092B-C50C-407E-A947-70E740481C1C}">
+                          <a14:useLocalDpi xmlns:a14="http://schemas.microsoft.com/office/drawing/2010/main" val="0"/>
+                        </a:ext>
+                        <a:ext uri="{96DAC541-7B7A-43D3-8B79-37D633B846F1}">
+                          <asvg:svgBlip xmlns:asvg="http://schemas.microsoft.com/office/drawing/2016/SVG/main" r:embed="rId212"/>
+                        </a:ext>
+                      </a:extLst>
+                    </a:blip>
+                    <a:stretch>
+                      <a:fillRect/>
+                    </a:stretch>
+                  </pic:blipFill>
+                  <pic:spPr bwMode="auto">
+                    <a:xfrm>
+                      <a:off x="0" y="0"/>
+                      <a:ext cx="3467100" cy="3200400"/>
+                    </a:xfrm>
+                    <a:prstGeom prst="rect">
+                      <a:avLst/>
+                    </a:prstGeom>
+                    <a:noFill/>
+                    <a:ln w="9525">
+                      <a:noFill/>
+                      <a:headEnd/>
+                      <a:tailEnd/>
+                    </a:ln>
+                  </pic:spPr>
+                </pic:pic>
+              </a:graphicData>
+            </a:graphic>
+          </wp:inline>
+        </w:drawing>
+      </w:r>
+    </w:p>
+    <w:p>
+      <w:pPr>
+        <w:numPr>
+          <w:ilvl w:val="0"/>
+          <w:numId w:val="1000"/>
+        </w:numPr>
+      </w:pPr>
+      <w:r>
+        <w:rPr>
+          <w:b/>
+          <w:bCs/>
+        </w:rPr>
+        <w:t xml:space="preserve">Retroalimentación</w:t>
+      </w:r>
+      <w:r>
+        <w:br/>
+      </w:r>
+      <w:r>
+        <w:t xml:space="preserve">Esta tabla representa la información recolectada en la encuesta, mostrando el porcentaje de personas interesadas en adoptar cada tipo de mascota:</w:t>
+      </w:r>
+      <w:r>
+        <w:br/>
+      </w:r>
+      <w:r>
+        <w:drawing>
+          <wp:inline>
+            <wp:extent cx="1439999" cy="890181"/>
+            <wp:effectExtent b="0" l="0" r="0" t="0"/>
+            <wp:docPr descr="image" title="" id="217" name="Picture"/>
+            <a:graphic>
+              <a:graphicData uri="http://schemas.openxmlformats.org/drawingml/2006/picture">
+                <pic:pic>
+                  <pic:nvPicPr>
+                    <pic:cNvPr descr="media/supplements1/exercise10/image01_solution.svg" id="218" name="Picture"/>
+                    <pic:cNvPicPr>
+                      <a:picLocks noChangeArrowheads="1" noChangeAspect="1"/>
+                    </pic:cNvPicPr>
+                  </pic:nvPicPr>
+                  <pic:blipFill>
+                    <a:blip r:embed="rId219">
+                      <a:extLst>
+                        <a:ext uri="{28A0092B-C50C-407E-A947-70E740481C1C}">
+                          <a14:useLocalDpi xmlns:a14="http://schemas.microsoft.com/office/drawing/2010/main" val="0"/>
+                        </a:ext>
+                        <a:ext uri="{96DAC541-7B7A-43D3-8B79-37D633B846F1}">
+                          <asvg:svgBlip xmlns:asvg="http://schemas.microsoft.com/office/drawing/2016/SVG/main" r:embed="rId216"/>
+                        </a:ext>
+                      </a:extLst>
+                    </a:blip>
+                    <a:stretch>
+                      <a:fillRect/>
+                    </a:stretch>
+                  </pic:blipFill>
+                  <pic:spPr bwMode="auto">
+                    <a:xfrm>
+                      <a:off x="0" y="0"/>
+                      <a:ext cx="1439999" cy="890181"/>
+                    </a:xfrm>
+                    <a:prstGeom prst="rect">
+                      <a:avLst/>
+                    </a:prstGeom>
+                    <a:noFill/>
+                    <a:ln w="9525">
+                      <a:noFill/>
+                      <a:headEnd/>
+                      <a:tailEnd/>
+                    </a:ln>
+                  </pic:spPr>
+                </pic:pic>
+              </a:graphicData>
+            </a:graphic>
+          </wp:inline>
+        </w:drawing>
+      </w:r>
+    </w:p>
+    <w:p>
+      <w:pPr>
+        <w:numPr>
+          <w:ilvl w:val="0"/>
+          <w:numId w:val="1001"/>
+        </w:numPr>
+      </w:pPr>
+      <w:r>
+        <w:rPr>
+          <w:b/>
+          <w:bCs/>
+        </w:rPr>
+        <w:t xml:space="preserve">Escenario</w:t>
+      </w:r>
+      <w:r>
+        <w:br/>
+      </w:r>
+      <w:r>
+        <w:t xml:space="preserve">El líder de un programa de adopción de mascotas encuestó a 520 personas para conocer qué animal les interesaría adoptar. Del total de encuestados, el 10% adoptaría un ganso, el 20% adoptaría un(a) cabra y el 70% adoptaría un(a) hurón.</w:t>
+      </w:r>
+    </w:p>
+    <w:p>
+      <w:pPr>
+        <w:numPr>
+          <w:ilvl w:val="0"/>
+          <w:numId w:val="1000"/>
+        </w:numPr>
+      </w:pPr>
+      <w:r>
+        <w:t xml:space="preserve">¿Cuál de las siguientes representaciones muestra correctamente la información recolectada en la encuesta?</w:t>
+      </w:r>
+      <w:r>
+        <w:br/>
+      </w:r>
+    </w:p>
+    <w:p>
+      <w:pPr>
+        <w:numPr>
+          <w:ilvl w:val="1"/>
+          <w:numId w:val="1012"/>
+        </w:numPr>
+      </w:pPr>
+      <w:r>
+        <w:drawing>
+          <wp:inline>
+            <wp:extent cx="3467100" cy="3200400"/>
+            <wp:effectExtent b="0" l="0" r="0" t="0"/>
+            <wp:docPr descr="image" title="" id="221" name="Picture"/>
+            <a:graphic>
+              <a:graphicData uri="http://schemas.openxmlformats.org/drawingml/2006/picture">
+                <pic:pic>
+                  <pic:nvPicPr>
+                    <pic:cNvPr descr="media/supplements1/exercise11/BarraHorizontal-3.svg" id="222" name="Picture"/>
+                    <pic:cNvPicPr>
+                      <a:picLocks noChangeArrowheads="1" noChangeAspect="1"/>
+                    </pic:cNvPicPr>
+                  </pic:nvPicPr>
+                  <pic:blipFill>
+                    <a:blip r:embed="rId223">
+                      <a:extLst>
+                        <a:ext uri="{28A0092B-C50C-407E-A947-70E740481C1C}">
+                          <a14:useLocalDpi xmlns:a14="http://schemas.microsoft.com/office/drawing/2010/main" val="0"/>
+                        </a:ext>
+                        <a:ext uri="{96DAC541-7B7A-43D3-8B79-37D633B846F1}">
+                          <asvg:svgBlip xmlns:asvg="http://schemas.microsoft.com/office/drawing/2016/SVG/main" r:embed="rId220"/>
+                        </a:ext>
+                      </a:extLst>
+                    </a:blip>
+                    <a:stretch>
+                      <a:fillRect/>
+                    </a:stretch>
+                  </pic:blipFill>
+                  <pic:spPr bwMode="auto">
+                    <a:xfrm>
+                      <a:off x="0" y="0"/>
+                      <a:ext cx="3467100" cy="3200400"/>
+                    </a:xfrm>
+                    <a:prstGeom prst="rect">
+                      <a:avLst/>
+                    </a:prstGeom>
+                    <a:noFill/>
+                    <a:ln w="9525">
+                      <a:noFill/>
+                      <a:headEnd/>
+                      <a:tailEnd/>
+                    </a:ln>
+                  </pic:spPr>
+                </pic:pic>
+              </a:graphicData>
+            </a:graphic>
+          </wp:inline>
+        </w:drawing>
+      </w:r>
+    </w:p>
+    <w:p>
+      <w:pPr>
+        <w:numPr>
+          <w:ilvl w:val="1"/>
+          <w:numId w:val="1012"/>
+        </w:numPr>
+      </w:pPr>
+      <w:r>
+        <w:drawing>
+          <wp:inline>
+            <wp:extent cx="3657600" cy="2924175"/>
+            <wp:effectExtent b="0" l="0" r="0" t="0"/>
+            <wp:docPr descr="image" title="" id="225" name="Picture"/>
+            <a:graphic>
+              <a:graphicData uri="http://schemas.openxmlformats.org/drawingml/2006/picture">
+                <pic:pic>
+                  <pic:nvPicPr>
+                    <pic:cNvPr descr="media/supplements1/exercise11/BarraVertical-1.svg" id="226" name="Picture"/>
+                    <pic:cNvPicPr>
+                      <a:picLocks noChangeArrowheads="1" noChangeAspect="1"/>
+                    </pic:cNvPicPr>
+                  </pic:nvPicPr>
+                  <pic:blipFill>
+                    <a:blip r:embed="rId227">
+                      <a:extLst>
+                        <a:ext uri="{28A0092B-C50C-407E-A947-70E740481C1C}">
+                          <a14:useLocalDpi xmlns:a14="http://schemas.microsoft.com/office/drawing/2010/main" val="0"/>
+                        </a:ext>
+                        <a:ext uri="{96DAC541-7B7A-43D3-8B79-37D633B846F1}">
+                          <asvg:svgBlip xmlns:asvg="http://schemas.microsoft.com/office/drawing/2016/SVG/main" r:embed="rId224"/>
+                        </a:ext>
+                      </a:extLst>
+                    </a:blip>
+                    <a:stretch>
+                      <a:fillRect/>
+                    </a:stretch>
+                  </pic:blipFill>
+                  <pic:spPr bwMode="auto">
+                    <a:xfrm>
+                      <a:off x="0" y="0"/>
+                      <a:ext cx="3657600" cy="2924175"/>
+                    </a:xfrm>
+                    <a:prstGeom prst="rect">
+                      <a:avLst/>
+                    </a:prstGeom>
+                    <a:noFill/>
+                    <a:ln w="9525">
+                      <a:noFill/>
+                      <a:headEnd/>
+                      <a:tailEnd/>
+                    </a:ln>
+                  </pic:spPr>
+                </pic:pic>
+              </a:graphicData>
+            </a:graphic>
+          </wp:inline>
+        </w:drawing>
+      </w:r>
+    </w:p>
+    <w:p>
+      <w:pPr>
+        <w:numPr>
+          <w:ilvl w:val="1"/>
+          <w:numId w:val="1012"/>
+        </w:numPr>
+      </w:pPr>
+      <w:r>
+        <w:drawing>
+          <wp:inline>
+            <wp:extent cx="3657600" cy="2924175"/>
+            <wp:effectExtent b="0" l="0" r="0" t="0"/>
+            <wp:docPr descr="image" title="" id="229" name="Picture"/>
+            <a:graphic>
+              <a:graphicData uri="http://schemas.openxmlformats.org/drawingml/2006/picture">
+                <pic:pic>
+                  <pic:nvPicPr>
+                    <pic:cNvPr descr="media/supplements1/exercise11/Torta-5.svg" id="230" name="Picture"/>
+                    <pic:cNvPicPr>
+                      <a:picLocks noChangeArrowheads="1" noChangeAspect="1"/>
+                    </pic:cNvPicPr>
+                  </pic:nvPicPr>
+                  <pic:blipFill>
+                    <a:blip r:embed="rId231">
+                      <a:extLst>
+                        <a:ext uri="{28A0092B-C50C-407E-A947-70E740481C1C}">
+                          <a14:useLocalDpi xmlns:a14="http://schemas.microsoft.com/office/drawing/2010/main" val="0"/>
+                        </a:ext>
+                        <a:ext uri="{96DAC541-7B7A-43D3-8B79-37D633B846F1}">
+                          <asvg:svgBlip xmlns:asvg="http://schemas.microsoft.com/office/drawing/2016/SVG/main" r:embed="rId228"/>
+                        </a:ext>
+                      </a:extLst>
+                    </a:blip>
+                    <a:stretch>
+                      <a:fillRect/>
+                    </a:stretch>
+                  </pic:blipFill>
+                  <pic:spPr bwMode="auto">
+                    <a:xfrm>
+                      <a:off x="0" y="0"/>
+                      <a:ext cx="3657600" cy="2924175"/>
+                    </a:xfrm>
+                    <a:prstGeom prst="rect">
+                      <a:avLst/>
+                    </a:prstGeom>
+                    <a:noFill/>
+                    <a:ln w="9525">
+                      <a:noFill/>
+                      <a:headEnd/>
+                      <a:tailEnd/>
+                    </a:ln>
+                  </pic:spPr>
+                </pic:pic>
+              </a:graphicData>
+            </a:graphic>
+          </wp:inline>
+        </w:drawing>
+      </w:r>
+    </w:p>
+    <w:p>
+      <w:pPr>
+        <w:numPr>
+          <w:ilvl w:val="1"/>
+          <w:numId w:val="1012"/>
+        </w:numPr>
+      </w:pPr>
+      <w:r>
+        <w:drawing>
+          <wp:inline>
+            <wp:extent cx="1439999" cy="890181"/>
+            <wp:effectExtent b="0" l="0" r="0" t="0"/>
+            <wp:docPr descr="image" title="" id="233" name="Picture"/>
+            <a:graphic>
+              <a:graphicData uri="http://schemas.openxmlformats.org/drawingml/2006/picture">
+                <pic:pic>
+                  <pic:nvPicPr>
+                    <pic:cNvPr descr="media/supplements1/exercise11/image01.svg" id="234" name="Picture"/>
+                    <pic:cNvPicPr>
+                      <a:picLocks noChangeArrowheads="1" noChangeAspect="1"/>
+                    </pic:cNvPicPr>
+                  </pic:nvPicPr>
+                  <pic:blipFill>
+                    <a:blip r:embed="rId235">
+                      <a:extLst>
+                        <a:ext uri="{28A0092B-C50C-407E-A947-70E740481C1C}">
+                          <a14:useLocalDpi xmlns:a14="http://schemas.microsoft.com/office/drawing/2010/main" val="0"/>
+                        </a:ext>
+                        <a:ext uri="{96DAC541-7B7A-43D3-8B79-37D633B846F1}">
+                          <asvg:svgBlip xmlns:asvg="http://schemas.microsoft.com/office/drawing/2016/SVG/main" r:embed="rId232"/>
+                        </a:ext>
+                      </a:extLst>
+                    </a:blip>
+                    <a:stretch>
+                      <a:fillRect/>
+                    </a:stretch>
+                  </pic:blipFill>
+                  <pic:spPr bwMode="auto">
+                    <a:xfrm>
+                      <a:off x="0" y="0"/>
+                      <a:ext cx="1439999" cy="890181"/>
+                    </a:xfrm>
+                    <a:prstGeom prst="rect">
+                      <a:avLst/>
+                    </a:prstGeom>
+                    <a:noFill/>
+                    <a:ln w="9525">
+                      <a:noFill/>
+                      <a:headEnd/>
+                      <a:tailEnd/>
+                    </a:ln>
+                  </pic:spPr>
+                </pic:pic>
+              </a:graphicData>
+            </a:graphic>
+          </wp:inline>
+        </w:drawing>
+      </w:r>
+    </w:p>
+    <w:p>
+      <w:pPr>
+        <w:numPr>
+          <w:ilvl w:val="0"/>
+          <w:numId w:val="1000"/>
+        </w:numPr>
+      </w:pPr>
+      <w:r>
+        <w:rPr>
+          <w:b/>
+          <w:bCs/>
+        </w:rPr>
+        <w:t xml:space="preserve">Retroalimentación</w:t>
+      </w:r>
+      <w:r>
+        <w:br/>
+      </w:r>
+      <w:r>
+        <w:t xml:space="preserve">Esta tabla representa la información recolectada en la encuesta, mostrando el porcentaje de personas interesadas en adoptar cada tipo de mascota:</w:t>
+      </w:r>
+      <w:r>
+        <w:br/>
+      </w:r>
+      <w:r>
+        <w:drawing>
+          <wp:inline>
+            <wp:extent cx="1439999" cy="890181"/>
+            <wp:effectExtent b="0" l="0" r="0" t="0"/>
+            <wp:docPr descr="image" title="" id="237" name="Picture"/>
+            <a:graphic>
+              <a:graphicData uri="http://schemas.openxmlformats.org/drawingml/2006/picture">
+                <pic:pic>
+                  <pic:nvPicPr>
+                    <pic:cNvPr descr="media/supplements1/exercise11/image01_solution.svg" id="238" name="Picture"/>
+                    <pic:cNvPicPr>
+                      <a:picLocks noChangeArrowheads="1" noChangeAspect="1"/>
+                    </pic:cNvPicPr>
+                  </pic:nvPicPr>
+                  <pic:blipFill>
+                    <a:blip r:embed="rId239">
+                      <a:extLst>
+                        <a:ext uri="{28A0092B-C50C-407E-A947-70E740481C1C}">
+                          <a14:useLocalDpi xmlns:a14="http://schemas.microsoft.com/office/drawing/2010/main" val="0"/>
+                        </a:ext>
+                        <a:ext uri="{96DAC541-7B7A-43D3-8B79-37D633B846F1}">
+                          <asvg:svgBlip xmlns:asvg="http://schemas.microsoft.com/office/drawing/2016/SVG/main" r:embed="rId236"/>
+                        </a:ext>
+                      </a:extLst>
+                    </a:blip>
+                    <a:stretch>
+                      <a:fillRect/>
+                    </a:stretch>
+                  </pic:blipFill>
+                  <pic:spPr bwMode="auto">
+                    <a:xfrm>
+                      <a:off x="0" y="0"/>
+                      <a:ext cx="1439999" cy="890181"/>
+                    </a:xfrm>
+                    <a:prstGeom prst="rect">
+                      <a:avLst/>
+                    </a:prstGeom>
+                    <a:noFill/>
+                    <a:ln w="9525">
+                      <a:noFill/>
+                      <a:headEnd/>
+                      <a:tailEnd/>
+                    </a:ln>
+                  </pic:spPr>
+                </pic:pic>
+              </a:graphicData>
+            </a:graphic>
+          </wp:inline>
+        </w:drawing>
+      </w:r>
+    </w:p>
+    <w:p>
+      <w:pPr>
+        <w:numPr>
+          <w:ilvl w:val="0"/>
+          <w:numId w:val="1001"/>
+        </w:numPr>
+      </w:pPr>
+      <w:r>
+        <w:rPr>
+          <w:b/>
+          <w:bCs/>
+        </w:rPr>
+        <w:t xml:space="preserve">Escenario</w:t>
+      </w:r>
+      <w:r>
+        <w:br/>
+      </w:r>
+      <w:r>
+        <w:t xml:space="preserve">El líder de un programa de adopción de mascotas encuestó a 180 personas para conocer qué animal les interesaría adoptar. Del total de encuestados, el 60% adoptaría un loro, el 30% adoptaría un(a) hamster y el 10% adoptaría un(a) ratón.</w:t>
+      </w:r>
+    </w:p>
+    <w:p>
+      <w:pPr>
+        <w:numPr>
+          <w:ilvl w:val="0"/>
+          <w:numId w:val="1000"/>
+        </w:numPr>
+      </w:pPr>
+      <w:r>
+        <w:t xml:space="preserve">¿Cuál de las siguientes representaciones muestra correctamente la información recolectada en la encuesta?</w:t>
+      </w:r>
+      <w:r>
+        <w:br/>
+      </w:r>
+    </w:p>
+    <w:p>
+      <w:pPr>
+        <w:numPr>
+          <w:ilvl w:val="1"/>
+          <w:numId w:val="1013"/>
+        </w:numPr>
+      </w:pPr>
+      <w:r>
+        <w:drawing>
+          <wp:inline>
+            <wp:extent cx="3657600" cy="2924175"/>
+            <wp:effectExtent b="0" l="0" r="0" t="0"/>
+            <wp:docPr descr="image" title="" id="241" name="Picture"/>
+            <a:graphic>
+              <a:graphicData uri="http://schemas.openxmlformats.org/drawingml/2006/picture">
+                <pic:pic>
+                  <pic:nvPicPr>
+                    <pic:cNvPr descr="media/supplements1/exercise12/BarraVertical-1.svg" id="242" name="Picture"/>
+                    <pic:cNvPicPr>
+                      <a:picLocks noChangeArrowheads="1" noChangeAspect="1"/>
+                    </pic:cNvPicPr>
+                  </pic:nvPicPr>
+                  <pic:blipFill>
+                    <a:blip r:embed="rId243">
+                      <a:extLst>
+                        <a:ext uri="{28A0092B-C50C-407E-A947-70E740481C1C}">
+                          <a14:useLocalDpi xmlns:a14="http://schemas.microsoft.com/office/drawing/2010/main" val="0"/>
+                        </a:ext>
+                        <a:ext uri="{96DAC541-7B7A-43D3-8B79-37D633B846F1}">
+                          <asvg:svgBlip xmlns:asvg="http://schemas.microsoft.com/office/drawing/2016/SVG/main" r:embed="rId240"/>
+                        </a:ext>
+                      </a:extLst>
+                    </a:blip>
+                    <a:stretch>
+                      <a:fillRect/>
+                    </a:stretch>
+                  </pic:blipFill>
+                  <pic:spPr bwMode="auto">
+                    <a:xfrm>
+                      <a:off x="0" y="0"/>
+                      <a:ext cx="3657600" cy="2924175"/>
+                    </a:xfrm>
+                    <a:prstGeom prst="rect">
+                      <a:avLst/>
+                    </a:prstGeom>
+                    <a:noFill/>
+                    <a:ln w="9525">
+                      <a:noFill/>
+                      <a:headEnd/>
+                      <a:tailEnd/>
+                    </a:ln>
+                  </pic:spPr>
+                </pic:pic>
+              </a:graphicData>
+            </a:graphic>
+          </wp:inline>
+        </w:drawing>
+      </w:r>
+    </w:p>
+    <w:p>
+      <w:pPr>
+        <w:numPr>
+          <w:ilvl w:val="1"/>
+          <w:numId w:val="1013"/>
+        </w:numPr>
+      </w:pPr>
+      <w:r>
+        <w:drawing>
+          <wp:inline>
+            <wp:extent cx="1439999" cy="866548"/>
+            <wp:effectExtent b="0" l="0" r="0" t="0"/>
+            <wp:docPr descr="image" title="" id="245" name="Picture"/>
+            <a:graphic>
+              <a:graphicData uri="http://schemas.openxmlformats.org/drawingml/2006/picture">
+                <pic:pic>
+                  <pic:nvPicPr>
+                    <pic:cNvPr descr="media/supplements1/exercise12/image01.svg" id="246" name="Picture"/>
+                    <pic:cNvPicPr>
+                      <a:picLocks noChangeArrowheads="1" noChangeAspect="1"/>
+                    </pic:cNvPicPr>
+                  </pic:nvPicPr>
+                  <pic:blipFill>
+                    <a:blip r:embed="rId247">
+                      <a:extLst>
+                        <a:ext uri="{28A0092B-C50C-407E-A947-70E740481C1C}">
+                          <a14:useLocalDpi xmlns:a14="http://schemas.microsoft.com/office/drawing/2010/main" val="0"/>
+                        </a:ext>
+                        <a:ext uri="{96DAC541-7B7A-43D3-8B79-37D633B846F1}">
+                          <asvg:svgBlip xmlns:asvg="http://schemas.microsoft.com/office/drawing/2016/SVG/main" r:embed="rId244"/>
+                        </a:ext>
+                      </a:extLst>
+                    </a:blip>
+                    <a:stretch>
+                      <a:fillRect/>
+                    </a:stretch>
+                  </pic:blipFill>
+                  <pic:spPr bwMode="auto">
+                    <a:xfrm>
+                      <a:off x="0" y="0"/>
+                      <a:ext cx="1439999" cy="866548"/>
+                    </a:xfrm>
+                    <a:prstGeom prst="rect">
+                      <a:avLst/>
+                    </a:prstGeom>
+                    <a:noFill/>
+                    <a:ln w="9525">
+                      <a:noFill/>
+                      <a:headEnd/>
+                      <a:tailEnd/>
+                    </a:ln>
+                  </pic:spPr>
+                </pic:pic>
+              </a:graphicData>
+            </a:graphic>
+          </wp:inline>
+        </w:drawing>
+      </w:r>
+    </w:p>
+    <w:p>
+      <w:pPr>
+        <w:numPr>
+          <w:ilvl w:val="1"/>
+          <w:numId w:val="1013"/>
+        </w:numPr>
+      </w:pPr>
+      <w:r>
+        <w:drawing>
+          <wp:inline>
+            <wp:extent cx="3657600" cy="2924175"/>
+            <wp:effectExtent b="0" l="0" r="0" t="0"/>
+            <wp:docPr descr="image" title="" id="249" name="Picture"/>
+            <a:graphic>
+              <a:graphicData uri="http://schemas.openxmlformats.org/drawingml/2006/picture">
+                <pic:pic>
+                  <pic:nvPicPr>
+                    <pic:cNvPr descr="media/supplements1/exercise12/Torta-5.svg" id="250" name="Picture"/>
+                    <pic:cNvPicPr>
+                      <a:picLocks noChangeArrowheads="1" noChangeAspect="1"/>
+                    </pic:cNvPicPr>
+                  </pic:nvPicPr>
+                  <pic:blipFill>
+                    <a:blip r:embed="rId251">
+                      <a:extLst>
+                        <a:ext uri="{28A0092B-C50C-407E-A947-70E740481C1C}">
+                          <a14:useLocalDpi xmlns:a14="http://schemas.microsoft.com/office/drawing/2010/main" val="0"/>
+                        </a:ext>
+                        <a:ext uri="{96DAC541-7B7A-43D3-8B79-37D633B846F1}">
+                          <asvg:svgBlip xmlns:asvg="http://schemas.microsoft.com/office/drawing/2016/SVG/main" r:embed="rId248"/>
+                        </a:ext>
+                      </a:extLst>
+                    </a:blip>
+                    <a:stretch>
+                      <a:fillRect/>
+                    </a:stretch>
+                  </pic:blipFill>
+                  <pic:spPr bwMode="auto">
+                    <a:xfrm>
+                      <a:off x="0" y="0"/>
+                      <a:ext cx="3657600" cy="2924175"/>
+                    </a:xfrm>
+                    <a:prstGeom prst="rect">
+                      <a:avLst/>
+                    </a:prstGeom>
+                    <a:noFill/>
+                    <a:ln w="9525">
+                      <a:noFill/>
+                      <a:headEnd/>
+                      <a:tailEnd/>
+                    </a:ln>
+                  </pic:spPr>
+                </pic:pic>
+              </a:graphicData>
+            </a:graphic>
+          </wp:inline>
+        </w:drawing>
+      </w:r>
+    </w:p>
+    <w:p>
+      <w:pPr>
+        <w:numPr>
+          <w:ilvl w:val="1"/>
+          <w:numId w:val="1013"/>
+        </w:numPr>
+      </w:pPr>
+      <w:r>
+        <w:drawing>
+          <wp:inline>
+            <wp:extent cx="3467100" cy="3200400"/>
+            <wp:effectExtent b="0" l="0" r="0" t="0"/>
+            <wp:docPr descr="image" title="" id="253" name="Picture"/>
+            <a:graphic>
+              <a:graphicData uri="http://schemas.openxmlformats.org/drawingml/2006/picture">
+                <pic:pic>
+                  <pic:nvPicPr>
+                    <pic:cNvPr descr="media/supplements1/exercise12/BarraHorizontal-3.svg" id="254" name="Picture"/>
+                    <pic:cNvPicPr>
+                      <a:picLocks noChangeArrowheads="1" noChangeAspect="1"/>
+                    </pic:cNvPicPr>
+                  </pic:nvPicPr>
+                  <pic:blipFill>
+                    <a:blip r:embed="rId255">
+                      <a:extLst>
+                        <a:ext uri="{28A0092B-C50C-407E-A947-70E740481C1C}">
+                          <a14:useLocalDpi xmlns:a14="http://schemas.microsoft.com/office/drawing/2010/main" val="0"/>
+                        </a:ext>
+                        <a:ext uri="{96DAC541-7B7A-43D3-8B79-37D633B846F1}">
+                          <asvg:svgBlip xmlns:asvg="http://schemas.microsoft.com/office/drawing/2016/SVG/main" r:embed="rId252"/>
+                        </a:ext>
+                      </a:extLst>
+                    </a:blip>
+                    <a:stretch>
+                      <a:fillRect/>
+                    </a:stretch>
+                  </pic:blipFill>
+                  <pic:spPr bwMode="auto">
+                    <a:xfrm>
+                      <a:off x="0" y="0"/>
+                      <a:ext cx="3467100" cy="3200400"/>
+                    </a:xfrm>
+                    <a:prstGeom prst="rect">
+                      <a:avLst/>
+                    </a:prstGeom>
+                    <a:noFill/>
+                    <a:ln w="9525">
+                      <a:noFill/>
+                      <a:headEnd/>
+                      <a:tailEnd/>
+                    </a:ln>
+                  </pic:spPr>
+                </pic:pic>
+              </a:graphicData>
+            </a:graphic>
+          </wp:inline>
+        </w:drawing>
+      </w:r>
+    </w:p>
+    <w:p>
+      <w:pPr>
+        <w:numPr>
+          <w:ilvl w:val="0"/>
+          <w:numId w:val="1000"/>
+        </w:numPr>
+      </w:pPr>
+      <w:r>
+        <w:rPr>
+          <w:b/>
+          <w:bCs/>
+        </w:rPr>
+        <w:t xml:space="preserve">Retroalimentación</w:t>
+      </w:r>
+      <w:r>
+        <w:br/>
+      </w:r>
+      <w:r>
+        <w:t xml:space="preserve">Esta tabla representa la información recolectada en la encuesta, mostrando el porcentaje de personas interesadas en adoptar cada tipo de mascota:</w:t>
+      </w:r>
+      <w:r>
+        <w:br/>
+      </w:r>
+      <w:r>
+        <w:drawing>
+          <wp:inline>
+            <wp:extent cx="1439999" cy="866548"/>
+            <wp:effectExtent b="0" l="0" r="0" t="0"/>
+            <wp:docPr descr="image" title="" id="257" name="Picture"/>
+            <a:graphic>
+              <a:graphicData uri="http://schemas.openxmlformats.org/drawingml/2006/picture">
+                <pic:pic>
+                  <pic:nvPicPr>
+                    <pic:cNvPr descr="media/supplements1/exercise12/image01_solution.svg" id="258" name="Picture"/>
+                    <pic:cNvPicPr>
+                      <a:picLocks noChangeArrowheads="1" noChangeAspect="1"/>
+                    </pic:cNvPicPr>
+                  </pic:nvPicPr>
+                  <pic:blipFill>
+                    <a:blip r:embed="rId259">
+                      <a:extLst>
+                        <a:ext uri="{28A0092B-C50C-407E-A947-70E740481C1C}">
+                          <a14:useLocalDpi xmlns:a14="http://schemas.microsoft.com/office/drawing/2010/main" val="0"/>
+                        </a:ext>
+                        <a:ext uri="{96DAC541-7B7A-43D3-8B79-37D633B846F1}">
+                          <asvg:svgBlip xmlns:asvg="http://schemas.microsoft.com/office/drawing/2016/SVG/main" r:embed="rId256"/>
+                        </a:ext>
+                      </a:extLst>
+                    </a:blip>
+                    <a:stretch>
+                      <a:fillRect/>
+                    </a:stretch>
+                  </pic:blipFill>
+                  <pic:spPr bwMode="auto">
+                    <a:xfrm>
+                      <a:off x="0" y="0"/>
+                      <a:ext cx="1439999" cy="866548"/>
+                    </a:xfrm>
+                    <a:prstGeom prst="rect">
+                      <a:avLst/>
+                    </a:prstGeom>
+                    <a:noFill/>
+                    <a:ln w="9525">
+                      <a:noFill/>
+                      <a:headEnd/>
+                      <a:tailEnd/>
+                    </a:ln>
+                  </pic:spPr>
+                </pic:pic>
+              </a:graphicData>
+            </a:graphic>
+          </wp:inline>
+        </w:drawing>
+      </w:r>
+    </w:p>
+    <w:p>
+      <w:pPr>
+        <w:numPr>
+          <w:ilvl w:val="0"/>
+          <w:numId w:val="1001"/>
+        </w:numPr>
+      </w:pPr>
+      <w:r>
+        <w:rPr>
+          <w:b/>
+          <w:bCs/>
+        </w:rPr>
+        <w:t xml:space="preserve">Escenario</w:t>
+      </w:r>
+      <w:r>
+        <w:br/>
+      </w:r>
+      <w:r>
+        <w:t xml:space="preserve">El líder de un programa de adopción de mascotas encuestó a 540 personas para conocer qué animal les interesaría adoptar. Del total de encuestados, el 25% adoptaría un canario, el 20% adoptaría un(a) burro y el 55% adoptaría un(a) gato.</w:t>
+      </w:r>
+    </w:p>
+    <w:p>
+      <w:pPr>
+        <w:numPr>
+          <w:ilvl w:val="0"/>
+          <w:numId w:val="1000"/>
+        </w:numPr>
+      </w:pPr>
+      <w:r>
+        <w:t xml:space="preserve">¿Cuál de las siguientes representaciones muestra correctamente la información recolectada en la encuesta?</w:t>
+      </w:r>
+      <w:r>
+        <w:br/>
+      </w:r>
+    </w:p>
+    <w:p>
+      <w:pPr>
+        <w:numPr>
+          <w:ilvl w:val="1"/>
+          <w:numId w:val="1014"/>
+        </w:numPr>
+      </w:pPr>
+      <w:r>
+        <w:drawing>
+          <wp:inline>
+            <wp:extent cx="1439999" cy="890181"/>
+            <wp:effectExtent b="0" l="0" r="0" t="0"/>
+            <wp:docPr descr="image" title="" id="261" name="Picture"/>
+            <a:graphic>
+              <a:graphicData uri="http://schemas.openxmlformats.org/drawingml/2006/picture">
+                <pic:pic>
+                  <pic:nvPicPr>
+                    <pic:cNvPr descr="media/supplements1/exercise13/image01.svg" id="262" name="Picture"/>
+                    <pic:cNvPicPr>
+                      <a:picLocks noChangeArrowheads="1" noChangeAspect="1"/>
+                    </pic:cNvPicPr>
+                  </pic:nvPicPr>
+                  <pic:blipFill>
+                    <a:blip r:embed="rId263">
+                      <a:extLst>
+                        <a:ext uri="{28A0092B-C50C-407E-A947-70E740481C1C}">
+                          <a14:useLocalDpi xmlns:a14="http://schemas.microsoft.com/office/drawing/2010/main" val="0"/>
+                        </a:ext>
+                        <a:ext uri="{96DAC541-7B7A-43D3-8B79-37D633B846F1}">
+                          <asvg:svgBlip xmlns:asvg="http://schemas.microsoft.com/office/drawing/2016/SVG/main" r:embed="rId260"/>
+                        </a:ext>
+                      </a:extLst>
+                    </a:blip>
+                    <a:stretch>
+                      <a:fillRect/>
+                    </a:stretch>
+                  </pic:blipFill>
+                  <pic:spPr bwMode="auto">
+                    <a:xfrm>
+                      <a:off x="0" y="0"/>
+                      <a:ext cx="1439999" cy="890181"/>
+                    </a:xfrm>
+                    <a:prstGeom prst="rect">
+                      <a:avLst/>
+                    </a:prstGeom>
+                    <a:noFill/>
+                    <a:ln w="9525">
+                      <a:noFill/>
+                      <a:headEnd/>
+                      <a:tailEnd/>
+                    </a:ln>
+                  </pic:spPr>
+                </pic:pic>
+              </a:graphicData>
+            </a:graphic>
+          </wp:inline>
+        </w:drawing>
+      </w:r>
+    </w:p>
+    <w:p>
+      <w:pPr>
+        <w:numPr>
+          <w:ilvl w:val="1"/>
+          <w:numId w:val="1014"/>
+        </w:numPr>
+      </w:pPr>
+      <w:r>
+        <w:drawing>
+          <wp:inline>
+            <wp:extent cx="3467100" cy="3200400"/>
+            <wp:effectExtent b="0" l="0" r="0" t="0"/>
+            <wp:docPr descr="image" title="" id="265" name="Picture"/>
+            <a:graphic>
+              <a:graphicData uri="http://schemas.openxmlformats.org/drawingml/2006/picture">
+                <pic:pic>
+                  <pic:nvPicPr>
+                    <pic:cNvPr descr="media/supplements1/exercise13/BarraHorizontal-3.svg" id="266" name="Picture"/>
+                    <pic:cNvPicPr>
+                      <a:picLocks noChangeArrowheads="1" noChangeAspect="1"/>
+                    </pic:cNvPicPr>
+                  </pic:nvPicPr>
+                  <pic:blipFill>
+                    <a:blip r:embed="rId267">
+                      <a:extLst>
+                        <a:ext uri="{28A0092B-C50C-407E-A947-70E740481C1C}">
+                          <a14:useLocalDpi xmlns:a14="http://schemas.microsoft.com/office/drawing/2010/main" val="0"/>
+                        </a:ext>
+                        <a:ext uri="{96DAC541-7B7A-43D3-8B79-37D633B846F1}">
+                          <asvg:svgBlip xmlns:asvg="http://schemas.microsoft.com/office/drawing/2016/SVG/main" r:embed="rId264"/>
+                        </a:ext>
+                      </a:extLst>
+                    </a:blip>
+                    <a:stretch>
+                      <a:fillRect/>
+                    </a:stretch>
+                  </pic:blipFill>
+                  <pic:spPr bwMode="auto">
+                    <a:xfrm>
+                      <a:off x="0" y="0"/>
+                      <a:ext cx="3467100" cy="3200400"/>
+                    </a:xfrm>
+                    <a:prstGeom prst="rect">
+                      <a:avLst/>
+                    </a:prstGeom>
+                    <a:noFill/>
+                    <a:ln w="9525">
+                      <a:noFill/>
+                      <a:headEnd/>
+                      <a:tailEnd/>
+                    </a:ln>
+                  </pic:spPr>
+                </pic:pic>
+              </a:graphicData>
+            </a:graphic>
+          </wp:inline>
+        </w:drawing>
+      </w:r>
+    </w:p>
+    <w:p>
+      <w:pPr>
+        <w:numPr>
+          <w:ilvl w:val="1"/>
+          <w:numId w:val="1014"/>
+        </w:numPr>
+      </w:pPr>
+      <w:r>
+        <w:drawing>
+          <wp:inline>
+            <wp:extent cx="3657600" cy="2924175"/>
+            <wp:effectExtent b="0" l="0" r="0" t="0"/>
+            <wp:docPr descr="image" title="" id="269" name="Picture"/>
+            <a:graphic>
+              <a:graphicData uri="http://schemas.openxmlformats.org/drawingml/2006/picture">
+                <pic:pic>
+                  <pic:nvPicPr>
+                    <pic:cNvPr descr="media/supplements1/exercise13/Torta-5.svg" id="270" name="Picture"/>
+                    <pic:cNvPicPr>
+                      <a:picLocks noChangeArrowheads="1" noChangeAspect="1"/>
+                    </pic:cNvPicPr>
+                  </pic:nvPicPr>
+                  <pic:blipFill>
+                    <a:blip r:embed="rId271">
+                      <a:extLst>
+                        <a:ext uri="{28A0092B-C50C-407E-A947-70E740481C1C}">
+                          <a14:useLocalDpi xmlns:a14="http://schemas.microsoft.com/office/drawing/2010/main" val="0"/>
+                        </a:ext>
+                        <a:ext uri="{96DAC541-7B7A-43D3-8B79-37D633B846F1}">
+                          <asvg:svgBlip xmlns:asvg="http://schemas.microsoft.com/office/drawing/2016/SVG/main" r:embed="rId268"/>
+                        </a:ext>
+                      </a:extLst>
+                    </a:blip>
+                    <a:stretch>
+                      <a:fillRect/>
+                    </a:stretch>
+                  </pic:blipFill>
+                  <pic:spPr bwMode="auto">
+                    <a:xfrm>
+                      <a:off x="0" y="0"/>
+                      <a:ext cx="3657600" cy="2924175"/>
+                    </a:xfrm>
+                    <a:prstGeom prst="rect">
+                      <a:avLst/>
+                    </a:prstGeom>
+                    <a:noFill/>
+                    <a:ln w="9525">
+                      <a:noFill/>
+                      <a:headEnd/>
+                      <a:tailEnd/>
+                    </a:ln>
+                  </pic:spPr>
+                </pic:pic>
+              </a:graphicData>
+            </a:graphic>
+          </wp:inline>
+        </w:drawing>
+      </w:r>
+    </w:p>
+    <w:p>
+      <w:pPr>
+        <w:numPr>
+          <w:ilvl w:val="1"/>
+          <w:numId w:val="1014"/>
+        </w:numPr>
+      </w:pPr>
+      <w:r>
+        <w:drawing>
+          <wp:inline>
+            <wp:extent cx="3657600" cy="2924175"/>
+            <wp:effectExtent b="0" l="0" r="0" t="0"/>
+            <wp:docPr descr="image" title="" id="273" name="Picture"/>
+            <a:graphic>
+              <a:graphicData uri="http://schemas.openxmlformats.org/drawingml/2006/picture">
+                <pic:pic>
+                  <pic:nvPicPr>
+                    <pic:cNvPr descr="media/supplements1/exercise13/BarraVertical-1.svg" id="274" name="Picture"/>
+                    <pic:cNvPicPr>
+                      <a:picLocks noChangeArrowheads="1" noChangeAspect="1"/>
+                    </pic:cNvPicPr>
+                  </pic:nvPicPr>
+                  <pic:blipFill>
+                    <a:blip r:embed="rId275">
+                      <a:extLst>
+                        <a:ext uri="{28A0092B-C50C-407E-A947-70E740481C1C}">
+                          <a14:useLocalDpi xmlns:a14="http://schemas.microsoft.com/office/drawing/2010/main" val="0"/>
+                        </a:ext>
+                        <a:ext uri="{96DAC541-7B7A-43D3-8B79-37D633B846F1}">
+                          <asvg:svgBlip xmlns:asvg="http://schemas.microsoft.com/office/drawing/2016/SVG/main" r:embed="rId272"/>
+                        </a:ext>
+                      </a:extLst>
+                    </a:blip>
+                    <a:stretch>
+                      <a:fillRect/>
+                    </a:stretch>
+                  </pic:blipFill>
+                  <pic:spPr bwMode="auto">
+                    <a:xfrm>
+                      <a:off x="0" y="0"/>
+                      <a:ext cx="3657600" cy="2924175"/>
+                    </a:xfrm>
+                    <a:prstGeom prst="rect">
+                      <a:avLst/>
+                    </a:prstGeom>
+                    <a:noFill/>
+                    <a:ln w="9525">
+                      <a:noFill/>
+                      <a:headEnd/>
+                      <a:tailEnd/>
+                    </a:ln>
+                  </pic:spPr>
+                </pic:pic>
+              </a:graphicData>
+            </a:graphic>
+          </wp:inline>
+        </w:drawing>
+      </w:r>
+    </w:p>
+    <w:p>
+      <w:pPr>
+        <w:numPr>
+          <w:ilvl w:val="0"/>
+          <w:numId w:val="1000"/>
+        </w:numPr>
+      </w:pPr>
+      <w:r>
+        <w:rPr>
+          <w:b/>
+          <w:bCs/>
+        </w:rPr>
+        <w:t xml:space="preserve">Retroalimentación</w:t>
+      </w:r>
+      <w:r>
+        <w:br/>
+      </w:r>
+      <w:r>
+        <w:t xml:space="preserve">Esta tabla representa la información recolectada en la encuesta, mostrando el porcentaje de personas interesadas en adoptar cada tipo de mascota:</w:t>
+      </w:r>
+      <w:r>
+        <w:br/>
+      </w:r>
+      <w:r>
+        <w:drawing>
+          <wp:inline>
+            <wp:extent cx="1439999" cy="890181"/>
+            <wp:effectExtent b="0" l="0" r="0" t="0"/>
+            <wp:docPr descr="image" title="" id="277" name="Picture"/>
+            <a:graphic>
+              <a:graphicData uri="http://schemas.openxmlformats.org/drawingml/2006/picture">
+                <pic:pic>
+                  <pic:nvPicPr>
+                    <pic:cNvPr descr="media/supplements1/exercise13/image01_solution.svg" id="278" name="Picture"/>
+                    <pic:cNvPicPr>
+                      <a:picLocks noChangeArrowheads="1" noChangeAspect="1"/>
+                    </pic:cNvPicPr>
+                  </pic:nvPicPr>
+                  <pic:blipFill>
+                    <a:blip r:embed="rId279">
+                      <a:extLst>
+                        <a:ext uri="{28A0092B-C50C-407E-A947-70E740481C1C}">
+                          <a14:useLocalDpi xmlns:a14="http://schemas.microsoft.com/office/drawing/2010/main" val="0"/>
+                        </a:ext>
+                        <a:ext uri="{96DAC541-7B7A-43D3-8B79-37D633B846F1}">
+                          <asvg:svgBlip xmlns:asvg="http://schemas.microsoft.com/office/drawing/2016/SVG/main" r:embed="rId276"/>
+                        </a:ext>
+                      </a:extLst>
+                    </a:blip>
+                    <a:stretch>
+                      <a:fillRect/>
+                    </a:stretch>
+                  </pic:blipFill>
+                  <pic:spPr bwMode="auto">
+                    <a:xfrm>
+                      <a:off x="0" y="0"/>
+                      <a:ext cx="1439999" cy="890181"/>
+                    </a:xfrm>
+                    <a:prstGeom prst="rect">
+                      <a:avLst/>
+                    </a:prstGeom>
+                    <a:noFill/>
+                    <a:ln w="9525">
+                      <a:noFill/>
+                      <a:headEnd/>
+                      <a:tailEnd/>
+                    </a:ln>
+                  </pic:spPr>
+                </pic:pic>
+              </a:graphicData>
+            </a:graphic>
+          </wp:inline>
+        </w:drawing>
+      </w:r>
+    </w:p>
+    <w:p>
+      <w:pPr>
+        <w:numPr>
+          <w:ilvl w:val="0"/>
+          <w:numId w:val="1001"/>
+        </w:numPr>
+      </w:pPr>
+      <w:r>
+        <w:rPr>
+          <w:b/>
+          <w:bCs/>
+        </w:rPr>
+        <w:t xml:space="preserve">Escenario</w:t>
+      </w:r>
+      <w:r>
+        <w:br/>
+      </w:r>
+      <w:r>
+        <w:t xml:space="preserve">El líder de un programa de adopción de mascotas encuestó a 480 personas para conocer qué animal les interesaría adoptar. Del total de encuestados, el 5% adoptaría un lagarto, el 40% adoptaría un(a) tortuga y el 55% adoptaría un(a) pavo.</w:t>
+      </w:r>
+    </w:p>
+    <w:p>
+      <w:pPr>
+        <w:numPr>
+          <w:ilvl w:val="0"/>
+          <w:numId w:val="1000"/>
+        </w:numPr>
+      </w:pPr>
+      <w:r>
+        <w:t xml:space="preserve">¿Cuál de las siguientes representaciones muestra correctamente la información recolectada en la encuesta?</w:t>
+      </w:r>
+      <w:r>
+        <w:br/>
+      </w:r>
+    </w:p>
+    <w:p>
+      <w:pPr>
+        <w:numPr>
+          <w:ilvl w:val="1"/>
+          <w:numId w:val="1015"/>
+        </w:numPr>
+      </w:pPr>
+      <w:r>
+        <w:drawing>
+          <wp:inline>
+            <wp:extent cx="3657600" cy="2924175"/>
+            <wp:effectExtent b="0" l="0" r="0" t="0"/>
+            <wp:docPr descr="image" title="" id="281" name="Picture"/>
+            <a:graphic>
+              <a:graphicData uri="http://schemas.openxmlformats.org/drawingml/2006/picture">
+                <pic:pic>
+                  <pic:nvPicPr>
+                    <pic:cNvPr descr="media/supplements1/exercise14/Torta-5.svg" id="282" name="Picture"/>
+                    <pic:cNvPicPr>
+                      <a:picLocks noChangeArrowheads="1" noChangeAspect="1"/>
+                    </pic:cNvPicPr>
+                  </pic:nvPicPr>
+                  <pic:blipFill>
+                    <a:blip r:embed="rId283">
+                      <a:extLst>
+                        <a:ext uri="{28A0092B-C50C-407E-A947-70E740481C1C}">
+                          <a14:useLocalDpi xmlns:a14="http://schemas.microsoft.com/office/drawing/2010/main" val="0"/>
+                        </a:ext>
+                        <a:ext uri="{96DAC541-7B7A-43D3-8B79-37D633B846F1}">
+                          <asvg:svgBlip xmlns:asvg="http://schemas.microsoft.com/office/drawing/2016/SVG/main" r:embed="rId280"/>
+                        </a:ext>
+                      </a:extLst>
+                    </a:blip>
+                    <a:stretch>
+                      <a:fillRect/>
+                    </a:stretch>
+                  </pic:blipFill>
+                  <pic:spPr bwMode="auto">
+                    <a:xfrm>
+                      <a:off x="0" y="0"/>
+                      <a:ext cx="3657600" cy="2924175"/>
+                    </a:xfrm>
+                    <a:prstGeom prst="rect">
+                      <a:avLst/>
+                    </a:prstGeom>
+                    <a:noFill/>
+                    <a:ln w="9525">
+                      <a:noFill/>
+                      <a:headEnd/>
+                      <a:tailEnd/>
+                    </a:ln>
+                  </pic:spPr>
+                </pic:pic>
+              </a:graphicData>
+            </a:graphic>
+          </wp:inline>
+        </w:drawing>
+      </w:r>
+    </w:p>
+    <w:p>
+      <w:pPr>
+        <w:numPr>
+          <w:ilvl w:val="1"/>
+          <w:numId w:val="1015"/>
+        </w:numPr>
+      </w:pPr>
+      <w:r>
+        <w:drawing>
+          <wp:inline>
+            <wp:extent cx="1439999" cy="890181"/>
+            <wp:effectExtent b="0" l="0" r="0" t="0"/>
+            <wp:docPr descr="image" title="" id="285" name="Picture"/>
+            <a:graphic>
+              <a:graphicData uri="http://schemas.openxmlformats.org/drawingml/2006/picture">
+                <pic:pic>
+                  <pic:nvPicPr>
+                    <pic:cNvPr descr="media/supplements1/exercise14/image01.svg" id="286" name="Picture"/>
+                    <pic:cNvPicPr>
+                      <a:picLocks noChangeArrowheads="1" noChangeAspect="1"/>
+                    </pic:cNvPicPr>
+                  </pic:nvPicPr>
+                  <pic:blipFill>
+                    <a:blip r:embed="rId287">
+                      <a:extLst>
+                        <a:ext uri="{28A0092B-C50C-407E-A947-70E740481C1C}">
+                          <a14:useLocalDpi xmlns:a14="http://schemas.microsoft.com/office/drawing/2010/main" val="0"/>
+                        </a:ext>
+                        <a:ext uri="{96DAC541-7B7A-43D3-8B79-37D633B846F1}">
+                          <asvg:svgBlip xmlns:asvg="http://schemas.microsoft.com/office/drawing/2016/SVG/main" r:embed="rId284"/>
+                        </a:ext>
+                      </a:extLst>
+                    </a:blip>
+                    <a:stretch>
+                      <a:fillRect/>
+                    </a:stretch>
+                  </pic:blipFill>
+                  <pic:spPr bwMode="auto">
+                    <a:xfrm>
+                      <a:off x="0" y="0"/>
+                      <a:ext cx="1439999" cy="890181"/>
+                    </a:xfrm>
+                    <a:prstGeom prst="rect">
+                      <a:avLst/>
+                    </a:prstGeom>
+                    <a:noFill/>
+                    <a:ln w="9525">
+                      <a:noFill/>
+                      <a:headEnd/>
+                      <a:tailEnd/>
+                    </a:ln>
+                  </pic:spPr>
+                </pic:pic>
+              </a:graphicData>
+            </a:graphic>
+          </wp:inline>
+        </w:drawing>
+      </w:r>
+    </w:p>
+    <w:p>
+      <w:pPr>
+        <w:numPr>
+          <w:ilvl w:val="1"/>
+          <w:numId w:val="1015"/>
+        </w:numPr>
+      </w:pPr>
+      <w:r>
+        <w:drawing>
+          <wp:inline>
+            <wp:extent cx="3657600" cy="2924175"/>
+            <wp:effectExtent b="0" l="0" r="0" t="0"/>
+            <wp:docPr descr="image" title="" id="289" name="Picture"/>
+            <a:graphic>
+              <a:graphicData uri="http://schemas.openxmlformats.org/drawingml/2006/picture">
+                <pic:pic>
+                  <pic:nvPicPr>
+                    <pic:cNvPr descr="media/supplements1/exercise14/BarraVertical-1.svg" id="290" name="Picture"/>
+                    <pic:cNvPicPr>
+                      <a:picLocks noChangeArrowheads="1" noChangeAspect="1"/>
+                    </pic:cNvPicPr>
+                  </pic:nvPicPr>
+                  <pic:blipFill>
+                    <a:blip r:embed="rId291">
+                      <a:extLst>
+                        <a:ext uri="{28A0092B-C50C-407E-A947-70E740481C1C}">
+                          <a14:useLocalDpi xmlns:a14="http://schemas.microsoft.com/office/drawing/2010/main" val="0"/>
+                        </a:ext>
+                        <a:ext uri="{96DAC541-7B7A-43D3-8B79-37D633B846F1}">
+                          <asvg:svgBlip xmlns:asvg="http://schemas.microsoft.com/office/drawing/2016/SVG/main" r:embed="rId288"/>
+                        </a:ext>
+                      </a:extLst>
+                    </a:blip>
+                    <a:stretch>
+                      <a:fillRect/>
+                    </a:stretch>
+                  </pic:blipFill>
+                  <pic:spPr bwMode="auto">
+                    <a:xfrm>
+                      <a:off x="0" y="0"/>
+                      <a:ext cx="3657600" cy="2924175"/>
+                    </a:xfrm>
+                    <a:prstGeom prst="rect">
+                      <a:avLst/>
+                    </a:prstGeom>
+                    <a:noFill/>
+                    <a:ln w="9525">
+                      <a:noFill/>
+                      <a:headEnd/>
+                      <a:tailEnd/>
+                    </a:ln>
+                  </pic:spPr>
+                </pic:pic>
+              </a:graphicData>
+            </a:graphic>
+          </wp:inline>
+        </w:drawing>
+      </w:r>
+    </w:p>
+    <w:p>
+      <w:pPr>
+        <w:numPr>
+          <w:ilvl w:val="1"/>
+          <w:numId w:val="1015"/>
+        </w:numPr>
+      </w:pPr>
+      <w:r>
+        <w:drawing>
+          <wp:inline>
+            <wp:extent cx="3467100" cy="3200400"/>
+            <wp:effectExtent b="0" l="0" r="0" t="0"/>
+            <wp:docPr descr="image" title="" id="293" name="Picture"/>
+            <a:graphic>
+              <a:graphicData uri="http://schemas.openxmlformats.org/drawingml/2006/picture">
+                <pic:pic>
+                  <pic:nvPicPr>
+                    <pic:cNvPr descr="media/supplements1/exercise14/BarraHorizontal-3.svg" id="294" name="Picture"/>
+                    <pic:cNvPicPr>
+                      <a:picLocks noChangeArrowheads="1" noChangeAspect="1"/>
+                    </pic:cNvPicPr>
+                  </pic:nvPicPr>
+                  <pic:blipFill>
+                    <a:blip r:embed="rId295">
+                      <a:extLst>
+                        <a:ext uri="{28A0092B-C50C-407E-A947-70E740481C1C}">
+                          <a14:useLocalDpi xmlns:a14="http://schemas.microsoft.com/office/drawing/2010/main" val="0"/>
+                        </a:ext>
+                        <a:ext uri="{96DAC541-7B7A-43D3-8B79-37D633B846F1}">
+                          <asvg:svgBlip xmlns:asvg="http://schemas.microsoft.com/office/drawing/2016/SVG/main" r:embed="rId292"/>
+                        </a:ext>
+                      </a:extLst>
+                    </a:blip>
+                    <a:stretch>
+                      <a:fillRect/>
+                    </a:stretch>
+                  </pic:blipFill>
+                  <pic:spPr bwMode="auto">
+                    <a:xfrm>
+                      <a:off x="0" y="0"/>
+                      <a:ext cx="3467100" cy="3200400"/>
+                    </a:xfrm>
+                    <a:prstGeom prst="rect">
+                      <a:avLst/>
+                    </a:prstGeom>
+                    <a:noFill/>
+                    <a:ln w="9525">
+                      <a:noFill/>
+                      <a:headEnd/>
+                      <a:tailEnd/>
+                    </a:ln>
+                  </pic:spPr>
+                </pic:pic>
+              </a:graphicData>
+            </a:graphic>
+          </wp:inline>
+        </w:drawing>
+      </w:r>
+    </w:p>
+    <w:p>
+      <w:pPr>
+        <w:numPr>
+          <w:ilvl w:val="0"/>
+          <w:numId w:val="1000"/>
+        </w:numPr>
+      </w:pPr>
+      <w:r>
+        <w:rPr>
+          <w:b/>
+          <w:bCs/>
+        </w:rPr>
+        <w:t xml:space="preserve">Retroalimentación</w:t>
+      </w:r>
+      <w:r>
+        <w:br/>
+      </w:r>
+      <w:r>
+        <w:t xml:space="preserve">Esta tabla representa la información recolectada en la encuesta, mostrando el porcentaje de personas interesadas en adoptar cada tipo de mascota:</w:t>
+      </w:r>
+      <w:r>
+        <w:br/>
+      </w:r>
+      <w:r>
+        <w:drawing>
+          <wp:inline>
+            <wp:extent cx="1439999" cy="890181"/>
+            <wp:effectExtent b="0" l="0" r="0" t="0"/>
+            <wp:docPr descr="image" title="" id="297" name="Picture"/>
+            <a:graphic>
+              <a:graphicData uri="http://schemas.openxmlformats.org/drawingml/2006/picture">
+                <pic:pic>
+                  <pic:nvPicPr>
+                    <pic:cNvPr descr="media/supplements1/exercise14/image01_solution.svg" id="298" name="Picture"/>
+                    <pic:cNvPicPr>
+                      <a:picLocks noChangeArrowheads="1" noChangeAspect="1"/>
+                    </pic:cNvPicPr>
+                  </pic:nvPicPr>
+                  <pic:blipFill>
+                    <a:blip r:embed="rId299">
+                      <a:extLst>
+                        <a:ext uri="{28A0092B-C50C-407E-A947-70E740481C1C}">
+                          <a14:useLocalDpi xmlns:a14="http://schemas.microsoft.com/office/drawing/2010/main" val="0"/>
+                        </a:ext>
+                        <a:ext uri="{96DAC541-7B7A-43D3-8B79-37D633B846F1}">
+                          <asvg:svgBlip xmlns:asvg="http://schemas.microsoft.com/office/drawing/2016/SVG/main" r:embed="rId296"/>
+                        </a:ext>
+                      </a:extLst>
+                    </a:blip>
+                    <a:stretch>
+                      <a:fillRect/>
+                    </a:stretch>
+                  </pic:blipFill>
+                  <pic:spPr bwMode="auto">
+                    <a:xfrm>
+                      <a:off x="0" y="0"/>
+                      <a:ext cx="1439999" cy="890181"/>
+                    </a:xfrm>
+                    <a:prstGeom prst="rect">
+                      <a:avLst/>
+                    </a:prstGeom>
+                    <a:noFill/>
+                    <a:ln w="9525">
+                      <a:noFill/>
+                      <a:headEnd/>
+                      <a:tailEnd/>
+                    </a:ln>
+                  </pic:spPr>
+                </pic:pic>
+              </a:graphicData>
+            </a:graphic>
+          </wp:inline>
+        </w:drawing>
+      </w:r>
+    </w:p>
+    <w:p>
+      <w:pPr>
+        <w:numPr>
+          <w:ilvl w:val="0"/>
+          <w:numId w:val="1001"/>
+        </w:numPr>
+      </w:pPr>
+      <w:r>
+        <w:rPr>
+          <w:b/>
+          <w:bCs/>
+        </w:rPr>
+        <w:t xml:space="preserve">Escenario</w:t>
+      </w:r>
+      <w:r>
+        <w:br/>
+      </w:r>
+      <w:r>
+        <w:t xml:space="preserve">El líder de un programa de adopción de mascotas encuestó a 300 personas para conocer qué animal les interesaría adoptar. Del total de encuestados, el 10% adoptaría un perro, el 15% adoptaría un(a) hurón y el 75% adoptaría un(a) serpiente.</w:t>
+      </w:r>
+    </w:p>
+    <w:p>
+      <w:pPr>
+        <w:numPr>
+          <w:ilvl w:val="0"/>
+          <w:numId w:val="1000"/>
+        </w:numPr>
+      </w:pPr>
+      <w:r>
+        <w:t xml:space="preserve">¿Cuál de las siguientes representaciones muestra correctamente la información recolectada en la encuesta?</w:t>
+      </w:r>
+      <w:r>
+        <w:br/>
+      </w:r>
+    </w:p>
+    <w:p>
+      <w:pPr>
+        <w:numPr>
+          <w:ilvl w:val="1"/>
+          <w:numId w:val="1016"/>
+        </w:numPr>
+      </w:pPr>
+      <w:r>
+        <w:drawing>
+          <wp:inline>
+            <wp:extent cx="3657600" cy="2924175"/>
+            <wp:effectExtent b="0" l="0" r="0" t="0"/>
+            <wp:docPr descr="image" title="" id="301" name="Picture"/>
+            <a:graphic>
+              <a:graphicData uri="http://schemas.openxmlformats.org/drawingml/2006/picture">
+                <pic:pic>
+                  <pic:nvPicPr>
+                    <pic:cNvPr descr="media/supplements1/exercise15/Torta-5.svg" id="302" name="Picture"/>
+                    <pic:cNvPicPr>
+                      <a:picLocks noChangeArrowheads="1" noChangeAspect="1"/>
+                    </pic:cNvPicPr>
+                  </pic:nvPicPr>
+                  <pic:blipFill>
+                    <a:blip r:embed="rId303">
+                      <a:extLst>
+                        <a:ext uri="{28A0092B-C50C-407E-A947-70E740481C1C}">
+                          <a14:useLocalDpi xmlns:a14="http://schemas.microsoft.com/office/drawing/2010/main" val="0"/>
+                        </a:ext>
+                        <a:ext uri="{96DAC541-7B7A-43D3-8B79-37D633B846F1}">
+                          <asvg:svgBlip xmlns:asvg="http://schemas.microsoft.com/office/drawing/2016/SVG/main" r:embed="rId300"/>
+                        </a:ext>
+                      </a:extLst>
+                    </a:blip>
+                    <a:stretch>
+                      <a:fillRect/>
+                    </a:stretch>
+                  </pic:blipFill>
+                  <pic:spPr bwMode="auto">
+                    <a:xfrm>
+                      <a:off x="0" y="0"/>
+                      <a:ext cx="3657600" cy="2924175"/>
+                    </a:xfrm>
+                    <a:prstGeom prst="rect">
+                      <a:avLst/>
+                    </a:prstGeom>
+                    <a:noFill/>
+                    <a:ln w="9525">
+                      <a:noFill/>
+                      <a:headEnd/>
+                      <a:tailEnd/>
+                    </a:ln>
+                  </pic:spPr>
+                </pic:pic>
+              </a:graphicData>
+            </a:graphic>
+          </wp:inline>
+        </w:drawing>
+      </w:r>
+    </w:p>
+    <w:p>
+      <w:pPr>
+        <w:numPr>
+          <w:ilvl w:val="1"/>
+          <w:numId w:val="1016"/>
+        </w:numPr>
+      </w:pPr>
+      <w:r>
+        <w:drawing>
+          <wp:inline>
+            <wp:extent cx="1439999" cy="829830"/>
+            <wp:effectExtent b="0" l="0" r="0" t="0"/>
+            <wp:docPr descr="image" title="" id="305" name="Picture"/>
+            <a:graphic>
+              <a:graphicData uri="http://schemas.openxmlformats.org/drawingml/2006/picture">
+                <pic:pic>
+                  <pic:nvPicPr>
+                    <pic:cNvPr descr="media/supplements1/exercise15/image01.svg" id="306" name="Picture"/>
+                    <pic:cNvPicPr>
+                      <a:picLocks noChangeArrowheads="1" noChangeAspect="1"/>
+                    </pic:cNvPicPr>
+                  </pic:nvPicPr>
+                  <pic:blipFill>
+                    <a:blip r:embed="rId307">
+                      <a:extLst>
+                        <a:ext uri="{28A0092B-C50C-407E-A947-70E740481C1C}">
+                          <a14:useLocalDpi xmlns:a14="http://schemas.microsoft.com/office/drawing/2010/main" val="0"/>
+                        </a:ext>
+                        <a:ext uri="{96DAC541-7B7A-43D3-8B79-37D633B846F1}">
+                          <asvg:svgBlip xmlns:asvg="http://schemas.microsoft.com/office/drawing/2016/SVG/main" r:embed="rId304"/>
+                        </a:ext>
+                      </a:extLst>
+                    </a:blip>
+                    <a:stretch>
+                      <a:fillRect/>
+                    </a:stretch>
+                  </pic:blipFill>
+                  <pic:spPr bwMode="auto">
+                    <a:xfrm>
+                      <a:off x="0" y="0"/>
+                      <a:ext cx="1439999" cy="829830"/>
+                    </a:xfrm>
+                    <a:prstGeom prst="rect">
+                      <a:avLst/>
+                    </a:prstGeom>
+                    <a:noFill/>
+                    <a:ln w="9525">
+                      <a:noFill/>
+                      <a:headEnd/>
+                      <a:tailEnd/>
+                    </a:ln>
+                  </pic:spPr>
+                </pic:pic>
+              </a:graphicData>
+            </a:graphic>
+          </wp:inline>
+        </w:drawing>
+      </w:r>
+    </w:p>
+    <w:p>
+      <w:pPr>
+        <w:numPr>
+          <w:ilvl w:val="1"/>
+          <w:numId w:val="1016"/>
+        </w:numPr>
+      </w:pPr>
+      <w:r>
+        <w:drawing>
+          <wp:inline>
+            <wp:extent cx="3467100" cy="3200400"/>
+            <wp:effectExtent b="0" l="0" r="0" t="0"/>
+            <wp:docPr descr="image" title="" id="309" name="Picture"/>
+            <a:graphic>
+              <a:graphicData uri="http://schemas.openxmlformats.org/drawingml/2006/picture">
+                <pic:pic>
+                  <pic:nvPicPr>
+                    <pic:cNvPr descr="media/supplements1/exercise15/BarraHorizontal-3.svg" id="310" name="Picture"/>
+                    <pic:cNvPicPr>
+                      <a:picLocks noChangeArrowheads="1" noChangeAspect="1"/>
+                    </pic:cNvPicPr>
+                  </pic:nvPicPr>
+                  <pic:blipFill>
+                    <a:blip r:embed="rId311">
+                      <a:extLst>
+                        <a:ext uri="{28A0092B-C50C-407E-A947-70E740481C1C}">
+                          <a14:useLocalDpi xmlns:a14="http://schemas.microsoft.com/office/drawing/2010/main" val="0"/>
+                        </a:ext>
+                        <a:ext uri="{96DAC541-7B7A-43D3-8B79-37D633B846F1}">
+                          <asvg:svgBlip xmlns:asvg="http://schemas.microsoft.com/office/drawing/2016/SVG/main" r:embed="rId308"/>
+                        </a:ext>
+                      </a:extLst>
+                    </a:blip>
+                    <a:stretch>
+                      <a:fillRect/>
+                    </a:stretch>
+                  </pic:blipFill>
+                  <pic:spPr bwMode="auto">
+                    <a:xfrm>
+                      <a:off x="0" y="0"/>
+                      <a:ext cx="3467100" cy="3200400"/>
+                    </a:xfrm>
+                    <a:prstGeom prst="rect">
+                      <a:avLst/>
+                    </a:prstGeom>
+                    <a:noFill/>
+                    <a:ln w="9525">
+                      <a:noFill/>
+                      <a:headEnd/>
+                      <a:tailEnd/>
+                    </a:ln>
+                  </pic:spPr>
+                </pic:pic>
+              </a:graphicData>
+            </a:graphic>
+          </wp:inline>
+        </w:drawing>
+      </w:r>
+    </w:p>
+    <w:p>
+      <w:pPr>
+        <w:numPr>
+          <w:ilvl w:val="1"/>
+          <w:numId w:val="1016"/>
+        </w:numPr>
+      </w:pPr>
+      <w:r>
+        <w:drawing>
+          <wp:inline>
+            <wp:extent cx="3657600" cy="2924175"/>
+            <wp:effectExtent b="0" l="0" r="0" t="0"/>
+            <wp:docPr descr="image" title="" id="313" name="Picture"/>
+            <a:graphic>
+              <a:graphicData uri="http://schemas.openxmlformats.org/drawingml/2006/picture">
+                <pic:pic>
+                  <pic:nvPicPr>
+                    <pic:cNvPr descr="media/supplements1/exercise15/BarraVertical-1.svg" id="314" name="Picture"/>
+                    <pic:cNvPicPr>
+                      <a:picLocks noChangeArrowheads="1" noChangeAspect="1"/>
+                    </pic:cNvPicPr>
+                  </pic:nvPicPr>
+                  <pic:blipFill>
+                    <a:blip r:embed="rId315">
+                      <a:extLst>
+                        <a:ext uri="{28A0092B-C50C-407E-A947-70E740481C1C}">
+                          <a14:useLocalDpi xmlns:a14="http://schemas.microsoft.com/office/drawing/2010/main" val="0"/>
+                        </a:ext>
+                        <a:ext uri="{96DAC541-7B7A-43D3-8B79-37D633B846F1}">
+                          <asvg:svgBlip xmlns:asvg="http://schemas.microsoft.com/office/drawing/2016/SVG/main" r:embed="rId312"/>
+                        </a:ext>
+                      </a:extLst>
+                    </a:blip>
+                    <a:stretch>
+                      <a:fillRect/>
+                    </a:stretch>
+                  </pic:blipFill>
+                  <pic:spPr bwMode="auto">
+                    <a:xfrm>
+                      <a:off x="0" y="0"/>
+                      <a:ext cx="3657600" cy="2924175"/>
+                    </a:xfrm>
+                    <a:prstGeom prst="rect">
+                      <a:avLst/>
+                    </a:prstGeom>
+                    <a:noFill/>
+                    <a:ln w="9525">
+                      <a:noFill/>
+                      <a:headEnd/>
+                      <a:tailEnd/>
+                    </a:ln>
+                  </pic:spPr>
+                </pic:pic>
+              </a:graphicData>
+            </a:graphic>
+          </wp:inline>
+        </w:drawing>
+      </w:r>
+    </w:p>
+    <w:p>
+      <w:pPr>
+        <w:numPr>
+          <w:ilvl w:val="0"/>
+          <w:numId w:val="1000"/>
+        </w:numPr>
+      </w:pPr>
+      <w:r>
+        <w:rPr>
+          <w:b/>
+          <w:bCs/>
+        </w:rPr>
+        <w:t xml:space="preserve">Retroalimentación</w:t>
+      </w:r>
+      <w:r>
+        <w:br/>
+      </w:r>
+      <w:r>
+        <w:t xml:space="preserve">Esta tabla representa la información recolectada en la encuesta, mostrando el porcentaje de personas interesadas en adoptar cada tipo de mascota:</w:t>
+      </w:r>
+      <w:r>
+        <w:br/>
+      </w:r>
+      <w:r>
+        <w:drawing>
+          <wp:inline>
+            <wp:extent cx="1439999" cy="829830"/>
+            <wp:effectExtent b="0" l="0" r="0" t="0"/>
+            <wp:docPr descr="image" title="" id="317" name="Picture"/>
+            <a:graphic>
+              <a:graphicData uri="http://schemas.openxmlformats.org/drawingml/2006/picture">
+                <pic:pic>
+                  <pic:nvPicPr>
+                    <pic:cNvPr descr="media/supplements1/exercise15/image01_solution.svg" id="318" name="Picture"/>
+                    <pic:cNvPicPr>
+                      <a:picLocks noChangeArrowheads="1" noChangeAspect="1"/>
+                    </pic:cNvPicPr>
+                  </pic:nvPicPr>
+                  <pic:blipFill>
+                    <a:blip r:embed="rId319">
+                      <a:extLst>
+                        <a:ext uri="{28A0092B-C50C-407E-A947-70E740481C1C}">
+                          <a14:useLocalDpi xmlns:a14="http://schemas.microsoft.com/office/drawing/2010/main" val="0"/>
+                        </a:ext>
+                        <a:ext uri="{96DAC541-7B7A-43D3-8B79-37D633B846F1}">
+                          <asvg:svgBlip xmlns:asvg="http://schemas.microsoft.com/office/drawing/2016/SVG/main" r:embed="rId316"/>
+                        </a:ext>
+                      </a:extLst>
+                    </a:blip>
+                    <a:stretch>
+                      <a:fillRect/>
+                    </a:stretch>
+                  </pic:blipFill>
+                  <pic:spPr bwMode="auto">
+                    <a:xfrm>
+                      <a:off x="0" y="0"/>
+                      <a:ext cx="1439999" cy="829830"/>
                     </a:xfrm>
                     <a:prstGeom prst="rect">
                       <a:avLst/>
@@ -1333,6 +5477,366 @@
     </w:lvlOverride>
   </w:num>
   <w:num w:numId="1004">
+    <w:abstractNumId w:val="99201"/>
+    <w:lvlOverride w:ilvl="0">
+      <w:startOverride w:val="1"/>
+    </w:lvlOverride>
+    <w:lvlOverride w:ilvl="1">
+      <w:startOverride w:val="1"/>
+    </w:lvlOverride>
+    <w:lvlOverride w:ilvl="2">
+      <w:startOverride w:val="1"/>
+    </w:lvlOverride>
+    <w:lvlOverride w:ilvl="3">
+      <w:startOverride w:val="1"/>
+    </w:lvlOverride>
+    <w:lvlOverride w:ilvl="4">
+      <w:startOverride w:val="1"/>
+    </w:lvlOverride>
+    <w:lvlOverride w:ilvl="5">
+      <w:startOverride w:val="1"/>
+    </w:lvlOverride>
+    <w:lvlOverride w:ilvl="6">
+      <w:startOverride w:val="1"/>
+    </w:lvlOverride>
+    <w:lvlOverride w:ilvl="7">
+      <w:startOverride w:val="1"/>
+    </w:lvlOverride>
+    <w:lvlOverride w:ilvl="8">
+      <w:startOverride w:val="1"/>
+    </w:lvlOverride>
+  </w:num>
+  <w:num w:numId="1005">
+    <w:abstractNumId w:val="99201"/>
+    <w:lvlOverride w:ilvl="0">
+      <w:startOverride w:val="1"/>
+    </w:lvlOverride>
+    <w:lvlOverride w:ilvl="1">
+      <w:startOverride w:val="1"/>
+    </w:lvlOverride>
+    <w:lvlOverride w:ilvl="2">
+      <w:startOverride w:val="1"/>
+    </w:lvlOverride>
+    <w:lvlOverride w:ilvl="3">
+      <w:startOverride w:val="1"/>
+    </w:lvlOverride>
+    <w:lvlOverride w:ilvl="4">
+      <w:startOverride w:val="1"/>
+    </w:lvlOverride>
+    <w:lvlOverride w:ilvl="5">
+      <w:startOverride w:val="1"/>
+    </w:lvlOverride>
+    <w:lvlOverride w:ilvl="6">
+      <w:startOverride w:val="1"/>
+    </w:lvlOverride>
+    <w:lvlOverride w:ilvl="7">
+      <w:startOverride w:val="1"/>
+    </w:lvlOverride>
+    <w:lvlOverride w:ilvl="8">
+      <w:startOverride w:val="1"/>
+    </w:lvlOverride>
+  </w:num>
+  <w:num w:numId="1006">
+    <w:abstractNumId w:val="99201"/>
+    <w:lvlOverride w:ilvl="0">
+      <w:startOverride w:val="1"/>
+    </w:lvlOverride>
+    <w:lvlOverride w:ilvl="1">
+      <w:startOverride w:val="1"/>
+    </w:lvlOverride>
+    <w:lvlOverride w:ilvl="2">
+      <w:startOverride w:val="1"/>
+    </w:lvlOverride>
+    <w:lvlOverride w:ilvl="3">
+      <w:startOverride w:val="1"/>
+    </w:lvlOverride>
+    <w:lvlOverride w:ilvl="4">
+      <w:startOverride w:val="1"/>
+    </w:lvlOverride>
+    <w:lvlOverride w:ilvl="5">
+      <w:startOverride w:val="1"/>
+    </w:lvlOverride>
+    <w:lvlOverride w:ilvl="6">
+      <w:startOverride w:val="1"/>
+    </w:lvlOverride>
+    <w:lvlOverride w:ilvl="7">
+      <w:startOverride w:val="1"/>
+    </w:lvlOverride>
+    <w:lvlOverride w:ilvl="8">
+      <w:startOverride w:val="1"/>
+    </w:lvlOverride>
+  </w:num>
+  <w:num w:numId="1007">
+    <w:abstractNumId w:val="99201"/>
+    <w:lvlOverride w:ilvl="0">
+      <w:startOverride w:val="1"/>
+    </w:lvlOverride>
+    <w:lvlOverride w:ilvl="1">
+      <w:startOverride w:val="1"/>
+    </w:lvlOverride>
+    <w:lvlOverride w:ilvl="2">
+      <w:startOverride w:val="1"/>
+    </w:lvlOverride>
+    <w:lvlOverride w:ilvl="3">
+      <w:startOverride w:val="1"/>
+    </w:lvlOverride>
+    <w:lvlOverride w:ilvl="4">
+      <w:startOverride w:val="1"/>
+    </w:lvlOverride>
+    <w:lvlOverride w:ilvl="5">
+      <w:startOverride w:val="1"/>
+    </w:lvlOverride>
+    <w:lvlOverride w:ilvl="6">
+      <w:startOverride w:val="1"/>
+    </w:lvlOverride>
+    <w:lvlOverride w:ilvl="7">
+      <w:startOverride w:val="1"/>
+    </w:lvlOverride>
+    <w:lvlOverride w:ilvl="8">
+      <w:startOverride w:val="1"/>
+    </w:lvlOverride>
+  </w:num>
+  <w:num w:numId="1008">
+    <w:abstractNumId w:val="99201"/>
+    <w:lvlOverride w:ilvl="0">
+      <w:startOverride w:val="1"/>
+    </w:lvlOverride>
+    <w:lvlOverride w:ilvl="1">
+      <w:startOverride w:val="1"/>
+    </w:lvlOverride>
+    <w:lvlOverride w:ilvl="2">
+      <w:startOverride w:val="1"/>
+    </w:lvlOverride>
+    <w:lvlOverride w:ilvl="3">
+      <w:startOverride w:val="1"/>
+    </w:lvlOverride>
+    <w:lvlOverride w:ilvl="4">
+      <w:startOverride w:val="1"/>
+    </w:lvlOverride>
+    <w:lvlOverride w:ilvl="5">
+      <w:startOverride w:val="1"/>
+    </w:lvlOverride>
+    <w:lvlOverride w:ilvl="6">
+      <w:startOverride w:val="1"/>
+    </w:lvlOverride>
+    <w:lvlOverride w:ilvl="7">
+      <w:startOverride w:val="1"/>
+    </w:lvlOverride>
+    <w:lvlOverride w:ilvl="8">
+      <w:startOverride w:val="1"/>
+    </w:lvlOverride>
+  </w:num>
+  <w:num w:numId="1009">
+    <w:abstractNumId w:val="99201"/>
+    <w:lvlOverride w:ilvl="0">
+      <w:startOverride w:val="1"/>
+    </w:lvlOverride>
+    <w:lvlOverride w:ilvl="1">
+      <w:startOverride w:val="1"/>
+    </w:lvlOverride>
+    <w:lvlOverride w:ilvl="2">
+      <w:startOverride w:val="1"/>
+    </w:lvlOverride>
+    <w:lvlOverride w:ilvl="3">
+      <w:startOverride w:val="1"/>
+    </w:lvlOverride>
+    <w:lvlOverride w:ilvl="4">
+      <w:startOverride w:val="1"/>
+    </w:lvlOverride>
+    <w:lvlOverride w:ilvl="5">
+      <w:startOverride w:val="1"/>
+    </w:lvlOverride>
+    <w:lvlOverride w:ilvl="6">
+      <w:startOverride w:val="1"/>
+    </w:lvlOverride>
+    <w:lvlOverride w:ilvl="7">
+      <w:startOverride w:val="1"/>
+    </w:lvlOverride>
+    <w:lvlOverride w:ilvl="8">
+      <w:startOverride w:val="1"/>
+    </w:lvlOverride>
+  </w:num>
+  <w:num w:numId="1010">
+    <w:abstractNumId w:val="99201"/>
+    <w:lvlOverride w:ilvl="0">
+      <w:startOverride w:val="1"/>
+    </w:lvlOverride>
+    <w:lvlOverride w:ilvl="1">
+      <w:startOverride w:val="1"/>
+    </w:lvlOverride>
+    <w:lvlOverride w:ilvl="2">
+      <w:startOverride w:val="1"/>
+    </w:lvlOverride>
+    <w:lvlOverride w:ilvl="3">
+      <w:startOverride w:val="1"/>
+    </w:lvlOverride>
+    <w:lvlOverride w:ilvl="4">
+      <w:startOverride w:val="1"/>
+    </w:lvlOverride>
+    <w:lvlOverride w:ilvl="5">
+      <w:startOverride w:val="1"/>
+    </w:lvlOverride>
+    <w:lvlOverride w:ilvl="6">
+      <w:startOverride w:val="1"/>
+    </w:lvlOverride>
+    <w:lvlOverride w:ilvl="7">
+      <w:startOverride w:val="1"/>
+    </w:lvlOverride>
+    <w:lvlOverride w:ilvl="8">
+      <w:startOverride w:val="1"/>
+    </w:lvlOverride>
+  </w:num>
+  <w:num w:numId="1011">
+    <w:abstractNumId w:val="99201"/>
+    <w:lvlOverride w:ilvl="0">
+      <w:startOverride w:val="1"/>
+    </w:lvlOverride>
+    <w:lvlOverride w:ilvl="1">
+      <w:startOverride w:val="1"/>
+    </w:lvlOverride>
+    <w:lvlOverride w:ilvl="2">
+      <w:startOverride w:val="1"/>
+    </w:lvlOverride>
+    <w:lvlOverride w:ilvl="3">
+      <w:startOverride w:val="1"/>
+    </w:lvlOverride>
+    <w:lvlOverride w:ilvl="4">
+      <w:startOverride w:val="1"/>
+    </w:lvlOverride>
+    <w:lvlOverride w:ilvl="5">
+      <w:startOverride w:val="1"/>
+    </w:lvlOverride>
+    <w:lvlOverride w:ilvl="6">
+      <w:startOverride w:val="1"/>
+    </w:lvlOverride>
+    <w:lvlOverride w:ilvl="7">
+      <w:startOverride w:val="1"/>
+    </w:lvlOverride>
+    <w:lvlOverride w:ilvl="8">
+      <w:startOverride w:val="1"/>
+    </w:lvlOverride>
+  </w:num>
+  <w:num w:numId="1012">
+    <w:abstractNumId w:val="99201"/>
+    <w:lvlOverride w:ilvl="0">
+      <w:startOverride w:val="1"/>
+    </w:lvlOverride>
+    <w:lvlOverride w:ilvl="1">
+      <w:startOverride w:val="1"/>
+    </w:lvlOverride>
+    <w:lvlOverride w:ilvl="2">
+      <w:startOverride w:val="1"/>
+    </w:lvlOverride>
+    <w:lvlOverride w:ilvl="3">
+      <w:startOverride w:val="1"/>
+    </w:lvlOverride>
+    <w:lvlOverride w:ilvl="4">
+      <w:startOverride w:val="1"/>
+    </w:lvlOverride>
+    <w:lvlOverride w:ilvl="5">
+      <w:startOverride w:val="1"/>
+    </w:lvlOverride>
+    <w:lvlOverride w:ilvl="6">
+      <w:startOverride w:val="1"/>
+    </w:lvlOverride>
+    <w:lvlOverride w:ilvl="7">
+      <w:startOverride w:val="1"/>
+    </w:lvlOverride>
+    <w:lvlOverride w:ilvl="8">
+      <w:startOverride w:val="1"/>
+    </w:lvlOverride>
+  </w:num>
+  <w:num w:numId="1013">
+    <w:abstractNumId w:val="99201"/>
+    <w:lvlOverride w:ilvl="0">
+      <w:startOverride w:val="1"/>
+    </w:lvlOverride>
+    <w:lvlOverride w:ilvl="1">
+      <w:startOverride w:val="1"/>
+    </w:lvlOverride>
+    <w:lvlOverride w:ilvl="2">
+      <w:startOverride w:val="1"/>
+    </w:lvlOverride>
+    <w:lvlOverride w:ilvl="3">
+      <w:startOverride w:val="1"/>
+    </w:lvlOverride>
+    <w:lvlOverride w:ilvl="4">
+      <w:startOverride w:val="1"/>
+    </w:lvlOverride>
+    <w:lvlOverride w:ilvl="5">
+      <w:startOverride w:val="1"/>
+    </w:lvlOverride>
+    <w:lvlOverride w:ilvl="6">
+      <w:startOverride w:val="1"/>
+    </w:lvlOverride>
+    <w:lvlOverride w:ilvl="7">
+      <w:startOverride w:val="1"/>
+    </w:lvlOverride>
+    <w:lvlOverride w:ilvl="8">
+      <w:startOverride w:val="1"/>
+    </w:lvlOverride>
+  </w:num>
+  <w:num w:numId="1014">
+    <w:abstractNumId w:val="99201"/>
+    <w:lvlOverride w:ilvl="0">
+      <w:startOverride w:val="1"/>
+    </w:lvlOverride>
+    <w:lvlOverride w:ilvl="1">
+      <w:startOverride w:val="1"/>
+    </w:lvlOverride>
+    <w:lvlOverride w:ilvl="2">
+      <w:startOverride w:val="1"/>
+    </w:lvlOverride>
+    <w:lvlOverride w:ilvl="3">
+      <w:startOverride w:val="1"/>
+    </w:lvlOverride>
+    <w:lvlOverride w:ilvl="4">
+      <w:startOverride w:val="1"/>
+    </w:lvlOverride>
+    <w:lvlOverride w:ilvl="5">
+      <w:startOverride w:val="1"/>
+    </w:lvlOverride>
+    <w:lvlOverride w:ilvl="6">
+      <w:startOverride w:val="1"/>
+    </w:lvlOverride>
+    <w:lvlOverride w:ilvl="7">
+      <w:startOverride w:val="1"/>
+    </w:lvlOverride>
+    <w:lvlOverride w:ilvl="8">
+      <w:startOverride w:val="1"/>
+    </w:lvlOverride>
+  </w:num>
+  <w:num w:numId="1015">
+    <w:abstractNumId w:val="99201"/>
+    <w:lvlOverride w:ilvl="0">
+      <w:startOverride w:val="1"/>
+    </w:lvlOverride>
+    <w:lvlOverride w:ilvl="1">
+      <w:startOverride w:val="1"/>
+    </w:lvlOverride>
+    <w:lvlOverride w:ilvl="2">
+      <w:startOverride w:val="1"/>
+    </w:lvlOverride>
+    <w:lvlOverride w:ilvl="3">
+      <w:startOverride w:val="1"/>
+    </w:lvlOverride>
+    <w:lvlOverride w:ilvl="4">
+      <w:startOverride w:val="1"/>
+    </w:lvlOverride>
+    <w:lvlOverride w:ilvl="5">
+      <w:startOverride w:val="1"/>
+    </w:lvlOverride>
+    <w:lvlOverride w:ilvl="6">
+      <w:startOverride w:val="1"/>
+    </w:lvlOverride>
+    <w:lvlOverride w:ilvl="7">
+      <w:startOverride w:val="1"/>
+    </w:lvlOverride>
+    <w:lvlOverride w:ilvl="8">
+      <w:startOverride w:val="1"/>
+    </w:lvlOverride>
+  </w:num>
+  <w:num w:numId="1016">
     <w:abstractNumId w:val="99201"/>
     <w:lvlOverride w:ilvl="0">
       <w:startOverride w:val="1"/>

</xml_diff>